<commit_message>
manual: explicit D/DD/DDD anchor cycle, drop Alt+D mentions
</commit_message>
<xml_diff>
--- a/docs/TOCHKA_Manual_RU.docx
+++ b/docs/TOCHKA_Manual_RU.docx
@@ -424,7 +424,7 @@
           <w:rPr>
             <w:rStyle w:val="Hyperlink"/>
           </w:rPr>
-          <w:t>4.2 Якоря</w:t>
+          <w:t>4.2 Якоря: D · DD · DDD</w:t>
         </w:r>
         <w:r>
           <w:tab/>
@@ -460,7 +460,7 @@
           <w:rPr>
             <w:rStyle w:val="Hyperlink"/>
           </w:rPr>
-          <w:t>4.3 Двойное D - цикл якоря</w:t>
+          <w:t>4.3 Правило паузы</w:t>
         </w:r>
         <w:r>
           <w:tab/>
@@ -1714,7 +1714,7 @@
                 <w:i w:val="0"/>
                 <w:sz w:val="18"/>
               </w:rPr>
-              <w:t>D (повторное нажатие - цикл якоря)</w:t>
+              <w:t>D · DD · DDD</w:t>
             </w:r>
           </w:p>
         </w:tc>
@@ -2182,7 +2182,7 @@
           <w:i w:val="0"/>
           <w:sz w:val="19"/>
         </w:rPr>
-        <w:t>Alt+D остаётся штатной клавишей Blender (Duplicate Linked) - TOCHKA её не занимает. Pie-меню открывается кнопкой в N-панели.</w:t>
+        <w:t>Pie-меню со всеми операторами открывается кнопкой в N-панели.</w:t>
       </w:r>
     </w:p>
     <w:p>
@@ -2287,7 +2287,7 @@
           <w:i w:val="0"/>
           <w:sz w:val="19"/>
         </w:rPr>
-        <w:t>Зайдите в режим редактирования колеса, выделите грань на ступице, нажмите D - пивот в центре выделения. Быстрое повторное D переключит якорь: Median → Bottom → Top.</w:t>
+        <w:t>Зайдите в режим редактирования колеса, выделите грань на ступице и нажмите D - пивот встанет в центр выделения (Median). Нужно ниже - DD поставит Bottom, ещё одно - DDD, Top.</w:t>
       </w:r>
     </w:p>
     <w:p>
@@ -2378,7 +2378,7 @@
       </w:pPr>
       <w:bookmarkStart w:id="100009" w:name="_Toc100009"/>
       <w:r>
-        <w:t>4.2 Якоря</w:t>
+        <w:t>4.2 Якоря: D · DD · DDD</w:t>
       </w:r>
       <w:bookmarkEnd w:id="100009"/>
     </w:p>
@@ -2396,8 +2396,9 @@
         </w:tblCellMar>
       </w:tblPr>
       <w:tblGrid>
-        <w:gridCol w:w="4680"/>
-        <w:gridCol w:w="4680"/>
+        <w:gridCol w:w="3120"/>
+        <w:gridCol w:w="3120"/>
+        <w:gridCol w:w="3120"/>
       </w:tblGrid>
       <w:tr>
         <w:trPr>
@@ -2406,7 +2407,35 @@
         </w:trPr>
         <w:tc>
           <w:tcPr>
-            <w:tcW w:type="dxa" w:w="2041"/>
+            <w:tcW w:type="dxa" w:w="2494"/>
+            <w:tcBorders>
+              <w:top w:val="single" w:sz="4" w:space="0" w:color="CCCCCC"/>
+              <w:left w:val="single" w:sz="4" w:space="0" w:color="CCCCCC"/>
+              <w:bottom w:val="single" w:sz="4" w:space="0" w:color="CCCCCC"/>
+              <w:right w:val="single" w:sz="4" w:space="0" w:color="CCCCCC"/>
+            </w:tcBorders>
+            <w:vAlign w:val="top"/>
+            <w:shd w:val="clear" w:color="auto" w:fill="2E75B5"/>
+          </w:tcPr>
+          <w:p>
+            <w:pPr>
+              <w:spacing w:before="40" w:after="40" w:line="264" w:lineRule="auto"/>
+            </w:pPr>
+            <w:r>
+              <w:rPr>
+                <w:rFonts w:ascii="Arial" w:hAnsi="Arial"/>
+                <w:b/>
+                <w:i w:val="0"/>
+                <w:color w:val="FFFFFF"/>
+                <w:sz w:val="18"/>
+              </w:rPr>
+              <w:t>Нажатие</w:t>
+            </w:r>
+          </w:p>
+        </w:tc>
+        <w:tc>
+          <w:tcPr>
+            <w:tcW w:type="dxa" w:w="1701"/>
             <w:tcBorders>
               <w:top w:val="single" w:sz="4" w:space="0" w:color="CCCCCC"/>
               <w:left w:val="single" w:sz="4" w:space="0" w:color="CCCCCC"/>
@@ -2434,7 +2463,7 @@
         </w:tc>
         <w:tc>
           <w:tcPr>
-            <w:tcW w:type="dxa" w:w="7597"/>
+            <w:tcW w:type="dxa" w:w="5443"/>
             <w:tcBorders>
               <w:top w:val="single" w:sz="4" w:space="0" w:color="CCCCCC"/>
               <w:left w:val="single" w:sz="4" w:space="0" w:color="CCCCCC"/>
@@ -2467,7 +2496,7 @@
         </w:trPr>
         <w:tc>
           <w:tcPr>
-            <w:tcW w:type="dxa" w:w="2041"/>
+            <w:tcW w:type="dxa" w:w="2494"/>
             <w:tcBorders>
               <w:top w:val="single" w:sz="4" w:space="0" w:color="CCCCCC"/>
               <w:left w:val="single" w:sz="4" w:space="0" w:color="CCCCCC"/>
@@ -2487,13 +2516,39 @@
                 <w:i w:val="0"/>
                 <w:sz w:val="18"/>
               </w:rPr>
+              <w:t>D</w:t>
+            </w:r>
+          </w:p>
+        </w:tc>
+        <w:tc>
+          <w:tcPr>
+            <w:tcW w:type="dxa" w:w="1701"/>
+            <w:tcBorders>
+              <w:top w:val="single" w:sz="4" w:space="0" w:color="CCCCCC"/>
+              <w:left w:val="single" w:sz="4" w:space="0" w:color="CCCCCC"/>
+              <w:bottom w:val="single" w:sz="4" w:space="0" w:color="CCCCCC"/>
+              <w:right w:val="single" w:sz="4" w:space="0" w:color="CCCCCC"/>
+            </w:tcBorders>
+            <w:vAlign w:val="top"/>
+          </w:tcPr>
+          <w:p>
+            <w:pPr>
+              <w:spacing w:before="40" w:after="40" w:line="264" w:lineRule="auto"/>
+            </w:pPr>
+            <w:r>
+              <w:rPr>
+                <w:rFonts w:ascii="Arial" w:hAnsi="Arial"/>
+                <w:b w:val="0"/>
+                <w:i w:val="0"/>
+                <w:sz w:val="18"/>
+              </w:rPr>
               <w:t>Median</w:t>
             </w:r>
           </w:p>
         </w:tc>
         <w:tc>
           <w:tcPr>
-            <w:tcW w:type="dxa" w:w="7597"/>
+            <w:tcW w:type="dxa" w:w="5443"/>
             <w:tcBorders>
               <w:top w:val="single" w:sz="4" w:space="0" w:color="CCCCCC"/>
               <w:left w:val="single" w:sz="4" w:space="0" w:color="CCCCCC"/>
@@ -2524,7 +2579,7 @@
         </w:trPr>
         <w:tc>
           <w:tcPr>
-            <w:tcW w:type="dxa" w:w="2041"/>
+            <w:tcW w:type="dxa" w:w="2494"/>
             <w:tcBorders>
               <w:top w:val="single" w:sz="4" w:space="0" w:color="CCCCCC"/>
               <w:left w:val="single" w:sz="4" w:space="0" w:color="CCCCCC"/>
@@ -2545,13 +2600,40 @@
                 <w:i w:val="0"/>
                 <w:sz w:val="18"/>
               </w:rPr>
+              <w:t>DD (быстро, подряд)</w:t>
+            </w:r>
+          </w:p>
+        </w:tc>
+        <w:tc>
+          <w:tcPr>
+            <w:tcW w:type="dxa" w:w="1701"/>
+            <w:tcBorders>
+              <w:top w:val="single" w:sz="4" w:space="0" w:color="CCCCCC"/>
+              <w:left w:val="single" w:sz="4" w:space="0" w:color="CCCCCC"/>
+              <w:bottom w:val="single" w:sz="4" w:space="0" w:color="CCCCCC"/>
+              <w:right w:val="single" w:sz="4" w:space="0" w:color="CCCCCC"/>
+            </w:tcBorders>
+            <w:vAlign w:val="top"/>
+            <w:shd w:val="clear" w:color="auto" w:fill="F5F8FB"/>
+          </w:tcPr>
+          <w:p>
+            <w:pPr>
+              <w:spacing w:before="40" w:after="40" w:line="264" w:lineRule="auto"/>
+            </w:pPr>
+            <w:r>
+              <w:rPr>
+                <w:rFonts w:ascii="Arial" w:hAnsi="Arial"/>
+                <w:b w:val="0"/>
+                <w:i w:val="0"/>
+                <w:sz w:val="18"/>
+              </w:rPr>
               <w:t>Bottom</w:t>
             </w:r>
           </w:p>
         </w:tc>
         <w:tc>
           <w:tcPr>
-            <w:tcW w:type="dxa" w:w="7597"/>
+            <w:tcW w:type="dxa" w:w="5443"/>
             <w:tcBorders>
               <w:top w:val="single" w:sz="4" w:space="0" w:color="CCCCCC"/>
               <w:left w:val="single" w:sz="4" w:space="0" w:color="CCCCCC"/>
@@ -2583,7 +2665,7 @@
         </w:trPr>
         <w:tc>
           <w:tcPr>
-            <w:tcW w:type="dxa" w:w="2041"/>
+            <w:tcW w:type="dxa" w:w="2494"/>
             <w:tcBorders>
               <w:top w:val="single" w:sz="4" w:space="0" w:color="CCCCCC"/>
               <w:left w:val="single" w:sz="4" w:space="0" w:color="CCCCCC"/>
@@ -2603,13 +2685,39 @@
                 <w:i w:val="0"/>
                 <w:sz w:val="18"/>
               </w:rPr>
+              <w:t>DDD (быстро, подряд)</w:t>
+            </w:r>
+          </w:p>
+        </w:tc>
+        <w:tc>
+          <w:tcPr>
+            <w:tcW w:type="dxa" w:w="1701"/>
+            <w:tcBorders>
+              <w:top w:val="single" w:sz="4" w:space="0" w:color="CCCCCC"/>
+              <w:left w:val="single" w:sz="4" w:space="0" w:color="CCCCCC"/>
+              <w:bottom w:val="single" w:sz="4" w:space="0" w:color="CCCCCC"/>
+              <w:right w:val="single" w:sz="4" w:space="0" w:color="CCCCCC"/>
+            </w:tcBorders>
+            <w:vAlign w:val="top"/>
+          </w:tcPr>
+          <w:p>
+            <w:pPr>
+              <w:spacing w:before="40" w:after="40" w:line="264" w:lineRule="auto"/>
+            </w:pPr>
+            <w:r>
+              <w:rPr>
+                <w:rFonts w:ascii="Arial" w:hAnsi="Arial"/>
+                <w:b w:val="0"/>
+                <w:i w:val="0"/>
+                <w:sz w:val="18"/>
+              </w:rPr>
               <w:t>Top</w:t>
             </w:r>
           </w:p>
         </w:tc>
         <w:tc>
           <w:tcPr>
-            <w:tcW w:type="dxa" w:w="7597"/>
+            <w:tcW w:type="dxa" w:w="5443"/>
             <w:tcBorders>
               <w:top w:val="single" w:sz="4" w:space="0" w:color="CCCCCC"/>
               <w:left w:val="single" w:sz="4" w:space="0" w:color="CCCCCC"/>
@@ -2647,7 +2755,7 @@
           <w:i w:val="0"/>
           <w:sz w:val="19"/>
         </w:rPr>
-        <w:t>Якорь переключается кнопками на панели. Быстрее - двойным нажатием D:</w:t>
+        <w:t>Четвёртое нажатие подряд (DDDD) возвращает Median, и цикл начинается заново - якорь ходит по кругу, сколько раз нужно.</w:t>
       </w:r>
     </w:p>
     <w:p>
@@ -2656,7 +2764,7 @@
       </w:pPr>
       <w:bookmarkStart w:id="100010" w:name="_Toc100010"/>
       <w:r>
-        <w:t>4.3 Двойное D - цикл якоря</w:t>
+        <w:t>4.3 Правило паузы</w:t>
       </w:r>
       <w:bookmarkEnd w:id="100010"/>
     </w:p>
@@ -2667,7 +2775,7 @@
           <w:i w:val="0"/>
           <w:sz w:val="19"/>
         </w:rPr>
-        <w:t>Быстрое повторное нажатие D (в пределах 0,35 секунды) циклит якорь: Median → Bottom → Top → Median и так далее, каждый раз переставляя пивот по выбранному якорю. Спокойное одиночное нажатие через паузу просто снова ставит пивот в центр выделения.</w:t>
+        <w:t>Нажатия должны идти подряд, в пределах 0,35 секунды одно за другим - это и есть «DD». Если сделать паузу дольше, очередное D - уже не следующий якорь, а повторное применение последнего выбранного. Так же в цикле участвует якорь, выбранный кнопками на панели: после него очередное DD шагнёт от него к следующему.</w:t>
       </w:r>
     </w:p>
     <w:p>
@@ -4115,7 +4223,7 @@
                 <w:i w:val="0"/>
                 <w:sz w:val="18"/>
               </w:rPr>
-              <w:t>Alt+D не открывает меню TOCHKA</w:t>
+              <w:t>Снап не цепляет вершину</w:t>
             </w:r>
           </w:p>
         </w:tc>
@@ -4141,7 +4249,7 @@
                 <w:i w:val="0"/>
                 <w:sz w:val="18"/>
               </w:rPr>
-              <w:t>с версии 1.1.0 Alt+D - штатный Duplicate Linked</w:t>
+              <w:t>вершина дальше 24 px от курсора на экране</w:t>
             </w:r>
           </w:p>
         </w:tc>
@@ -4167,7 +4275,7 @@
                 <w:i w:val="0"/>
                 <w:sz w:val="18"/>
               </w:rPr>
-              <w:t>pie-меню - кнопкой в N-панели; цикл якоря - двойное D</w:t>
+              <w:t>приблизьте камеру или ведите курсор точнее - радиус захвата экранный</w:t>
             </w:r>
           </w:p>
         </w:tc>
@@ -4199,7 +4307,7 @@
                 <w:i w:val="0"/>
                 <w:sz w:val="18"/>
               </w:rPr>
-              <w:t>Снап не цепляет вершину</w:t>
+              <w:t>Пивот «улетает» после Ctrl+Z</w:t>
             </w:r>
           </w:p>
         </w:tc>
@@ -4226,7 +4334,7 @@
                 <w:i w:val="0"/>
                 <w:sz w:val="18"/>
               </w:rPr>
-              <w:t>вершина дальше 24 px от курсора на экране</w:t>
+              <w:t>баг версий до 1.0.3 включительно</w:t>
             </w:r>
           </w:p>
         </w:tc>
@@ -4241,89 +4349,6 @@
             </w:tcBorders>
             <w:vAlign w:val="top"/>
             <w:shd w:val="clear" w:color="auto" w:fill="F5F8FB"/>
-          </w:tcPr>
-          <w:p>
-            <w:pPr>
-              <w:spacing w:before="40" w:after="40" w:line="264" w:lineRule="auto"/>
-            </w:pPr>
-            <w:r>
-              <w:rPr>
-                <w:rFonts w:ascii="Arial" w:hAnsi="Arial"/>
-                <w:b w:val="0"/>
-                <w:i w:val="0"/>
-                <w:sz w:val="18"/>
-              </w:rPr>
-              <w:t>приблизьте камеру или ведите курсор точнее - радиус захвата экранный</w:t>
-            </w:r>
-          </w:p>
-        </w:tc>
-      </w:tr>
-      <w:tr>
-        <w:trPr>
-          <w:cantSplit/>
-        </w:trPr>
-        <w:tc>
-          <w:tcPr>
-            <w:tcW w:type="dxa" w:w="2608"/>
-            <w:tcBorders>
-              <w:top w:val="single" w:sz="4" w:space="0" w:color="CCCCCC"/>
-              <w:left w:val="single" w:sz="4" w:space="0" w:color="CCCCCC"/>
-              <w:bottom w:val="single" w:sz="4" w:space="0" w:color="CCCCCC"/>
-              <w:right w:val="single" w:sz="4" w:space="0" w:color="CCCCCC"/>
-            </w:tcBorders>
-            <w:vAlign w:val="top"/>
-          </w:tcPr>
-          <w:p>
-            <w:pPr>
-              <w:spacing w:before="40" w:after="40" w:line="264" w:lineRule="auto"/>
-            </w:pPr>
-            <w:r>
-              <w:rPr>
-                <w:rFonts w:ascii="Arial" w:hAnsi="Arial"/>
-                <w:b/>
-                <w:i w:val="0"/>
-                <w:sz w:val="18"/>
-              </w:rPr>
-              <w:t>Пивот «улетает» после Ctrl+Z</w:t>
-            </w:r>
-          </w:p>
-        </w:tc>
-        <w:tc>
-          <w:tcPr>
-            <w:tcW w:type="dxa" w:w="3061"/>
-            <w:tcBorders>
-              <w:top w:val="single" w:sz="4" w:space="0" w:color="CCCCCC"/>
-              <w:left w:val="single" w:sz="4" w:space="0" w:color="CCCCCC"/>
-              <w:bottom w:val="single" w:sz="4" w:space="0" w:color="CCCCCC"/>
-              <w:right w:val="single" w:sz="4" w:space="0" w:color="CCCCCC"/>
-            </w:tcBorders>
-            <w:vAlign w:val="top"/>
-          </w:tcPr>
-          <w:p>
-            <w:pPr>
-              <w:spacing w:before="40" w:after="40" w:line="264" w:lineRule="auto"/>
-            </w:pPr>
-            <w:r>
-              <w:rPr>
-                <w:rFonts w:ascii="Arial" w:hAnsi="Arial"/>
-                <w:b w:val="0"/>
-                <w:i w:val="0"/>
-                <w:sz w:val="18"/>
-              </w:rPr>
-              <w:t>баг версий до 1.0.3 включительно</w:t>
-            </w:r>
-          </w:p>
-        </w:tc>
-        <w:tc>
-          <w:tcPr>
-            <w:tcW w:type="dxa" w:w="3969"/>
-            <w:tcBorders>
-              <w:top w:val="single" w:sz="4" w:space="0" w:color="CCCCCC"/>
-              <w:left w:val="single" w:sz="4" w:space="0" w:color="CCCCCC"/>
-              <w:bottom w:val="single" w:sz="4" w:space="0" w:color="CCCCCC"/>
-              <w:right w:val="single" w:sz="4" w:space="0" w:color="CCCCCC"/>
-            </w:tcBorders>
-            <w:vAlign w:val="top"/>
           </w:tcPr>
           <w:p>
             <w:pPr>
@@ -4355,7 +4380,6 @@
               <w:right w:val="single" w:sz="4" w:space="0" w:color="CCCCCC"/>
             </w:tcBorders>
             <w:vAlign w:val="top"/>
-            <w:shd w:val="clear" w:color="auto" w:fill="F5F8FB"/>
           </w:tcPr>
           <w:p>
             <w:pPr>
@@ -4382,7 +4406,6 @@
               <w:right w:val="single" w:sz="4" w:space="0" w:color="CCCCCC"/>
             </w:tcBorders>
             <w:vAlign w:val="top"/>
-            <w:shd w:val="clear" w:color="auto" w:fill="F5F8FB"/>
           </w:tcPr>
           <w:p>
             <w:pPr>
@@ -4409,7 +4432,6 @@
               <w:right w:val="single" w:sz="4" w:space="0" w:color="CCCCCC"/>
             </w:tcBorders>
             <w:vAlign w:val="top"/>
-            <w:shd w:val="clear" w:color="auto" w:fill="F5F8FB"/>
           </w:tcPr>
           <w:p>
             <w:pPr>

</xml_diff>

<commit_message>
docs: family template C for RU manual
</commit_message>
<xml_diff>
--- a/docs/TOCHKA_Manual_RU.docx
+++ b/docs/TOCHKA_Manual_RU.docx
@@ -2,69 +2,154 @@
 <file path=word/document.xml><?xml version="1.0" encoding="utf-8"?>
 <w:document xmlns:wpc="http://schemas.microsoft.com/office/word/2010/wordprocessingCanvas" xmlns:mo="http://schemas.microsoft.com/office/mac/office/2008/main" xmlns:mc="http://schemas.openxmlformats.org/markup-compatibility/2006" xmlns:mv="urn:schemas-microsoft-com:mac:vml" xmlns:o="urn:schemas-microsoft-com:office:office" xmlns:r="http://schemas.openxmlformats.org/officeDocument/2006/relationships" xmlns:m="http://schemas.openxmlformats.org/officeDocument/2006/math" xmlns:v="urn:schemas-microsoft-com:vml" xmlns:wp14="http://schemas.microsoft.com/office/word/2010/wordprocessingDrawing" xmlns:wp="http://schemas.openxmlformats.org/drawingml/2006/wordprocessingDrawing" xmlns:w10="urn:schemas-microsoft-com:office:word" xmlns:w="http://schemas.openxmlformats.org/wordprocessingml/2006/main" xmlns:w14="http://schemas.microsoft.com/office/word/2010/wordml" xmlns:wpg="http://schemas.microsoft.com/office/word/2010/wordprocessingGroup" xmlns:wpi="http://schemas.microsoft.com/office/word/2010/wordprocessingInk" xmlns:wne="http://schemas.microsoft.com/office/word/2006/wordml" xmlns:wps="http://schemas.microsoft.com/office/word/2010/wordprocessingShape" mc:Ignorable="w14 wp14">
   <w:body>
+    <w:tbl>
+      <w:tblPr>
+        <w:tblW w:type="auto" w:w="0"/>
+        <w:tblLayout w:type="fixed"/>
+        <w:tblLook w:firstColumn="1" w:firstRow="1" w:lastColumn="0" w:lastRow="0" w:noHBand="0" w:noVBand="1" w:val="04A0"/>
+        <w:tblBorders>
+          <w:top w:val="none"/>
+          <w:left w:val="none"/>
+          <w:bottom w:val="none"/>
+          <w:right w:val="none"/>
+          <w:insideH w:val="none"/>
+          <w:insideV w:val="none"/>
+        </w:tblBorders>
+      </w:tblPr>
+      <w:tblGrid>
+        <w:gridCol w:w="11906"/>
+      </w:tblGrid>
+      <w:tr>
+        <w:trPr>
+          <w:trHeight w:val="16838" w:hRule="exact"/>
+        </w:trPr>
+        <w:tc>
+          <w:tcPr>
+            <w:tcW w:type="dxa" w:w="11906"/>
+            <w:shd w:val="clear" w:color="auto" w:fill="000000"/>
+            <w:vAlign w:val="center"/>
+          </w:tcPr>
+          <w:p/>
+          <w:p>
+            <w:pPr>
+              <w:spacing w:after="0"/>
+            </w:pPr>
+            <w:r>
+              <w:rPr>
+                <w:sz w:val="4"/>
+              </w:rPr>
+              <w:t xml:space="preserve"> </w:t>
+            </w:r>
+          </w:p>
+          <w:p>
+            <w:pPr>
+              <w:spacing w:after="320"/>
+              <w:jc w:val="center"/>
+            </w:pPr>
+            <w:r>
+              <w:rPr>
+                <w:rFonts w:ascii="Century Gothic" w:hAnsi="Century Gothic" w:cs="Century Gothic"/>
+                <w:b/>
+                <w:color w:val="FFFFFF"/>
+                <w:sz w:val="96"/>
+                <w:spacing w:val="60"/>
+              </w:rPr>
+              <w:t>TOCHKA</w:t>
+            </w:r>
+          </w:p>
+          <w:p>
+            <w:pPr>
+              <w:spacing w:after="320"/>
+              <w:ind w:left="2948" w:right="2948"/>
+              <w:jc w:val="center"/>
+              <w:pBdr>
+                <w:bottom w:val="single" w:sz="18" w:space="1" w:color="C82823"/>
+              </w:pBdr>
+            </w:pPr>
+            <w:r>
+              <w:rPr>
+                <w:rFonts w:ascii="Arial" w:hAnsi="Arial" w:cs="Arial"/>
+                <w:b w:val="0"/>
+                <w:color w:val="1A1A1A"/>
+                <w:sz w:val="19"/>
+              </w:rPr>
+              <w:t xml:space="preserve"> </w:t>
+            </w:r>
+          </w:p>
+          <w:p>
+            <w:pPr>
+              <w:spacing w:after="80"/>
+              <w:jc w:val="center"/>
+            </w:pPr>
+            <w:r>
+              <w:rPr>
+                <w:rFonts w:ascii="Century Gothic" w:hAnsi="Century Gothic" w:cs="Century Gothic"/>
+                <w:b w:val="0"/>
+                <w:color w:val="9E9E9E"/>
+                <w:sz w:val="24"/>
+                <w:spacing w:val="80"/>
+              </w:rPr>
+              <w:t>РУКОВОДСТВО ПОЛЬЗОВАТЕЛЯ</w:t>
+            </w:r>
+          </w:p>
+          <w:p>
+            <w:pPr>
+              <w:jc w:val="center"/>
+            </w:pPr>
+            <w:r>
+              <w:rPr>
+                <w:rFonts w:ascii="Century Gothic" w:hAnsi="Century Gothic" w:cs="Century Gothic"/>
+                <w:b w:val="0"/>
+                <w:color w:val="9E9E9E"/>
+                <w:sz w:val="18"/>
+                <w:spacing w:val="60"/>
+              </w:rPr>
+              <w:t>V1.1.0  -  BLENDER 4.2+</w:t>
+            </w:r>
+          </w:p>
+          <w:p>
+            <w:pPr>
+              <w:spacing w:before="2200"/>
+            </w:pPr>
+            <w:r>
+              <w:t xml:space="preserve"> </w:t>
+            </w:r>
+          </w:p>
+          <w:p>
+            <w:pPr>
+              <w:jc w:val="center"/>
+            </w:pPr>
+            <w:r>
+              <w:rPr>
+                <w:rFonts w:ascii="Century Gothic" w:hAnsi="Century Gothic" w:cs="Century Gothic"/>
+                <w:b w:val="0"/>
+                <w:color w:val="9E9E9E"/>
+                <w:sz w:val="15"/>
+                <w:spacing w:val="60"/>
+              </w:rPr>
+              <w:t>GITHUB.COM/ABYRVALG379</w:t>
+            </w:r>
+          </w:p>
+        </w:tc>
+      </w:tr>
+    </w:tbl>
     <w:p>
       <w:pPr>
-        <w:spacing w:before="600" w:after="80"/>
-        <w:jc w:val="center"/>
+        <w:sectPr>
+          <w:footerReference w:type="default" r:id="rId9"/>
+          <w:pgSz w:w="11906" w:h="16838"/>
+          <w:pgMar w:top="0" w:right="0" w:bottom="0" w:left="0" w:header="0" w:footer="0" w:gutter="0"/>
+          <w:cols w:space="720"/>
+          <w:docGrid w:linePitch="360"/>
+        </w:sectPr>
       </w:pPr>
-      <w:r>
-        <w:rPr>
-          <w:rFonts w:ascii="Arial" w:hAnsi="Arial"/>
-          <w:b/>
-          <w:color w:val="1F497D"/>
-          <w:sz w:val="60"/>
-        </w:rPr>
-        <w:t>TOCHKA</w:t>
-      </w:r>
-    </w:p>
-    <w:p>
-      <w:pPr>
-        <w:spacing w:after="200"/>
-        <w:jc w:val="center"/>
-      </w:pPr>
-      <w:r>
-        <w:rPr>
-          <w:rFonts w:ascii="Arial" w:hAnsi="Arial"/>
-          <w:b/>
-          <w:color w:val="1F497D"/>
-          <w:sz w:val="36"/>
-        </w:rPr>
-        <w:t>Руководство пользователя</w:t>
-      </w:r>
-    </w:p>
-    <w:p>
-      <w:pPr>
-        <w:spacing w:after="80"/>
-        <w:jc w:val="center"/>
-      </w:pPr>
-      <w:r>
-        <w:rPr>
-          <w:rFonts w:ascii="Arial" w:hAnsi="Arial"/>
-          <w:color w:val="555555"/>
-          <w:sz w:val="22"/>
-        </w:rPr>
-        <w:t>Пивот-тулкит для Blender</w:t>
-      </w:r>
-    </w:p>
-    <w:p>
-      <w:pPr>
-        <w:spacing w:after="400"/>
-        <w:jc w:val="center"/>
-      </w:pPr>
-      <w:r>
-        <w:rPr>
-          <w:rFonts w:ascii="Arial" w:hAnsi="Arial"/>
-          <w:color w:val="555555"/>
-          <w:sz w:val="21"/>
-        </w:rPr>
-        <w:t>Версия для Blender 4.2+ - v1.1.0</w:t>
-      </w:r>
     </w:p>
     <w:p>
       <w:r>
         <w:rPr>
           <w:rFonts w:ascii="Arial" w:hAnsi="Arial"/>
           <w:i w:val="0"/>
+          <w:color w:val="1A1A1A"/>
           <w:sz w:val="19"/>
         </w:rPr>
         <w:t>TOCHKA - набор инструментов для работы с пивотами объектов: поставить пивот в центр выделения одним нажатием, перетащить его мышью по поверхности со снапом к вершинам, повернуть ориентацию, не двигая геометрию, выровнять по нормали грани или по ребру - и проверить пивоты сцены на соответствие конвенциям перед сдачей. Вместо плясок с 3D-курсором вокруг штатного Set Origin - прямые визуальные операторы с живым превью.</w:t>
@@ -75,7 +160,7 @@
         <w:rPr>
           <w:rFonts w:ascii="Arial" w:hAnsi="Arial"/>
           <w:i/>
-          <w:color w:val="555555"/>
+          <w:color w:val="6E6E6E"/>
           <w:sz w:val="18"/>
         </w:rPr>
         <w:t>github.com/abyrvalg379/tochka</w:t>
@@ -84,10 +169,20 @@
     <w:p>
       <w:pPr>
         <w:pStyle w:val="Heading1"/>
+        <w:pBdr>
+          <w:left w:val="single" w:sz="24" w:space="8" w:color="C82823"/>
+        </w:pBdr>
       </w:pPr>
       <w:bookmarkStart w:id="100000" w:name="_Toc100000"/>
       <w:r>
-        <w:t>Содержание</w:t>
+        <w:rPr>
+          <w:rFonts w:ascii="Century Gothic" w:hAnsi="Century Gothic"/>
+          <w:b/>
+          <w:color w:val="000000"/>
+          <w:sz w:val="30"/>
+          <w:spacing w:val="20"/>
+        </w:rPr>
+        <w:t>СОДЕРЖАНИЕ</w:t>
       </w:r>
       <w:bookmarkEnd w:id="100000"/>
     </w:p>
@@ -99,32 +194,15 @@
         </w:tabs>
         <w:spacing w:before="120" w:after="60"/>
       </w:pPr>
-      <w:hyperlink w:anchor="_Toc100000" w:history="1">
-        <w:r>
-          <w:rPr>
-            <w:rStyle w:val="Hyperlink"/>
-          </w:rPr>
-          <w:t>Содержание</w:t>
-        </w:r>
-        <w:r>
-          <w:tab/>
-        </w:r>
-        <w:r>
-          <w:fldChar w:fldCharType="begin"/>
-        </w:r>
-        <w:r>
-          <w:instrText xml:space="preserve"> PAGEREF _Toc100000 \h </w:instrText>
-        </w:r>
-        <w:r>
-          <w:fldChar w:fldCharType="separate"/>
-        </w:r>
-        <w:r>
-          <w:t>1</w:t>
-        </w:r>
-        <w:r>
-          <w:fldChar w:fldCharType="end"/>
-        </w:r>
-      </w:hyperlink>
+      <w:r>
+        <w:t>1. О программе</w:t>
+      </w:r>
+      <w:r>
+        <w:tab/>
+      </w:r>
+      <w:r>
+        <w:t>3</w:t>
+      </w:r>
     </w:p>
     <w:p>
       <w:pPr>
@@ -134,140 +212,15 @@
         </w:tabs>
         <w:spacing w:before="120" w:after="60"/>
       </w:pPr>
-      <w:hyperlink w:anchor="_Toc100001" w:history="1">
-        <w:r>
-          <w:rPr>
-            <w:rStyle w:val="Hyperlink"/>
-          </w:rPr>
-          <w:t>1. О программе</w:t>
-        </w:r>
-        <w:r>
-          <w:tab/>
-        </w:r>
-        <w:r>
-          <w:fldChar w:fldCharType="begin"/>
-        </w:r>
-        <w:r>
-          <w:instrText xml:space="preserve"> PAGEREF _Toc100001 \h </w:instrText>
-        </w:r>
-        <w:r>
-          <w:fldChar w:fldCharType="separate"/>
-        </w:r>
-        <w:r>
-          <w:t>2</w:t>
-        </w:r>
-        <w:r>
-          <w:fldChar w:fldCharType="end"/>
-        </w:r>
-      </w:hyperlink>
-    </w:p>
-    <w:p>
-      <w:pPr>
-        <w:pStyle w:val="11"/>
-        <w:ind w:left="360"/>
-        <w:tabs>
-          <w:tab w:val="right" w:leader="dot" w:pos="9026"/>
-        </w:tabs>
-        <w:spacing w:before="120" w:after="60"/>
-      </w:pPr>
-      <w:hyperlink w:anchor="_Toc100002" w:history="1">
-        <w:r>
-          <w:rPr>
-            <w:rStyle w:val="Hyperlink"/>
-          </w:rPr>
-          <w:t>1.1 Что делает TOCHKA</w:t>
-        </w:r>
-        <w:r>
-          <w:tab/>
-        </w:r>
-        <w:r>
-          <w:fldChar w:fldCharType="begin"/>
-        </w:r>
-        <w:r>
-          <w:instrText xml:space="preserve"> PAGEREF _Toc100002 \h </w:instrText>
-        </w:r>
-        <w:r>
-          <w:fldChar w:fldCharType="separate"/>
-        </w:r>
-        <w:r>
-          <w:t>2</w:t>
-        </w:r>
-        <w:r>
-          <w:fldChar w:fldCharType="end"/>
-        </w:r>
-      </w:hyperlink>
-    </w:p>
-    <w:p>
-      <w:pPr>
-        <w:pStyle w:val="11"/>
-        <w:ind w:left="360"/>
-        <w:tabs>
-          <w:tab w:val="right" w:leader="dot" w:pos="9026"/>
-        </w:tabs>
-        <w:spacing w:before="120" w:after="60"/>
-      </w:pPr>
-      <w:hyperlink w:anchor="_Toc100003" w:history="1">
-        <w:r>
-          <w:rPr>
-            <w:rStyle w:val="Hyperlink"/>
-          </w:rPr>
-          <w:t>1.2 Философия</w:t>
-        </w:r>
-        <w:r>
-          <w:tab/>
-        </w:r>
-        <w:r>
-          <w:fldChar w:fldCharType="begin"/>
-        </w:r>
-        <w:r>
-          <w:instrText xml:space="preserve"> PAGEREF _Toc100003 \h </w:instrText>
-        </w:r>
-        <w:r>
-          <w:fldChar w:fldCharType="separate"/>
-        </w:r>
-        <w:r>
-          <w:t>3</w:t>
-        </w:r>
-        <w:r>
-          <w:fldChar w:fldCharType="end"/>
-        </w:r>
-      </w:hyperlink>
-    </w:p>
-    <w:p>
-      <w:pPr>
-        <w:pStyle w:val="11"/>
-        <w:ind w:left="360"/>
-        <w:tabs>
-          <w:tab w:val="right" w:leader="dot" w:pos="9026"/>
-        </w:tabs>
-        <w:spacing w:before="120" w:after="60"/>
-      </w:pPr>
-      <w:hyperlink w:anchor="_Toc100004" w:history="1">
-        <w:r>
-          <w:rPr>
-            <w:rStyle w:val="Hyperlink"/>
-          </w:rPr>
-          <w:t>1.3 Инструменты и клавиши</w:t>
-        </w:r>
-        <w:r>
-          <w:tab/>
-        </w:r>
-        <w:r>
-          <w:fldChar w:fldCharType="begin"/>
-        </w:r>
-        <w:r>
-          <w:instrText xml:space="preserve"> PAGEREF _Toc100004 \h </w:instrText>
-        </w:r>
-        <w:r>
-          <w:fldChar w:fldCharType="separate"/>
-        </w:r>
-        <w:r>
-          <w:t>3</w:t>
-        </w:r>
-        <w:r>
-          <w:fldChar w:fldCharType="end"/>
-        </w:r>
-      </w:hyperlink>
+      <w:r>
+        <w:t>2. Установка</w:t>
+      </w:r>
+      <w:r>
+        <w:tab/>
+      </w:r>
+      <w:r>
+        <w:t>3</w:t>
+      </w:r>
     </w:p>
     <w:p>
       <w:pPr>
@@ -277,32 +230,15 @@
         </w:tabs>
         <w:spacing w:before="120" w:after="60"/>
       </w:pPr>
-      <w:hyperlink w:anchor="_Toc100005" w:history="1">
-        <w:r>
-          <w:rPr>
-            <w:rStyle w:val="Hyperlink"/>
-          </w:rPr>
-          <w:t>2. Установка</w:t>
-        </w:r>
-        <w:r>
-          <w:tab/>
-        </w:r>
-        <w:r>
-          <w:fldChar w:fldCharType="begin"/>
-        </w:r>
-        <w:r>
-          <w:instrText xml:space="preserve"> PAGEREF _Toc100005 \h </w:instrText>
-        </w:r>
-        <w:r>
-          <w:fldChar w:fldCharType="separate"/>
-        </w:r>
-        <w:r>
-          <w:t>4</w:t>
-        </w:r>
-        <w:r>
-          <w:fldChar w:fldCharType="end"/>
-        </w:r>
-      </w:hyperlink>
+      <w:r>
+        <w:t>3. Быстрый старт</w:t>
+      </w:r>
+      <w:r>
+        <w:tab/>
+      </w:r>
+      <w:r>
+        <w:t>4</w:t>
+      </w:r>
     </w:p>
     <w:p>
       <w:pPr>
@@ -312,32 +248,15 @@
         </w:tabs>
         <w:spacing w:before="120" w:after="60"/>
       </w:pPr>
-      <w:hyperlink w:anchor="_Toc100006" w:history="1">
-        <w:r>
-          <w:rPr>
-            <w:rStyle w:val="Hyperlink"/>
-          </w:rPr>
-          <w:t>3. Быстрый старт</w:t>
-        </w:r>
-        <w:r>
-          <w:tab/>
-        </w:r>
-        <w:r>
-          <w:fldChar w:fldCharType="begin"/>
-        </w:r>
-        <w:r>
-          <w:instrText xml:space="preserve"> PAGEREF _Toc100006 \h </w:instrText>
-        </w:r>
-        <w:r>
-          <w:fldChar w:fldCharType="separate"/>
-        </w:r>
-        <w:r>
-          <w:t>4</w:t>
-        </w:r>
-        <w:r>
-          <w:fldChar w:fldCharType="end"/>
-        </w:r>
-      </w:hyperlink>
+      <w:r>
+        <w:t>4. Origin to Selection (D)</w:t>
+      </w:r>
+      <w:r>
+        <w:tab/>
+      </w:r>
+      <w:r>
+        <w:t>4</w:t>
+      </w:r>
     </w:p>
     <w:p>
       <w:pPr>
@@ -347,176 +266,15 @@
         </w:tabs>
         <w:spacing w:before="120" w:after="60"/>
       </w:pPr>
-      <w:hyperlink w:anchor="_Toc100007" w:history="1">
-        <w:r>
-          <w:rPr>
-            <w:rStyle w:val="Hyperlink"/>
-          </w:rPr>
-          <w:t>4. Origin to Selection (D)</w:t>
-        </w:r>
-        <w:r>
-          <w:tab/>
-        </w:r>
-        <w:r>
-          <w:fldChar w:fldCharType="begin"/>
-        </w:r>
-        <w:r>
-          <w:instrText xml:space="preserve"> PAGEREF _Toc100007 \h </w:instrText>
-        </w:r>
-        <w:r>
-          <w:fldChar w:fldCharType="separate"/>
-        </w:r>
-        <w:r>
-          <w:t>5</w:t>
-        </w:r>
-        <w:r>
-          <w:fldChar w:fldCharType="end"/>
-        </w:r>
-      </w:hyperlink>
-    </w:p>
-    <w:p>
-      <w:pPr>
-        <w:pStyle w:val="11"/>
-        <w:ind w:left="360"/>
-        <w:tabs>
-          <w:tab w:val="right" w:leader="dot" w:pos="9026"/>
-        </w:tabs>
-        <w:spacing w:before="120" w:after="60"/>
-      </w:pPr>
-      <w:hyperlink w:anchor="_Toc100008" w:history="1">
-        <w:r>
-          <w:rPr>
-            <w:rStyle w:val="Hyperlink"/>
-          </w:rPr>
-          <w:t>4.1 Как работает</w:t>
-        </w:r>
-        <w:r>
-          <w:tab/>
-        </w:r>
-        <w:r>
-          <w:fldChar w:fldCharType="begin"/>
-        </w:r>
-        <w:r>
-          <w:instrText xml:space="preserve"> PAGEREF _Toc100008 \h </w:instrText>
-        </w:r>
-        <w:r>
-          <w:fldChar w:fldCharType="separate"/>
-        </w:r>
-        <w:r>
-          <w:t>5</w:t>
-        </w:r>
-        <w:r>
-          <w:fldChar w:fldCharType="end"/>
-        </w:r>
-      </w:hyperlink>
-    </w:p>
-    <w:p>
-      <w:pPr>
-        <w:pStyle w:val="11"/>
-        <w:ind w:left="360"/>
-        <w:tabs>
-          <w:tab w:val="right" w:leader="dot" w:pos="9026"/>
-        </w:tabs>
-        <w:spacing w:before="120" w:after="60"/>
-      </w:pPr>
-      <w:hyperlink w:anchor="_Toc100009" w:history="1">
-        <w:r>
-          <w:rPr>
-            <w:rStyle w:val="Hyperlink"/>
-          </w:rPr>
-          <w:t>4.2 Якоря: D · DD · DDD</w:t>
-        </w:r>
-        <w:r>
-          <w:tab/>
-        </w:r>
-        <w:r>
-          <w:fldChar w:fldCharType="begin"/>
-        </w:r>
-        <w:r>
-          <w:instrText xml:space="preserve"> PAGEREF _Toc100009 \h </w:instrText>
-        </w:r>
-        <w:r>
-          <w:fldChar w:fldCharType="separate"/>
-        </w:r>
-        <w:r>
-          <w:t>6</w:t>
-        </w:r>
-        <w:r>
-          <w:fldChar w:fldCharType="end"/>
-        </w:r>
-      </w:hyperlink>
-    </w:p>
-    <w:p>
-      <w:pPr>
-        <w:pStyle w:val="11"/>
-        <w:ind w:left="360"/>
-        <w:tabs>
-          <w:tab w:val="right" w:leader="dot" w:pos="9026"/>
-        </w:tabs>
-        <w:spacing w:before="120" w:after="60"/>
-      </w:pPr>
-      <w:hyperlink w:anchor="_Toc100010" w:history="1">
-        <w:r>
-          <w:rPr>
-            <w:rStyle w:val="Hyperlink"/>
-          </w:rPr>
-          <w:t>4.3 Правило паузы</w:t>
-        </w:r>
-        <w:r>
-          <w:tab/>
-        </w:r>
-        <w:r>
-          <w:fldChar w:fldCharType="begin"/>
-        </w:r>
-        <w:r>
-          <w:instrText xml:space="preserve"> PAGEREF _Toc100010 \h </w:instrText>
-        </w:r>
-        <w:r>
-          <w:fldChar w:fldCharType="separate"/>
-        </w:r>
-        <w:r>
-          <w:t>6</w:t>
-        </w:r>
-        <w:r>
-          <w:fldChar w:fldCharType="end"/>
-        </w:r>
-      </w:hyperlink>
-    </w:p>
-    <w:p>
-      <w:pPr>
-        <w:pStyle w:val="11"/>
-        <w:ind w:left="360"/>
-        <w:tabs>
-          <w:tab w:val="right" w:leader="dot" w:pos="9026"/>
-        </w:tabs>
-        <w:spacing w:before="120" w:after="60"/>
-      </w:pPr>
-      <w:hyperlink w:anchor="_Toc100011" w:history="1">
-        <w:r>
-          <w:rPr>
-            <w:rStyle w:val="Hyperlink"/>
-          </w:rPr>
-          <w:t>4.4 Undo</w:t>
-        </w:r>
-        <w:r>
-          <w:tab/>
-        </w:r>
-        <w:r>
-          <w:fldChar w:fldCharType="begin"/>
-        </w:r>
-        <w:r>
-          <w:instrText xml:space="preserve"> PAGEREF _Toc100011 \h </w:instrText>
-        </w:r>
-        <w:r>
-          <w:fldChar w:fldCharType="separate"/>
-        </w:r>
-        <w:r>
-          <w:t>6</w:t>
-        </w:r>
-        <w:r>
-          <w:fldChar w:fldCharType="end"/>
-        </w:r>
-      </w:hyperlink>
+      <w:r>
+        <w:t>5. Drag Pivot (Ctrl+D)</w:t>
+      </w:r>
+      <w:r>
+        <w:tab/>
+      </w:r>
+      <w:r>
+        <w:t>5</w:t>
+      </w:r>
     </w:p>
     <w:p>
       <w:pPr>
@@ -526,176 +284,15 @@
         </w:tabs>
         <w:spacing w:before="120" w:after="60"/>
       </w:pPr>
-      <w:hyperlink w:anchor="_Toc100012" w:history="1">
-        <w:r>
-          <w:rPr>
-            <w:rStyle w:val="Hyperlink"/>
-          </w:rPr>
-          <w:t>5. Drag Pivot (Ctrl+D)</w:t>
-        </w:r>
-        <w:r>
-          <w:tab/>
-        </w:r>
-        <w:r>
-          <w:fldChar w:fldCharType="begin"/>
-        </w:r>
-        <w:r>
-          <w:instrText xml:space="preserve"> PAGEREF _Toc100012 \h </w:instrText>
-        </w:r>
-        <w:r>
-          <w:fldChar w:fldCharType="separate"/>
-        </w:r>
-        <w:r>
-          <w:t>7</w:t>
-        </w:r>
-        <w:r>
-          <w:fldChar w:fldCharType="end"/>
-        </w:r>
-      </w:hyperlink>
-    </w:p>
-    <w:p>
-      <w:pPr>
-        <w:pStyle w:val="11"/>
-        <w:ind w:left="360"/>
-        <w:tabs>
-          <w:tab w:val="right" w:leader="dot" w:pos="9026"/>
-        </w:tabs>
-        <w:spacing w:before="120" w:after="60"/>
-      </w:pPr>
-      <w:hyperlink w:anchor="_Toc100013" w:history="1">
-        <w:r>
-          <w:rPr>
-            <w:rStyle w:val="Hyperlink"/>
-          </w:rPr>
-          <w:t>5.1 Механика</w:t>
-        </w:r>
-        <w:r>
-          <w:tab/>
-        </w:r>
-        <w:r>
-          <w:fldChar w:fldCharType="begin"/>
-        </w:r>
-        <w:r>
-          <w:instrText xml:space="preserve"> PAGEREF _Toc100013 \h </w:instrText>
-        </w:r>
-        <w:r>
-          <w:fldChar w:fldCharType="separate"/>
-        </w:r>
-        <w:r>
-          <w:t>7</w:t>
-        </w:r>
-        <w:r>
-          <w:fldChar w:fldCharType="end"/>
-        </w:r>
-      </w:hyperlink>
-    </w:p>
-    <w:p>
-      <w:pPr>
-        <w:pStyle w:val="11"/>
-        <w:ind w:left="360"/>
-        <w:tabs>
-          <w:tab w:val="right" w:leader="dot" w:pos="9026"/>
-        </w:tabs>
-        <w:spacing w:before="120" w:after="60"/>
-      </w:pPr>
-      <w:hyperlink w:anchor="_Toc100014" w:history="1">
-        <w:r>
-          <w:rPr>
-            <w:rStyle w:val="Hyperlink"/>
-          </w:rPr>
-          <w:t>5.2 Снап к вершинам</w:t>
-        </w:r>
-        <w:r>
-          <w:tab/>
-        </w:r>
-        <w:r>
-          <w:fldChar w:fldCharType="begin"/>
-        </w:r>
-        <w:r>
-          <w:instrText xml:space="preserve"> PAGEREF _Toc100014 \h </w:instrText>
-        </w:r>
-        <w:r>
-          <w:fldChar w:fldCharType="separate"/>
-        </w:r>
-        <w:r>
-          <w:t>7</w:t>
-        </w:r>
-        <w:r>
-          <w:fldChar w:fldCharType="end"/>
-        </w:r>
-      </w:hyperlink>
-    </w:p>
-    <w:p>
-      <w:pPr>
-        <w:pStyle w:val="11"/>
-        <w:ind w:left="360"/>
-        <w:tabs>
-          <w:tab w:val="right" w:leader="dot" w:pos="9026"/>
-        </w:tabs>
-        <w:spacing w:before="120" w:after="60"/>
-      </w:pPr>
-      <w:hyperlink w:anchor="_Toc100015" w:history="1">
-        <w:r>
-          <w:rPr>
-            <w:rStyle w:val="Hyperlink"/>
-          </w:rPr>
-          <w:t>5.3 Осевые констеины</w:t>
-        </w:r>
-        <w:r>
-          <w:tab/>
-        </w:r>
-        <w:r>
-          <w:fldChar w:fldCharType="begin"/>
-        </w:r>
-        <w:r>
-          <w:instrText xml:space="preserve"> PAGEREF _Toc100015 \h </w:instrText>
-        </w:r>
-        <w:r>
-          <w:fldChar w:fldCharType="separate"/>
-        </w:r>
-        <w:r>
-          <w:t>7</w:t>
-        </w:r>
-        <w:r>
-          <w:fldChar w:fldCharType="end"/>
-        </w:r>
-      </w:hyperlink>
-    </w:p>
-    <w:p>
-      <w:pPr>
-        <w:pStyle w:val="11"/>
-        <w:ind w:left="360"/>
-        <w:tabs>
-          <w:tab w:val="right" w:leader="dot" w:pos="9026"/>
-        </w:tabs>
-        <w:spacing w:before="120" w:after="60"/>
-      </w:pPr>
-      <w:hyperlink w:anchor="_Toc100016" w:history="1">
-        <w:r>
-          <w:rPr>
-            <w:rStyle w:val="Hyperlink"/>
-          </w:rPr>
-          <w:t>5.4 Подтверждение и отмена</w:t>
-        </w:r>
-        <w:r>
-          <w:tab/>
-        </w:r>
-        <w:r>
-          <w:fldChar w:fldCharType="begin"/>
-        </w:r>
-        <w:r>
-          <w:instrText xml:space="preserve"> PAGEREF _Toc100016 \h </w:instrText>
-        </w:r>
-        <w:r>
-          <w:fldChar w:fldCharType="separate"/>
-        </w:r>
-        <w:r>
-          <w:t>7</w:t>
-        </w:r>
-        <w:r>
-          <w:fldChar w:fldCharType="end"/>
-        </w:r>
-      </w:hyperlink>
+      <w:r>
+        <w:t>6. Rotate Pivot (Ctrl+Alt+D)</w:t>
+      </w:r>
+      <w:r>
+        <w:tab/>
+      </w:r>
+      <w:r>
+        <w:t>5</w:t>
+      </w:r>
     </w:p>
     <w:p>
       <w:pPr>
@@ -705,140 +302,15 @@
         </w:tabs>
         <w:spacing w:before="120" w:after="60"/>
       </w:pPr>
-      <w:hyperlink w:anchor="_Toc100017" w:history="1">
-        <w:r>
-          <w:rPr>
-            <w:rStyle w:val="Hyperlink"/>
-          </w:rPr>
-          <w:t>6. Rotate Pivot (Ctrl+Alt+D)</w:t>
-        </w:r>
-        <w:r>
-          <w:tab/>
-        </w:r>
-        <w:r>
-          <w:fldChar w:fldCharType="begin"/>
-        </w:r>
-        <w:r>
-          <w:instrText xml:space="preserve"> PAGEREF _Toc100017 \h </w:instrText>
-        </w:r>
-        <w:r>
-          <w:fldChar w:fldCharType="separate"/>
-        </w:r>
-        <w:r>
-          <w:t>8</w:t>
-        </w:r>
-        <w:r>
-          <w:fldChar w:fldCharType="end"/>
-        </w:r>
-      </w:hyperlink>
-    </w:p>
-    <w:p>
-      <w:pPr>
-        <w:pStyle w:val="11"/>
-        <w:ind w:left="360"/>
-        <w:tabs>
-          <w:tab w:val="right" w:leader="dot" w:pos="9026"/>
-        </w:tabs>
-        <w:spacing w:before="120" w:after="60"/>
-      </w:pPr>
-      <w:hyperlink w:anchor="_Toc100018" w:history="1">
-        <w:r>
-          <w:rPr>
-            <w:rStyle w:val="Hyperlink"/>
-          </w:rPr>
-          <w:t>6.1 Механика</w:t>
-        </w:r>
-        <w:r>
-          <w:tab/>
-        </w:r>
-        <w:r>
-          <w:fldChar w:fldCharType="begin"/>
-        </w:r>
-        <w:r>
-          <w:instrText xml:space="preserve"> PAGEREF _Toc100018 \h </w:instrText>
-        </w:r>
-        <w:r>
-          <w:fldChar w:fldCharType="separate"/>
-        </w:r>
-        <w:r>
-          <w:t>8</w:t>
-        </w:r>
-        <w:r>
-          <w:fldChar w:fldCharType="end"/>
-        </w:r>
-      </w:hyperlink>
-    </w:p>
-    <w:p>
-      <w:pPr>
-        <w:pStyle w:val="11"/>
-        <w:ind w:left="360"/>
-        <w:tabs>
-          <w:tab w:val="right" w:leader="dot" w:pos="9026"/>
-        </w:tabs>
-        <w:spacing w:before="120" w:after="60"/>
-      </w:pPr>
-      <w:hyperlink w:anchor="_Toc100019" w:history="1">
-        <w:r>
-          <w:rPr>
-            <w:rStyle w:val="Hyperlink"/>
-          </w:rPr>
-          <w:t>6.2 Оси и точность</w:t>
-        </w:r>
-        <w:r>
-          <w:tab/>
-        </w:r>
-        <w:r>
-          <w:fldChar w:fldCharType="begin"/>
-        </w:r>
-        <w:r>
-          <w:instrText xml:space="preserve"> PAGEREF _Toc100019 \h </w:instrText>
-        </w:r>
-        <w:r>
-          <w:fldChar w:fldCharType="separate"/>
-        </w:r>
-        <w:r>
-          <w:t>8</w:t>
-        </w:r>
-        <w:r>
-          <w:fldChar w:fldCharType="end"/>
-        </w:r>
-      </w:hyperlink>
-    </w:p>
-    <w:p>
-      <w:pPr>
-        <w:pStyle w:val="11"/>
-        <w:ind w:left="360"/>
-        <w:tabs>
-          <w:tab w:val="right" w:leader="dot" w:pos="9026"/>
-        </w:tabs>
-        <w:spacing w:before="120" w:after="60"/>
-      </w:pPr>
-      <w:hyperlink w:anchor="_Toc100020" w:history="1">
-        <w:r>
-          <w:rPr>
-            <w:rStyle w:val="Hyperlink"/>
-          </w:rPr>
-          <w:t>6.3 Фидбек</w:t>
-        </w:r>
-        <w:r>
-          <w:tab/>
-        </w:r>
-        <w:r>
-          <w:fldChar w:fldCharType="begin"/>
-        </w:r>
-        <w:r>
-          <w:instrText xml:space="preserve"> PAGEREF _Toc100020 \h </w:instrText>
-        </w:r>
-        <w:r>
-          <w:fldChar w:fldCharType="separate"/>
-        </w:r>
-        <w:r>
-          <w:t>8</w:t>
-        </w:r>
-        <w:r>
-          <w:fldChar w:fldCharType="end"/>
-        </w:r>
-      </w:hyperlink>
+      <w:r>
+        <w:t>7. Align Pivot to Normal / to Edge</w:t>
+      </w:r>
+      <w:r>
+        <w:tab/>
+      </w:r>
+      <w:r>
+        <w:t>6</w:t>
+      </w:r>
     </w:p>
     <w:p>
       <w:pPr>
@@ -848,140 +320,15 @@
         </w:tabs>
         <w:spacing w:before="120" w:after="60"/>
       </w:pPr>
-      <w:hyperlink w:anchor="_Toc100021" w:history="1">
-        <w:r>
-          <w:rPr>
-            <w:rStyle w:val="Hyperlink"/>
-          </w:rPr>
-          <w:t>7. Align Pivot to Normal / to Edge</w:t>
-        </w:r>
-        <w:r>
-          <w:tab/>
-        </w:r>
-        <w:r>
-          <w:fldChar w:fldCharType="begin"/>
-        </w:r>
-        <w:r>
-          <w:instrText xml:space="preserve"> PAGEREF _Toc100021 \h </w:instrText>
-        </w:r>
-        <w:r>
-          <w:fldChar w:fldCharType="separate"/>
-        </w:r>
-        <w:r>
-          <w:t>9</w:t>
-        </w:r>
-        <w:r>
-          <w:fldChar w:fldCharType="end"/>
-        </w:r>
-      </w:hyperlink>
-    </w:p>
-    <w:p>
-      <w:pPr>
-        <w:pStyle w:val="11"/>
-        <w:ind w:left="360"/>
-        <w:tabs>
-          <w:tab w:val="right" w:leader="dot" w:pos="9026"/>
-        </w:tabs>
-        <w:spacing w:before="120" w:after="60"/>
-      </w:pPr>
-      <w:hyperlink w:anchor="_Toc100022" w:history="1">
-        <w:r>
-          <w:rPr>
-            <w:rStyle w:val="Hyperlink"/>
-          </w:rPr>
-          <w:t>7.1 Align Pivot to Normal</w:t>
-        </w:r>
-        <w:r>
-          <w:tab/>
-        </w:r>
-        <w:r>
-          <w:fldChar w:fldCharType="begin"/>
-        </w:r>
-        <w:r>
-          <w:instrText xml:space="preserve"> PAGEREF _Toc100022 \h </w:instrText>
-        </w:r>
-        <w:r>
-          <w:fldChar w:fldCharType="separate"/>
-        </w:r>
-        <w:r>
-          <w:t>9</w:t>
-        </w:r>
-        <w:r>
-          <w:fldChar w:fldCharType="end"/>
-        </w:r>
-      </w:hyperlink>
-    </w:p>
-    <w:p>
-      <w:pPr>
-        <w:pStyle w:val="11"/>
-        <w:ind w:left="360"/>
-        <w:tabs>
-          <w:tab w:val="right" w:leader="dot" w:pos="9026"/>
-        </w:tabs>
-        <w:spacing w:before="120" w:after="60"/>
-      </w:pPr>
-      <w:hyperlink w:anchor="_Toc100023" w:history="1">
-        <w:r>
-          <w:rPr>
-            <w:rStyle w:val="Hyperlink"/>
-          </w:rPr>
-          <w:t>7.2 Align Pivot to Edge</w:t>
-        </w:r>
-        <w:r>
-          <w:tab/>
-        </w:r>
-        <w:r>
-          <w:fldChar w:fldCharType="begin"/>
-        </w:r>
-        <w:r>
-          <w:instrText xml:space="preserve"> PAGEREF _Toc100023 \h </w:instrText>
-        </w:r>
-        <w:r>
-          <w:fldChar w:fldCharType="separate"/>
-        </w:r>
-        <w:r>
-          <w:t>9</w:t>
-        </w:r>
-        <w:r>
-          <w:fldChar w:fldCharType="end"/>
-        </w:r>
-      </w:hyperlink>
-    </w:p>
-    <w:p>
-      <w:pPr>
-        <w:pStyle w:val="11"/>
-        <w:ind w:left="360"/>
-        <w:tabs>
-          <w:tab w:val="right" w:leader="dot" w:pos="9026"/>
-        </w:tabs>
-        <w:spacing w:before="120" w:after="60"/>
-      </w:pPr>
-      <w:hyperlink w:anchor="_Toc100024" w:history="1">
-        <w:r>
-          <w:rPr>
-            <w:rStyle w:val="Hyperlink"/>
-          </w:rPr>
-          <w:t>7.3 Липкая цель</w:t>
-        </w:r>
-        <w:r>
-          <w:tab/>
-        </w:r>
-        <w:r>
-          <w:fldChar w:fldCharType="begin"/>
-        </w:r>
-        <w:r>
-          <w:instrText xml:space="preserve"> PAGEREF _Toc100024 \h </w:instrText>
-        </w:r>
-        <w:r>
-          <w:fldChar w:fldCharType="separate"/>
-        </w:r>
-        <w:r>
-          <w:t>9</w:t>
-        </w:r>
-        <w:r>
-          <w:fldChar w:fldCharType="end"/>
-        </w:r>
-      </w:hyperlink>
+      <w:r>
+        <w:t>8. Pivot Audit</w:t>
+      </w:r>
+      <w:r>
+        <w:tab/>
+      </w:r>
+      <w:r>
+        <w:t>6</w:t>
+      </w:r>
     </w:p>
     <w:p>
       <w:pPr>
@@ -991,140 +338,15 @@
         </w:tabs>
         <w:spacing w:before="120" w:after="60"/>
       </w:pPr>
-      <w:hyperlink w:anchor="_Toc100025" w:history="1">
-        <w:r>
-          <w:rPr>
-            <w:rStyle w:val="Hyperlink"/>
-          </w:rPr>
-          <w:t>8. Pivot Audit</w:t>
-        </w:r>
-        <w:r>
-          <w:tab/>
-        </w:r>
-        <w:r>
-          <w:fldChar w:fldCharType="begin"/>
-        </w:r>
-        <w:r>
-          <w:instrText xml:space="preserve"> PAGEREF _Toc100025 \h </w:instrText>
-        </w:r>
-        <w:r>
-          <w:fldChar w:fldCharType="separate"/>
-        </w:r>
-        <w:r>
-          <w:t>9</w:t>
-        </w:r>
-        <w:r>
-          <w:fldChar w:fldCharType="end"/>
-        </w:r>
-      </w:hyperlink>
-    </w:p>
-    <w:p>
-      <w:pPr>
-        <w:pStyle w:val="11"/>
-        <w:ind w:left="360"/>
-        <w:tabs>
-          <w:tab w:val="right" w:leader="dot" w:pos="9026"/>
-        </w:tabs>
-        <w:spacing w:before="120" w:after="60"/>
-      </w:pPr>
-      <w:hyperlink w:anchor="_Toc100026" w:history="1">
-        <w:r>
-          <w:rPr>
-            <w:rStyle w:val="Hyperlink"/>
-          </w:rPr>
-          <w:t>8.1 Зачем</w:t>
-        </w:r>
-        <w:r>
-          <w:tab/>
-        </w:r>
-        <w:r>
-          <w:fldChar w:fldCharType="begin"/>
-        </w:r>
-        <w:r>
-          <w:instrText xml:space="preserve"> PAGEREF _Toc100026 \h </w:instrText>
-        </w:r>
-        <w:r>
-          <w:fldChar w:fldCharType="separate"/>
-        </w:r>
-        <w:r>
-          <w:t>10</w:t>
-        </w:r>
-        <w:r>
-          <w:fldChar w:fldCharType="end"/>
-        </w:r>
-      </w:hyperlink>
-    </w:p>
-    <w:p>
-      <w:pPr>
-        <w:pStyle w:val="11"/>
-        <w:ind w:left="360"/>
-        <w:tabs>
-          <w:tab w:val="right" w:leader="dot" w:pos="9026"/>
-        </w:tabs>
-        <w:spacing w:before="120" w:after="60"/>
-      </w:pPr>
-      <w:hyperlink w:anchor="_Toc100027" w:history="1">
-        <w:r>
-          <w:rPr>
-            <w:rStyle w:val="Hyperlink"/>
-          </w:rPr>
-          <w:t>8.2 Правила</w:t>
-        </w:r>
-        <w:r>
-          <w:tab/>
-        </w:r>
-        <w:r>
-          <w:fldChar w:fldCharType="begin"/>
-        </w:r>
-        <w:r>
-          <w:instrText xml:space="preserve"> PAGEREF _Toc100027 \h </w:instrText>
-        </w:r>
-        <w:r>
-          <w:fldChar w:fldCharType="separate"/>
-        </w:r>
-        <w:r>
-          <w:t>10</w:t>
-        </w:r>
-        <w:r>
-          <w:fldChar w:fldCharType="end"/>
-        </w:r>
-      </w:hyperlink>
-    </w:p>
-    <w:p>
-      <w:pPr>
-        <w:pStyle w:val="11"/>
-        <w:ind w:left="360"/>
-        <w:tabs>
-          <w:tab w:val="right" w:leader="dot" w:pos="9026"/>
-        </w:tabs>
-        <w:spacing w:before="120" w:after="60"/>
-      </w:pPr>
-      <w:hyperlink w:anchor="_Toc100028" w:history="1">
-        <w:r>
-          <w:rPr>
-            <w:rStyle w:val="Hyperlink"/>
-          </w:rPr>
-          <w:t>8.3 Прогон и исправление</w:t>
-        </w:r>
-        <w:r>
-          <w:tab/>
-        </w:r>
-        <w:r>
-          <w:fldChar w:fldCharType="begin"/>
-        </w:r>
-        <w:r>
-          <w:instrText xml:space="preserve"> PAGEREF _Toc100028 \h </w:instrText>
-        </w:r>
-        <w:r>
-          <w:fldChar w:fldCharType="separate"/>
-        </w:r>
-        <w:r>
-          <w:t>10</w:t>
-        </w:r>
-        <w:r>
-          <w:fldChar w:fldCharType="end"/>
-        </w:r>
-      </w:hyperlink>
+      <w:r>
+        <w:t>9. Панель и подсказки</w:t>
+      </w:r>
+      <w:r>
+        <w:tab/>
+      </w:r>
+      <w:r>
+        <w:t>7</w:t>
+      </w:r>
     </w:p>
     <w:p>
       <w:pPr>
@@ -1134,32 +356,15 @@
         </w:tabs>
         <w:spacing w:before="120" w:after="60"/>
       </w:pPr>
-      <w:hyperlink w:anchor="_Toc100029" w:history="1">
-        <w:r>
-          <w:rPr>
-            <w:rStyle w:val="Hyperlink"/>
-          </w:rPr>
-          <w:t>9. Панель и подсказки</w:t>
-        </w:r>
-        <w:r>
-          <w:tab/>
-        </w:r>
-        <w:r>
-          <w:fldChar w:fldCharType="begin"/>
-        </w:r>
-        <w:r>
-          <w:instrText xml:space="preserve"> PAGEREF _Toc100029 \h </w:instrText>
-        </w:r>
-        <w:r>
-          <w:fldChar w:fldCharType="separate"/>
-        </w:r>
-        <w:r>
-          <w:t>11</w:t>
-        </w:r>
-        <w:r>
-          <w:fldChar w:fldCharType="end"/>
-        </w:r>
-      </w:hyperlink>
+      <w:r>
+        <w:t>10. Как пользоваться</w:t>
+      </w:r>
+      <w:r>
+        <w:tab/>
+      </w:r>
+      <w:r>
+        <w:t>7</w:t>
+      </w:r>
     </w:p>
     <w:p>
       <w:pPr>
@@ -1169,216 +374,20 @@
         </w:tabs>
         <w:spacing w:before="120" w:after="60"/>
       </w:pPr>
-      <w:hyperlink w:anchor="_Toc100030" w:history="1">
-        <w:r>
-          <w:rPr>
-            <w:rStyle w:val="Hyperlink"/>
-          </w:rPr>
-          <w:t>10. Как пользоваться</w:t>
-        </w:r>
-        <w:r>
-          <w:tab/>
-        </w:r>
-        <w:r>
-          <w:fldChar w:fldCharType="begin"/>
-        </w:r>
-        <w:r>
-          <w:instrText xml:space="preserve"> PAGEREF _Toc100030 \h </w:instrText>
-        </w:r>
-        <w:r>
-          <w:fldChar w:fldCharType="separate"/>
-        </w:r>
-        <w:r>
-          <w:t>11</w:t>
-        </w:r>
-        <w:r>
-          <w:fldChar w:fldCharType="end"/>
-        </w:r>
-      </w:hyperlink>
-    </w:p>
-    <w:p>
-      <w:pPr>
-        <w:pStyle w:val="11"/>
-        <w:ind w:left="360"/>
-        <w:tabs>
-          <w:tab w:val="right" w:leader="dot" w:pos="9026"/>
-        </w:tabs>
-        <w:spacing w:before="120" w:after="60"/>
-      </w:pPr>
-      <w:hyperlink w:anchor="_Toc100031" w:history="1">
-        <w:r>
-          <w:rPr>
-            <w:rStyle w:val="Hyperlink"/>
-          </w:rPr>
-          <w:t>10.1 Колесо: пивот на ось вращения</w:t>
-        </w:r>
-        <w:r>
-          <w:tab/>
-        </w:r>
-        <w:r>
-          <w:fldChar w:fldCharType="begin"/>
-        </w:r>
-        <w:r>
-          <w:instrText xml:space="preserve"> PAGEREF _Toc100031 \h </w:instrText>
-        </w:r>
-        <w:r>
-          <w:fldChar w:fldCharType="separate"/>
-        </w:r>
-        <w:r>
-          <w:t>11</w:t>
-        </w:r>
-        <w:r>
-          <w:fldChar w:fldCharType="end"/>
-        </w:r>
-      </w:hyperlink>
-    </w:p>
-    <w:p>
-      <w:pPr>
-        <w:pStyle w:val="11"/>
-        <w:ind w:left="360"/>
-        <w:tabs>
-          <w:tab w:val="right" w:leader="dot" w:pos="9026"/>
-        </w:tabs>
-        <w:spacing w:before="120" w:after="60"/>
-      </w:pPr>
-      <w:hyperlink w:anchor="_Toc100032" w:history="1">
-        <w:r>
-          <w:rPr>
-            <w:rStyle w:val="Hyperlink"/>
-          </w:rPr>
-          <w:t>10.2 Дверь: пивот на петли</w:t>
-        </w:r>
-        <w:r>
-          <w:tab/>
-        </w:r>
-        <w:r>
-          <w:fldChar w:fldCharType="begin"/>
-        </w:r>
-        <w:r>
-          <w:instrText xml:space="preserve"> PAGEREF _Toc100032 \h </w:instrText>
-        </w:r>
-        <w:r>
-          <w:fldChar w:fldCharType="separate"/>
-        </w:r>
-        <w:r>
-          <w:t>11</w:t>
-        </w:r>
-        <w:r>
-          <w:fldChar w:fldCharType="end"/>
-        </w:r>
-      </w:hyperlink>
-    </w:p>
-    <w:p>
-      <w:pPr>
-        <w:pStyle w:val="11"/>
-        <w:ind w:left="360"/>
-        <w:tabs>
-          <w:tab w:val="right" w:leader="dot" w:pos="9026"/>
-        </w:tabs>
-        <w:spacing w:before="120" w:after="60"/>
-      </w:pPr>
-      <w:hyperlink w:anchor="_Toc100033" w:history="1">
-        <w:r>
-          <w:rPr>
-            <w:rStyle w:val="Hyperlink"/>
-          </w:rPr>
-          <w:t>10.3 Импорт: привести к конвенции</w:t>
-        </w:r>
-        <w:r>
-          <w:tab/>
-        </w:r>
-        <w:r>
-          <w:fldChar w:fldCharType="begin"/>
-        </w:r>
-        <w:r>
-          <w:instrText xml:space="preserve"> PAGEREF _Toc100033 \h </w:instrText>
-        </w:r>
-        <w:r>
-          <w:fldChar w:fldCharType="separate"/>
-        </w:r>
-        <w:r>
-          <w:t>12</w:t>
-        </w:r>
-        <w:r>
-          <w:fldChar w:fldCharType="end"/>
-        </w:r>
-      </w:hyperlink>
-    </w:p>
-    <w:p>
-      <w:pPr>
-        <w:pStyle w:val="11"/>
-        <w:ind w:left="360"/>
-        <w:tabs>
-          <w:tab w:val="right" w:leader="dot" w:pos="9026"/>
-        </w:tabs>
-        <w:spacing w:before="120" w:after="60"/>
-      </w:pPr>
-      <w:hyperlink w:anchor="_Toc100034" w:history="1">
-        <w:r>
-          <w:rPr>
-            <w:rStyle w:val="Hyperlink"/>
-          </w:rPr>
-          <w:t>10.4 Проверка перед сдачей</w:t>
-        </w:r>
-        <w:r>
-          <w:tab/>
-        </w:r>
-        <w:r>
-          <w:fldChar w:fldCharType="begin"/>
-        </w:r>
-        <w:r>
-          <w:instrText xml:space="preserve"> PAGEREF _Toc100034 \h </w:instrText>
-        </w:r>
-        <w:r>
-          <w:fldChar w:fldCharType="separate"/>
-        </w:r>
-        <w:r>
-          <w:t>12</w:t>
-        </w:r>
-        <w:r>
-          <w:fldChar w:fldCharType="end"/>
-        </w:r>
-      </w:hyperlink>
-    </w:p>
-    <w:p>
-      <w:pPr>
-        <w:pStyle w:val="9"/>
-        <w:tabs>
-          <w:tab w:val="right" w:leader="dot" w:pos="9026"/>
-        </w:tabs>
-        <w:spacing w:before="120" w:after="60"/>
-      </w:pPr>
-      <w:hyperlink w:anchor="_Toc100035" w:history="1">
-        <w:r>
-          <w:rPr>
-            <w:rStyle w:val="Hyperlink"/>
-          </w:rPr>
-          <w:t>11. Решение проблем</w:t>
-        </w:r>
-        <w:r>
-          <w:tab/>
-        </w:r>
-        <w:r>
-          <w:fldChar w:fldCharType="begin"/>
-        </w:r>
-        <w:r>
-          <w:instrText xml:space="preserve"> PAGEREF _Toc100035 \h </w:instrText>
-        </w:r>
-        <w:r>
-          <w:fldChar w:fldCharType="separate"/>
-        </w:r>
-        <w:r>
-          <w:t>12</w:t>
-        </w:r>
-        <w:r>
-          <w:fldChar w:fldCharType="end"/>
-        </w:r>
-      </w:hyperlink>
+      <w:r>
+        <w:t>11. Решение проблем</w:t>
+      </w:r>
+      <w:r>
+        <w:tab/>
+      </w:r>
+      <w:r>
+        <w:t>8</w:t>
+      </w:r>
     </w:p>
     <w:p>
       <w:r>
         <w:fldChar w:fldCharType="begin"/>
-        <w:instrText xml:space="preserve">TOC \o "1-2" \h \z \u</w:instrText>
+        <w:instrText xml:space="preserve">TOC \o "1-1" \h \z \u</w:instrText>
         <w:fldChar w:fldCharType="separate">
           <w:t>Оглавление: откройте документ в Word/LibreOffice и обновите поле (F9), чтобы заполнить номера страниц.</w:t>
         </w:fldChar>
@@ -1393,10 +402,29 @@
     <w:p>
       <w:pPr>
         <w:pStyle w:val="Heading1"/>
+        <w:pBdr>
+          <w:left w:val="single" w:sz="24" w:space="8" w:color="C82823"/>
+        </w:pBdr>
       </w:pPr>
       <w:bookmarkStart w:id="100001" w:name="_Toc100001"/>
       <w:r>
-        <w:t>1. О программе</w:t>
+        <w:rPr>
+          <w:rFonts w:ascii="Century Gothic" w:hAnsi="Century Gothic"/>
+          <w:b/>
+          <w:color w:val="000000"/>
+          <w:sz w:val="30"/>
+        </w:rPr>
+        <w:t xml:space="preserve">1. </w:t>
+      </w:r>
+      <w:r>
+        <w:rPr>
+          <w:rFonts w:ascii="Century Gothic" w:hAnsi="Century Gothic"/>
+          <w:b/>
+          <w:color w:val="000000"/>
+          <w:sz w:val="30"/>
+          <w:spacing w:val="20"/>
+        </w:rPr>
+        <w:t>О ПРОГРАММЕ</w:t>
       </w:r>
       <w:bookmarkEnd w:id="100001"/>
     </w:p>
@@ -1415,6 +443,7 @@
         <w:rPr>
           <w:rFonts w:ascii="Arial" w:hAnsi="Arial"/>
           <w:i w:val="0"/>
+          <w:color w:val="1A1A1A"/>
           <w:sz w:val="19"/>
         </w:rPr>
         <w:t>Ключевые возможности:</w:t>
@@ -1428,6 +457,7 @@
         <w:rPr>
           <w:rFonts w:ascii="Arial" w:hAnsi="Arial"/>
           <w:i w:val="0"/>
+          <w:color w:val="1A1A1A"/>
           <w:sz w:val="19"/>
         </w:rPr>
         <w:t>Origin to Selection - пивот в центр выделения клавишей D, с якорями Median / Bottom / Top;</w:t>
@@ -1441,6 +471,7 @@
         <w:rPr>
           <w:rFonts w:ascii="Arial" w:hAnsi="Arial"/>
           <w:i w:val="0"/>
+          <w:color w:val="1A1A1A"/>
           <w:sz w:val="19"/>
         </w:rPr>
         <w:t>Drag Pivot - перетаскивание пивота мышью по любой видимой геометрии, со снапом к вершинам и осевыми констеинами;</w:t>
@@ -1454,6 +485,7 @@
         <w:rPr>
           <w:rFonts w:ascii="Arial" w:hAnsi="Arial"/>
           <w:i w:val="0"/>
+          <w:color w:val="1A1A1A"/>
           <w:sz w:val="19"/>
         </w:rPr>
         <w:t>Rotate Pivot - поворот ориентации пивота без движения геометрии, для анимируемых частей;</w:t>
@@ -1467,6 +499,7 @@
         <w:rPr>
           <w:rFonts w:ascii="Arial" w:hAnsi="Arial"/>
           <w:i w:val="0"/>
+          <w:color w:val="1A1A1A"/>
           <w:sz w:val="19"/>
         </w:rPr>
         <w:t>Align Pivot to Normal - ось Z пивота следует нормали грани под курсором;</w:t>
@@ -1480,6 +513,7 @@
         <w:rPr>
           <w:rFonts w:ascii="Arial" w:hAnsi="Arial"/>
           <w:i w:val="0"/>
+          <w:color w:val="1A1A1A"/>
           <w:sz w:val="19"/>
         </w:rPr>
         <w:t>Align Pivot to Edge - ось X пивота ложится вдоль ребра;</w:t>
@@ -1493,6 +527,7 @@
         <w:rPr>
           <w:rFonts w:ascii="Arial" w:hAnsi="Arial"/>
           <w:i w:val="0"/>
+          <w:color w:val="1A1A1A"/>
           <w:sz w:val="19"/>
         </w:rPr>
         <w:t>Pivot Audit - проверка пивотов выделенных мешей по конвенциям пайплайна с пакетным исправлением;</w:t>
@@ -1506,6 +541,7 @@
         <w:rPr>
           <w:rFonts w:ascii="Arial" w:hAnsi="Arial"/>
           <w:i w:val="0"/>
+          <w:color w:val="1A1A1A"/>
           <w:sz w:val="19"/>
         </w:rPr>
         <w:t>честный undo: каждый инструмент коммитится одним шагом;</w:t>
@@ -1519,6 +555,7 @@
         <w:rPr>
           <w:rFonts w:ascii="Arial" w:hAnsi="Arial"/>
           <w:i w:val="0"/>
+          <w:color w:val="1A1A1A"/>
           <w:sz w:val="19"/>
         </w:rPr>
         <w:t>сторож keymap: расширение само восстанавливает повреждённую системную раскладку при включении.</w:t>
@@ -1539,6 +576,7 @@
         <w:rPr>
           <w:rFonts w:ascii="Arial" w:hAnsi="Arial"/>
           <w:i w:val="0"/>
+          <w:color w:val="1A1A1A"/>
           <w:sz w:val="19"/>
         </w:rPr>
         <w:t>Три принципа. Первый - пивот отдельный от геометрии: поворот и выравнивание ориентации меняют только матрицу объекта, вершины остаются на местах с точностью до машинного эпсилона. Второй - живое превью: каждый модальный инструмент показывает результат до подтверждения, и до коммита сцена не меняется - отмена (ПКМ или Esc) откатывает всё чисто. Третий - предсказуемый undo: любая операция коммитится ровно одним шагом истории.</w:t>
@@ -1556,7 +594,6 @@
     </w:p>
     <w:tbl>
       <w:tblPr>
-        <w:tblStyle w:val="TableGrid"/>
         <w:tblW w:type="auto" w:w="0"/>
         <w:tblLayout w:type="fixed"/>
         <w:tblLook w:firstColumn="1" w:firstRow="1" w:lastColumn="0" w:lastRow="0" w:noHBand="0" w:noVBand="1" w:val="04A0"/>
@@ -1568,96 +605,86 @@
         </w:tblCellMar>
       </w:tblPr>
       <w:tblGrid>
-        <w:gridCol w:w="3120"/>
-        <w:gridCol w:w="3120"/>
-        <w:gridCol w:w="3120"/>
+        <w:gridCol w:w="3137"/>
+        <w:gridCol w:w="3137"/>
+        <w:gridCol w:w="3137"/>
       </w:tblGrid>
       <w:tr>
         <w:trPr>
           <w:cantSplit/>
-          <w:tblHeader/>
         </w:trPr>
         <w:tc>
           <w:tcPr>
             <w:tcW w:type="dxa" w:w="2948"/>
+            <w:vAlign w:val="top"/>
             <w:tcBorders>
-              <w:top w:val="single" w:sz="4" w:space="0" w:color="CCCCCC"/>
-              <w:left w:val="single" w:sz="4" w:space="0" w:color="CCCCCC"/>
-              <w:bottom w:val="single" w:sz="4" w:space="0" w:color="CCCCCC"/>
-              <w:right w:val="single" w:sz="4" w:space="0" w:color="CCCCCC"/>
+              <w:bottom w:val="single" w:sz="12" w:space="4" w:color="C82823"/>
             </w:tcBorders>
-            <w:vAlign w:val="top"/>
-            <w:shd w:val="clear" w:color="auto" w:fill="2E75B5"/>
           </w:tcPr>
           <w:p>
             <w:pPr>
+              <w:keepNext/>
               <w:spacing w:before="40" w:after="40" w:line="264" w:lineRule="auto"/>
             </w:pPr>
             <w:r>
               <w:rPr>
-                <w:rFonts w:ascii="Arial" w:hAnsi="Arial"/>
+                <w:rFonts w:ascii="Century Gothic" w:hAnsi="Century Gothic"/>
                 <w:b/>
-                <w:i w:val="0"/>
-                <w:color w:val="FFFFFF"/>
-                <w:sz w:val="18"/>
+                <w:color w:val="000000"/>
+                <w:sz w:val="17"/>
+                <w:spacing w:val="20"/>
               </w:rPr>
-              <w:t>Инструмент</w:t>
+              <w:t>ИНСТРУМЕНТ</w:t>
             </w:r>
           </w:p>
         </w:tc>
         <w:tc>
           <w:tcPr>
             <w:tcW w:type="dxa" w:w="3175"/>
+            <w:vAlign w:val="top"/>
             <w:tcBorders>
-              <w:top w:val="single" w:sz="4" w:space="0" w:color="CCCCCC"/>
-              <w:left w:val="single" w:sz="4" w:space="0" w:color="CCCCCC"/>
-              <w:bottom w:val="single" w:sz="4" w:space="0" w:color="CCCCCC"/>
-              <w:right w:val="single" w:sz="4" w:space="0" w:color="CCCCCC"/>
+              <w:bottom w:val="single" w:sz="12" w:space="4" w:color="C82823"/>
             </w:tcBorders>
-            <w:vAlign w:val="top"/>
-            <w:shd w:val="clear" w:color="auto" w:fill="2E75B5"/>
           </w:tcPr>
           <w:p>
             <w:pPr>
+              <w:keepNext/>
               <w:spacing w:before="40" w:after="40" w:line="264" w:lineRule="auto"/>
             </w:pPr>
             <w:r>
               <w:rPr>
-                <w:rFonts w:ascii="Arial" w:hAnsi="Arial"/>
+                <w:rFonts w:ascii="Century Gothic" w:hAnsi="Century Gothic"/>
                 <w:b/>
-                <w:i w:val="0"/>
-                <w:color w:val="FFFFFF"/>
-                <w:sz w:val="18"/>
+                <w:color w:val="000000"/>
+                <w:sz w:val="17"/>
+                <w:spacing w:val="20"/>
               </w:rPr>
-              <w:t>Клавиша</w:t>
+              <w:t>КЛАВИША</w:t>
             </w:r>
           </w:p>
         </w:tc>
         <w:tc>
           <w:tcPr>
             <w:tcW w:type="dxa" w:w="2494"/>
+            <w:vAlign w:val="top"/>
             <w:tcBorders>
-              <w:top w:val="single" w:sz="4" w:space="0" w:color="CCCCCC"/>
-              <w:left w:val="single" w:sz="4" w:space="0" w:color="CCCCCC"/>
-              <w:bottom w:val="single" w:sz="4" w:space="0" w:color="CCCCCC"/>
-              <w:right w:val="single" w:sz="4" w:space="0" w:color="CCCCCC"/>
+              <w:bottom w:val="single" w:sz="12" w:space="4" w:color="C82823"/>
             </w:tcBorders>
-            <w:vAlign w:val="top"/>
-            <w:shd w:val="clear" w:color="auto" w:fill="2E75B5"/>
           </w:tcPr>
           <w:p>
             <w:pPr>
+              <w:keepNext/>
               <w:spacing w:before="40" w:after="40" w:line="264" w:lineRule="auto"/>
             </w:pPr>
             <w:r>
               <w:rPr>
-                <w:rFonts w:ascii="Arial" w:hAnsi="Arial"/>
+                <w:rFonts w:ascii="Century Gothic" w:hAnsi="Century Gothic"/>
                 <w:b/>
-                <w:i w:val="0"/>
-                <w:color w:val="FFFFFF"/>
-                <w:sz w:val="18"/>
+                <w:color w:val="000000"/>
+                <w:sz w:val="17"/>
+                <w:spacing w:val="20"/>
               </w:rPr>
-              <w:t>Где ещё</w:t>
+              <w:t>ГДЕ ЕЩЁ</w:t>
             </w:r>
           </w:p>
         </w:tc>
@@ -1669,23 +696,21 @@
         <w:tc>
           <w:tcPr>
             <w:tcW w:type="dxa" w:w="2948"/>
+            <w:vAlign w:val="top"/>
             <w:tcBorders>
-              <w:top w:val="single" w:sz="4" w:space="0" w:color="CCCCCC"/>
-              <w:left w:val="single" w:sz="4" w:space="0" w:color="CCCCCC"/>
-              <w:bottom w:val="single" w:sz="4" w:space="0" w:color="CCCCCC"/>
-              <w:right w:val="single" w:sz="4" w:space="0" w:color="CCCCCC"/>
+              <w:bottom w:val="single" w:sz="4" w:space="4" w:color="E0E0E0"/>
             </w:tcBorders>
-            <w:vAlign w:val="top"/>
           </w:tcPr>
           <w:p>
             <w:pPr>
+              <w:keepNext/>
               <w:spacing w:before="40" w:after="40" w:line="264" w:lineRule="auto"/>
             </w:pPr>
             <w:r>
               <w:rPr>
                 <w:rFonts w:ascii="Arial" w:hAnsi="Arial"/>
                 <w:b/>
-                <w:i w:val="0"/>
+                <w:color w:val="1A1A1A"/>
                 <w:sz w:val="18"/>
               </w:rPr>
               <w:t>Origin to Selection</w:t>
@@ -1695,23 +720,21 @@
         <w:tc>
           <w:tcPr>
             <w:tcW w:type="dxa" w:w="3175"/>
+            <w:vAlign w:val="top"/>
             <w:tcBorders>
-              <w:top w:val="single" w:sz="4" w:space="0" w:color="CCCCCC"/>
-              <w:left w:val="single" w:sz="4" w:space="0" w:color="CCCCCC"/>
-              <w:bottom w:val="single" w:sz="4" w:space="0" w:color="CCCCCC"/>
-              <w:right w:val="single" w:sz="4" w:space="0" w:color="CCCCCC"/>
+              <w:bottom w:val="single" w:sz="4" w:space="4" w:color="E0E0E0"/>
             </w:tcBorders>
-            <w:vAlign w:val="top"/>
           </w:tcPr>
           <w:p>
             <w:pPr>
+              <w:keepNext/>
               <w:spacing w:before="40" w:after="40" w:line="264" w:lineRule="auto"/>
             </w:pPr>
             <w:r>
               <w:rPr>
                 <w:rFonts w:ascii="Arial" w:hAnsi="Arial"/>
                 <w:b w:val="0"/>
-                <w:i w:val="0"/>
+                <w:color w:val="1A1A1A"/>
                 <w:sz w:val="18"/>
               </w:rPr>
               <w:t>D · DD · DDD</w:t>
@@ -1721,23 +744,21 @@
         <w:tc>
           <w:tcPr>
             <w:tcW w:type="dxa" w:w="2494"/>
+            <w:vAlign w:val="top"/>
             <w:tcBorders>
-              <w:top w:val="single" w:sz="4" w:space="0" w:color="CCCCCC"/>
-              <w:left w:val="single" w:sz="4" w:space="0" w:color="CCCCCC"/>
-              <w:bottom w:val="single" w:sz="4" w:space="0" w:color="CCCCCC"/>
-              <w:right w:val="single" w:sz="4" w:space="0" w:color="CCCCCC"/>
+              <w:bottom w:val="single" w:sz="4" w:space="4" w:color="E0E0E0"/>
             </w:tcBorders>
-            <w:vAlign w:val="top"/>
           </w:tcPr>
           <w:p>
             <w:pPr>
+              <w:keepNext/>
               <w:spacing w:before="40" w:after="40" w:line="264" w:lineRule="auto"/>
             </w:pPr>
             <w:r>
               <w:rPr>
                 <w:rFonts w:ascii="Arial" w:hAnsi="Arial"/>
                 <w:b w:val="0"/>
-                <w:i w:val="0"/>
+                <w:color w:val="1A1A1A"/>
                 <w:sz w:val="18"/>
               </w:rPr>
               <w:t>панель, pie-меню</w:t>
@@ -1752,24 +773,21 @@
         <w:tc>
           <w:tcPr>
             <w:tcW w:type="dxa" w:w="2948"/>
+            <w:vAlign w:val="top"/>
             <w:tcBorders>
-              <w:top w:val="single" w:sz="4" w:space="0" w:color="CCCCCC"/>
-              <w:left w:val="single" w:sz="4" w:space="0" w:color="CCCCCC"/>
-              <w:bottom w:val="single" w:sz="4" w:space="0" w:color="CCCCCC"/>
-              <w:right w:val="single" w:sz="4" w:space="0" w:color="CCCCCC"/>
+              <w:bottom w:val="single" w:sz="4" w:space="4" w:color="E0E0E0"/>
             </w:tcBorders>
-            <w:vAlign w:val="top"/>
-            <w:shd w:val="clear" w:color="auto" w:fill="F5F8FB"/>
           </w:tcPr>
           <w:p>
             <w:pPr>
+              <w:keepNext/>
               <w:spacing w:before="40" w:after="40" w:line="264" w:lineRule="auto"/>
             </w:pPr>
             <w:r>
               <w:rPr>
                 <w:rFonts w:ascii="Arial" w:hAnsi="Arial"/>
                 <w:b/>
-                <w:i w:val="0"/>
+                <w:color w:val="1A1A1A"/>
                 <w:sz w:val="18"/>
               </w:rPr>
               <w:t>Drag Pivot</w:t>
@@ -1779,24 +797,21 @@
         <w:tc>
           <w:tcPr>
             <w:tcW w:type="dxa" w:w="3175"/>
+            <w:vAlign w:val="top"/>
             <w:tcBorders>
-              <w:top w:val="single" w:sz="4" w:space="0" w:color="CCCCCC"/>
-              <w:left w:val="single" w:sz="4" w:space="0" w:color="CCCCCC"/>
-              <w:bottom w:val="single" w:sz="4" w:space="0" w:color="CCCCCC"/>
-              <w:right w:val="single" w:sz="4" w:space="0" w:color="CCCCCC"/>
+              <w:bottom w:val="single" w:sz="4" w:space="4" w:color="E0E0E0"/>
             </w:tcBorders>
-            <w:vAlign w:val="top"/>
-            <w:shd w:val="clear" w:color="auto" w:fill="F5F8FB"/>
           </w:tcPr>
           <w:p>
             <w:pPr>
+              <w:keepNext/>
               <w:spacing w:before="40" w:after="40" w:line="264" w:lineRule="auto"/>
             </w:pPr>
             <w:r>
               <w:rPr>
                 <w:rFonts w:ascii="Arial" w:hAnsi="Arial"/>
                 <w:b w:val="0"/>
-                <w:i w:val="0"/>
+                <w:color w:val="1A1A1A"/>
                 <w:sz w:val="18"/>
               </w:rPr>
               <w:t>Ctrl+D</w:t>
@@ -1806,24 +821,21 @@
         <w:tc>
           <w:tcPr>
             <w:tcW w:type="dxa" w:w="2494"/>
+            <w:vAlign w:val="top"/>
             <w:tcBorders>
-              <w:top w:val="single" w:sz="4" w:space="0" w:color="CCCCCC"/>
-              <w:left w:val="single" w:sz="4" w:space="0" w:color="CCCCCC"/>
-              <w:bottom w:val="single" w:sz="4" w:space="0" w:color="CCCCCC"/>
-              <w:right w:val="single" w:sz="4" w:space="0" w:color="CCCCCC"/>
+              <w:bottom w:val="single" w:sz="4" w:space="4" w:color="E0E0E0"/>
             </w:tcBorders>
-            <w:vAlign w:val="top"/>
-            <w:shd w:val="clear" w:color="auto" w:fill="F5F8FB"/>
           </w:tcPr>
           <w:p>
             <w:pPr>
+              <w:keepNext/>
               <w:spacing w:before="40" w:after="40" w:line="264" w:lineRule="auto"/>
             </w:pPr>
             <w:r>
               <w:rPr>
                 <w:rFonts w:ascii="Arial" w:hAnsi="Arial"/>
                 <w:b w:val="0"/>
-                <w:i w:val="0"/>
+                <w:color w:val="1A1A1A"/>
                 <w:sz w:val="18"/>
               </w:rPr>
               <w:t>панель, pie-меню</w:t>
@@ -1838,23 +850,21 @@
         <w:tc>
           <w:tcPr>
             <w:tcW w:type="dxa" w:w="2948"/>
+            <w:vAlign w:val="top"/>
             <w:tcBorders>
-              <w:top w:val="single" w:sz="4" w:space="0" w:color="CCCCCC"/>
-              <w:left w:val="single" w:sz="4" w:space="0" w:color="CCCCCC"/>
-              <w:bottom w:val="single" w:sz="4" w:space="0" w:color="CCCCCC"/>
-              <w:right w:val="single" w:sz="4" w:space="0" w:color="CCCCCC"/>
+              <w:bottom w:val="single" w:sz="4" w:space="4" w:color="E0E0E0"/>
             </w:tcBorders>
-            <w:vAlign w:val="top"/>
           </w:tcPr>
           <w:p>
             <w:pPr>
+              <w:keepNext/>
               <w:spacing w:before="40" w:after="40" w:line="264" w:lineRule="auto"/>
             </w:pPr>
             <w:r>
               <w:rPr>
                 <w:rFonts w:ascii="Arial" w:hAnsi="Arial"/>
                 <w:b/>
-                <w:i w:val="0"/>
+                <w:color w:val="1A1A1A"/>
                 <w:sz w:val="18"/>
               </w:rPr>
               <w:t>Rotate Pivot</w:t>
@@ -1864,23 +874,21 @@
         <w:tc>
           <w:tcPr>
             <w:tcW w:type="dxa" w:w="3175"/>
+            <w:vAlign w:val="top"/>
             <w:tcBorders>
-              <w:top w:val="single" w:sz="4" w:space="0" w:color="CCCCCC"/>
-              <w:left w:val="single" w:sz="4" w:space="0" w:color="CCCCCC"/>
-              <w:bottom w:val="single" w:sz="4" w:space="0" w:color="CCCCCC"/>
-              <w:right w:val="single" w:sz="4" w:space="0" w:color="CCCCCC"/>
+              <w:bottom w:val="single" w:sz="4" w:space="4" w:color="E0E0E0"/>
             </w:tcBorders>
-            <w:vAlign w:val="top"/>
           </w:tcPr>
           <w:p>
             <w:pPr>
+              <w:keepNext/>
               <w:spacing w:before="40" w:after="40" w:line="264" w:lineRule="auto"/>
             </w:pPr>
             <w:r>
               <w:rPr>
                 <w:rFonts w:ascii="Arial" w:hAnsi="Arial"/>
                 <w:b w:val="0"/>
-                <w:i w:val="0"/>
+                <w:color w:val="1A1A1A"/>
                 <w:sz w:val="18"/>
               </w:rPr>
               <w:t>Ctrl+Alt+D (объектный режим)</w:t>
@@ -1890,23 +898,21 @@
         <w:tc>
           <w:tcPr>
             <w:tcW w:type="dxa" w:w="2494"/>
+            <w:vAlign w:val="top"/>
             <w:tcBorders>
-              <w:top w:val="single" w:sz="4" w:space="0" w:color="CCCCCC"/>
-              <w:left w:val="single" w:sz="4" w:space="0" w:color="CCCCCC"/>
-              <w:bottom w:val="single" w:sz="4" w:space="0" w:color="CCCCCC"/>
-              <w:right w:val="single" w:sz="4" w:space="0" w:color="CCCCCC"/>
+              <w:bottom w:val="single" w:sz="4" w:space="4" w:color="E0E0E0"/>
             </w:tcBorders>
-            <w:vAlign w:val="top"/>
           </w:tcPr>
           <w:p>
             <w:pPr>
+              <w:keepNext/>
               <w:spacing w:before="40" w:after="40" w:line="264" w:lineRule="auto"/>
             </w:pPr>
             <w:r>
               <w:rPr>
                 <w:rFonts w:ascii="Arial" w:hAnsi="Arial"/>
                 <w:b w:val="0"/>
-                <w:i w:val="0"/>
+                <w:color w:val="1A1A1A"/>
                 <w:sz w:val="18"/>
               </w:rPr>
               <w:t>панель, pie-меню</w:t>
@@ -1921,24 +927,21 @@
         <w:tc>
           <w:tcPr>
             <w:tcW w:type="dxa" w:w="2948"/>
+            <w:vAlign w:val="top"/>
             <w:tcBorders>
-              <w:top w:val="single" w:sz="4" w:space="0" w:color="CCCCCC"/>
-              <w:left w:val="single" w:sz="4" w:space="0" w:color="CCCCCC"/>
-              <w:bottom w:val="single" w:sz="4" w:space="0" w:color="CCCCCC"/>
-              <w:right w:val="single" w:sz="4" w:space="0" w:color="CCCCCC"/>
+              <w:bottom w:val="single" w:sz="4" w:space="4" w:color="E0E0E0"/>
             </w:tcBorders>
-            <w:vAlign w:val="top"/>
-            <w:shd w:val="clear" w:color="auto" w:fill="F5F8FB"/>
           </w:tcPr>
           <w:p>
             <w:pPr>
+              <w:keepNext/>
               <w:spacing w:before="40" w:after="40" w:line="264" w:lineRule="auto"/>
             </w:pPr>
             <w:r>
               <w:rPr>
                 <w:rFonts w:ascii="Arial" w:hAnsi="Arial"/>
                 <w:b/>
-                <w:i w:val="0"/>
+                <w:color w:val="1A1A1A"/>
                 <w:sz w:val="18"/>
               </w:rPr>
               <w:t>Align Pivot to Normal</w:t>
@@ -1948,24 +951,21 @@
         <w:tc>
           <w:tcPr>
             <w:tcW w:type="dxa" w:w="3175"/>
+            <w:vAlign w:val="top"/>
             <w:tcBorders>
-              <w:top w:val="single" w:sz="4" w:space="0" w:color="CCCCCC"/>
-              <w:left w:val="single" w:sz="4" w:space="0" w:color="CCCCCC"/>
-              <w:bottom w:val="single" w:sz="4" w:space="0" w:color="CCCCCC"/>
-              <w:right w:val="single" w:sz="4" w:space="0" w:color="CCCCCC"/>
+              <w:bottom w:val="single" w:sz="4" w:space="4" w:color="E0E0E0"/>
             </w:tcBorders>
-            <w:vAlign w:val="top"/>
-            <w:shd w:val="clear" w:color="auto" w:fill="F5F8FB"/>
           </w:tcPr>
           <w:p>
             <w:pPr>
+              <w:keepNext/>
               <w:spacing w:before="40" w:after="40" w:line="264" w:lineRule="auto"/>
             </w:pPr>
             <w:r>
               <w:rPr>
                 <w:rFonts w:ascii="Arial" w:hAnsi="Arial"/>
                 <w:b w:val="0"/>
-                <w:i w:val="0"/>
+                <w:color w:val="1A1A1A"/>
                 <w:sz w:val="18"/>
               </w:rPr>
               <w:t>-</w:t>
@@ -1975,24 +975,21 @@
         <w:tc>
           <w:tcPr>
             <w:tcW w:type="dxa" w:w="2494"/>
+            <w:vAlign w:val="top"/>
             <w:tcBorders>
-              <w:top w:val="single" w:sz="4" w:space="0" w:color="CCCCCC"/>
-              <w:left w:val="single" w:sz="4" w:space="0" w:color="CCCCCC"/>
-              <w:bottom w:val="single" w:sz="4" w:space="0" w:color="CCCCCC"/>
-              <w:right w:val="single" w:sz="4" w:space="0" w:color="CCCCCC"/>
+              <w:bottom w:val="single" w:sz="4" w:space="4" w:color="E0E0E0"/>
             </w:tcBorders>
-            <w:vAlign w:val="top"/>
-            <w:shd w:val="clear" w:color="auto" w:fill="F5F8FB"/>
           </w:tcPr>
           <w:p>
             <w:pPr>
+              <w:keepNext/>
               <w:spacing w:before="40" w:after="40" w:line="264" w:lineRule="auto"/>
             </w:pPr>
             <w:r>
               <w:rPr>
                 <w:rFonts w:ascii="Arial" w:hAnsi="Arial"/>
                 <w:b w:val="0"/>
-                <w:i w:val="0"/>
+                <w:color w:val="1A1A1A"/>
                 <w:sz w:val="18"/>
               </w:rPr>
               <w:t>панель, pie-меню</w:t>
@@ -2007,23 +1004,21 @@
         <w:tc>
           <w:tcPr>
             <w:tcW w:type="dxa" w:w="2948"/>
+            <w:vAlign w:val="top"/>
             <w:tcBorders>
-              <w:top w:val="single" w:sz="4" w:space="0" w:color="CCCCCC"/>
-              <w:left w:val="single" w:sz="4" w:space="0" w:color="CCCCCC"/>
-              <w:bottom w:val="single" w:sz="4" w:space="0" w:color="CCCCCC"/>
-              <w:right w:val="single" w:sz="4" w:space="0" w:color="CCCCCC"/>
+              <w:bottom w:val="single" w:sz="4" w:space="4" w:color="E0E0E0"/>
             </w:tcBorders>
-            <w:vAlign w:val="top"/>
           </w:tcPr>
           <w:p>
             <w:pPr>
+              <w:keepNext/>
               <w:spacing w:before="40" w:after="40" w:line="264" w:lineRule="auto"/>
             </w:pPr>
             <w:r>
               <w:rPr>
                 <w:rFonts w:ascii="Arial" w:hAnsi="Arial"/>
                 <w:b/>
-                <w:i w:val="0"/>
+                <w:color w:val="1A1A1A"/>
                 <w:sz w:val="18"/>
               </w:rPr>
               <w:t>Align Pivot to Edge</w:t>
@@ -2033,23 +1028,21 @@
         <w:tc>
           <w:tcPr>
             <w:tcW w:type="dxa" w:w="3175"/>
+            <w:vAlign w:val="top"/>
             <w:tcBorders>
-              <w:top w:val="single" w:sz="4" w:space="0" w:color="CCCCCC"/>
-              <w:left w:val="single" w:sz="4" w:space="0" w:color="CCCCCC"/>
-              <w:bottom w:val="single" w:sz="4" w:space="0" w:color="CCCCCC"/>
-              <w:right w:val="single" w:sz="4" w:space="0" w:color="CCCCCC"/>
+              <w:bottom w:val="single" w:sz="4" w:space="4" w:color="E0E0E0"/>
             </w:tcBorders>
-            <w:vAlign w:val="top"/>
           </w:tcPr>
           <w:p>
             <w:pPr>
+              <w:keepNext/>
               <w:spacing w:before="40" w:after="40" w:line="264" w:lineRule="auto"/>
             </w:pPr>
             <w:r>
               <w:rPr>
                 <w:rFonts w:ascii="Arial" w:hAnsi="Arial"/>
                 <w:b w:val="0"/>
-                <w:i w:val="0"/>
+                <w:color w:val="1A1A1A"/>
                 <w:sz w:val="18"/>
               </w:rPr>
               <w:t>-</w:t>
@@ -2059,23 +1052,21 @@
         <w:tc>
           <w:tcPr>
             <w:tcW w:type="dxa" w:w="2494"/>
+            <w:vAlign w:val="top"/>
             <w:tcBorders>
-              <w:top w:val="single" w:sz="4" w:space="0" w:color="CCCCCC"/>
-              <w:left w:val="single" w:sz="4" w:space="0" w:color="CCCCCC"/>
-              <w:bottom w:val="single" w:sz="4" w:space="0" w:color="CCCCCC"/>
-              <w:right w:val="single" w:sz="4" w:space="0" w:color="CCCCCC"/>
+              <w:bottom w:val="single" w:sz="4" w:space="4" w:color="E0E0E0"/>
             </w:tcBorders>
-            <w:vAlign w:val="top"/>
           </w:tcPr>
           <w:p>
             <w:pPr>
+              <w:keepNext/>
               <w:spacing w:before="40" w:after="40" w:line="264" w:lineRule="auto"/>
             </w:pPr>
             <w:r>
               <w:rPr>
                 <w:rFonts w:ascii="Arial" w:hAnsi="Arial"/>
                 <w:b w:val="0"/>
-                <w:i w:val="0"/>
+                <w:color w:val="1A1A1A"/>
                 <w:sz w:val="18"/>
               </w:rPr>
               <w:t>панель, pie-меню</w:t>
@@ -2090,14 +1081,10 @@
         <w:tc>
           <w:tcPr>
             <w:tcW w:type="dxa" w:w="2948"/>
+            <w:vAlign w:val="top"/>
             <w:tcBorders>
-              <w:top w:val="single" w:sz="4" w:space="0" w:color="CCCCCC"/>
-              <w:left w:val="single" w:sz="4" w:space="0" w:color="CCCCCC"/>
-              <w:bottom w:val="single" w:sz="4" w:space="0" w:color="CCCCCC"/>
-              <w:right w:val="single" w:sz="4" w:space="0" w:color="CCCCCC"/>
+              <w:bottom w:val="single" w:sz="8" w:space="4" w:color="000000"/>
             </w:tcBorders>
-            <w:vAlign w:val="top"/>
-            <w:shd w:val="clear" w:color="auto" w:fill="F5F8FB"/>
           </w:tcPr>
           <w:p>
             <w:pPr>
@@ -2107,7 +1094,7 @@
               <w:rPr>
                 <w:rFonts w:ascii="Arial" w:hAnsi="Arial"/>
                 <w:b/>
-                <w:i w:val="0"/>
+                <w:color w:val="1A1A1A"/>
                 <w:sz w:val="18"/>
               </w:rPr>
               <w:t>Pivot Audit</w:t>
@@ -2117,14 +1104,10 @@
         <w:tc>
           <w:tcPr>
             <w:tcW w:type="dxa" w:w="3175"/>
+            <w:vAlign w:val="top"/>
             <w:tcBorders>
-              <w:top w:val="single" w:sz="4" w:space="0" w:color="CCCCCC"/>
-              <w:left w:val="single" w:sz="4" w:space="0" w:color="CCCCCC"/>
-              <w:bottom w:val="single" w:sz="4" w:space="0" w:color="CCCCCC"/>
-              <w:right w:val="single" w:sz="4" w:space="0" w:color="CCCCCC"/>
+              <w:bottom w:val="single" w:sz="8" w:space="4" w:color="000000"/>
             </w:tcBorders>
-            <w:vAlign w:val="top"/>
-            <w:shd w:val="clear" w:color="auto" w:fill="F5F8FB"/>
           </w:tcPr>
           <w:p>
             <w:pPr>
@@ -2134,7 +1117,7 @@
               <w:rPr>
                 <w:rFonts w:ascii="Arial" w:hAnsi="Arial"/>
                 <w:b w:val="0"/>
-                <w:i w:val="0"/>
+                <w:color w:val="1A1A1A"/>
                 <w:sz w:val="18"/>
               </w:rPr>
               <w:t>-</w:t>
@@ -2144,14 +1127,10 @@
         <w:tc>
           <w:tcPr>
             <w:tcW w:type="dxa" w:w="2494"/>
+            <w:vAlign w:val="top"/>
             <w:tcBorders>
-              <w:top w:val="single" w:sz="4" w:space="0" w:color="CCCCCC"/>
-              <w:left w:val="single" w:sz="4" w:space="0" w:color="CCCCCC"/>
-              <w:bottom w:val="single" w:sz="4" w:space="0" w:color="CCCCCC"/>
-              <w:right w:val="single" w:sz="4" w:space="0" w:color="CCCCCC"/>
+              <w:bottom w:val="single" w:sz="8" w:space="4" w:color="000000"/>
             </w:tcBorders>
-            <w:vAlign w:val="top"/>
-            <w:shd w:val="clear" w:color="auto" w:fill="F5F8FB"/>
           </w:tcPr>
           <w:p>
             <w:pPr>
@@ -2161,7 +1140,7 @@
               <w:rPr>
                 <w:rFonts w:ascii="Arial" w:hAnsi="Arial"/>
                 <w:b w:val="0"/>
-                <w:i w:val="0"/>
+                <w:color w:val="1A1A1A"/>
                 <w:sz w:val="18"/>
               </w:rPr>
               <w:t>панель</w:t>
@@ -2172,7 +1151,7 @@
     </w:tbl>
     <w:p>
       <w:pPr>
-        <w:spacing w:after="80" w:before="0" w:line="240" w:lineRule="auto"/>
+        <w:spacing w:after="80" w:line="240" w:lineRule="auto"/>
       </w:pPr>
     </w:p>
     <w:p>
@@ -2180,6 +1159,7 @@
         <w:rPr>
           <w:rFonts w:ascii="Arial" w:hAnsi="Arial"/>
           <w:i w:val="0"/>
+          <w:color w:val="1A1A1A"/>
           <w:sz w:val="19"/>
         </w:rPr>
         <w:t>Pie-меню со всеми операторами открывается кнопкой в N-панели.</w:t>
@@ -2188,10 +1168,29 @@
     <w:p>
       <w:pPr>
         <w:pStyle w:val="Heading1"/>
+        <w:pBdr>
+          <w:left w:val="single" w:sz="24" w:space="8" w:color="C82823"/>
+        </w:pBdr>
       </w:pPr>
       <w:bookmarkStart w:id="100005" w:name="_Toc100005"/>
       <w:r>
-        <w:t>2. Установка</w:t>
+        <w:rPr>
+          <w:rFonts w:ascii="Century Gothic" w:hAnsi="Century Gothic"/>
+          <w:b/>
+          <w:color w:val="000000"/>
+          <w:sz w:val="30"/>
+        </w:rPr>
+        <w:t xml:space="preserve">2. </w:t>
+      </w:r>
+      <w:r>
+        <w:rPr>
+          <w:rFonts w:ascii="Century Gothic" w:hAnsi="Century Gothic"/>
+          <w:b/>
+          <w:color w:val="000000"/>
+          <w:sz w:val="30"/>
+          <w:spacing w:val="20"/>
+        </w:rPr>
+        <w:t>УСТАНОВКА</w:t>
       </w:r>
       <w:bookmarkEnd w:id="100005"/>
     </w:p>
@@ -2203,6 +1202,7 @@
         <w:rPr>
           <w:rFonts w:ascii="Arial" w:hAnsi="Arial"/>
           <w:i w:val="0"/>
+          <w:color w:val="1A1A1A"/>
           <w:sz w:val="19"/>
         </w:rPr>
         <w:t>Скачайте zip последнего релиза: github.com/abyrvalg379/tochka → Releases → Latest → ассет tochka_v*.zip.</w:t>
@@ -2216,6 +1216,7 @@
         <w:rPr>
           <w:rFonts w:ascii="Arial" w:hAnsi="Arial"/>
           <w:i w:val="0"/>
+          <w:color w:val="1A1A1A"/>
           <w:sz w:val="19"/>
         </w:rPr>
         <w:t>Blender → Edit → Preferences → Get Extensions → ⚙ → Install from Disk → выберите zip. Так же возможна установка через drag-and-drop.</w:t>
@@ -2229,6 +1230,7 @@
         <w:rPr>
           <w:rFonts w:ascii="Arial" w:hAnsi="Arial"/>
           <w:i w:val="0"/>
+          <w:color w:val="1A1A1A"/>
           <w:sz w:val="19"/>
         </w:rPr>
         <w:t>Расширение включится само как TOCHKA; вкладка появится в N-панели 3D-вьюпорта (клавиша N). Версия показана прямо в заголовке панели.</w:t>
@@ -2242,6 +1244,7 @@
         <w:rPr>
           <w:rFonts w:ascii="Arial" w:hAnsi="Arial"/>
           <w:i w:val="0"/>
+          <w:color w:val="1A1A1A"/>
           <w:sz w:val="19"/>
         </w:rPr>
         <w:t>Обновление: установите новый zip тем же способом поверх старой версии.</w:t>
@@ -2252,6 +1255,7 @@
         <w:rPr>
           <w:rFonts w:ascii="Arial" w:hAnsi="Arial"/>
           <w:i w:val="0"/>
+          <w:color w:val="1A1A1A"/>
           <w:sz w:val="19"/>
         </w:rPr>
         <w:t>Протестировано в Blender 5.2. При каждом включении TOCHKA проверяет системную раскладку (keymap Object Mode и Mesh): если трансформ-бинды повреждены - кем бы то ни было - они восстанавливаются из заводских, в консоль печатается «TOCHKA: repaired damaged ... keymap». После такого ремонта нажмите Preferences → ☰ → Save Preferences, чтобы чистая раскладка зафиксировалась на диске.</w:t>
@@ -2260,10 +1264,29 @@
     <w:p>
       <w:pPr>
         <w:pStyle w:val="Heading1"/>
+        <w:pBdr>
+          <w:left w:val="single" w:sz="24" w:space="8" w:color="C82823"/>
+        </w:pBdr>
       </w:pPr>
       <w:bookmarkStart w:id="100006" w:name="_Toc100006"/>
       <w:r>
-        <w:t>3. Быстрый старт</w:t>
+        <w:rPr>
+          <w:rFonts w:ascii="Century Gothic" w:hAnsi="Century Gothic"/>
+          <w:b/>
+          <w:color w:val="000000"/>
+          <w:sz w:val="30"/>
+        </w:rPr>
+        <w:t xml:space="preserve">3. </w:t>
+      </w:r>
+      <w:r>
+        <w:rPr>
+          <w:rFonts w:ascii="Century Gothic" w:hAnsi="Century Gothic"/>
+          <w:b/>
+          <w:color w:val="000000"/>
+          <w:sz w:val="30"/>
+          <w:spacing w:val="20"/>
+        </w:rPr>
+        <w:t>БЫСТРЫЙ СТАРТ</w:t>
       </w:r>
       <w:bookmarkEnd w:id="100006"/>
     </w:p>
@@ -2272,6 +1295,7 @@
         <w:rPr>
           <w:rFonts w:ascii="Arial" w:hAnsi="Arial"/>
           <w:i w:val="0"/>
+          <w:color w:val="1A1A1A"/>
           <w:sz w:val="19"/>
         </w:rPr>
         <w:t>Типовой прогон - поставить пивот колесу на ось вращения:</w:t>
@@ -2285,6 +1309,7 @@
         <w:rPr>
           <w:rFonts w:ascii="Arial" w:hAnsi="Arial"/>
           <w:i w:val="0"/>
+          <w:color w:val="1A1A1A"/>
           <w:sz w:val="19"/>
         </w:rPr>
         <w:t>Зайдите в режим редактирования колеса, выделите грань на ступице и нажмите D - пивот встанет в центр выделения (Median). Нужно ниже - DD поставит Bottom, ещё одно - DDD, Top.</w:t>
@@ -2298,6 +1323,7 @@
         <w:rPr>
           <w:rFonts w:ascii="Arial" w:hAnsi="Arial"/>
           <w:i w:val="0"/>
+          <w:color w:val="1A1A1A"/>
           <w:sz w:val="19"/>
         </w:rPr>
         <w:t>Нажмите Align Pivot to Edge на панели и ведите курсором по ободу - ось X пивота ложится вдоль ребра; поймали ось колеса - ЛКМ.</w:t>
@@ -2311,6 +1337,7 @@
         <w:rPr>
           <w:rFonts w:ascii="Arial" w:hAnsi="Arial"/>
           <w:i w:val="0"/>
+          <w:color w:val="1A1A1A"/>
           <w:sz w:val="19"/>
         </w:rPr>
         <w:t>Дообработайте наклон, если нужно: Ctrl+Alt+D и поверните ориентацию мышью, Ctrl - шаги по 5 градусам, Shift - тонко.</w:t>
@@ -2324,6 +1351,7 @@
         <w:rPr>
           <w:rFonts w:ascii="Arial" w:hAnsi="Arial"/>
           <w:i w:val="0"/>
+          <w:color w:val="1A1A1A"/>
           <w:sz w:val="19"/>
         </w:rPr>
         <w:t>Позицию подправьте Ctrl+D: пивот скользит по поверхности, Ctrl прижимает к ближайшей вершине, X/Y/Z держат ось.</w:t>
@@ -2337,6 +1365,7 @@
         <w:rPr>
           <w:rFonts w:ascii="Arial" w:hAnsi="Arial"/>
           <w:i w:val="0"/>
+          <w:color w:val="1A1A1A"/>
           <w:sz w:val="19"/>
         </w:rPr>
         <w:t>Перед сдачей прогоните Pivot Audit по конвенции проекта - нарушители покажутся списком, Fix All Flagged исправит пакетно.</w:t>
@@ -2345,10 +1374,29 @@
     <w:p>
       <w:pPr>
         <w:pStyle w:val="Heading1"/>
+        <w:pBdr>
+          <w:left w:val="single" w:sz="24" w:space="8" w:color="C82823"/>
+        </w:pBdr>
       </w:pPr>
       <w:bookmarkStart w:id="100007" w:name="_Toc100007"/>
       <w:r>
-        <w:t>4. Origin to Selection (D)</w:t>
+        <w:rPr>
+          <w:rFonts w:ascii="Century Gothic" w:hAnsi="Century Gothic"/>
+          <w:b/>
+          <w:color w:val="000000"/>
+          <w:sz w:val="30"/>
+        </w:rPr>
+        <w:t xml:space="preserve">4. </w:t>
+      </w:r>
+      <w:r>
+        <w:rPr>
+          <w:rFonts w:ascii="Century Gothic" w:hAnsi="Century Gothic"/>
+          <w:b/>
+          <w:color w:val="000000"/>
+          <w:sz w:val="30"/>
+          <w:spacing w:val="20"/>
+        </w:rPr>
+        <w:t>ORIGIN TO SELECTION (D)</w:t>
       </w:r>
       <w:bookmarkEnd w:id="100007"/>
     </w:p>
@@ -2367,6 +1415,7 @@
         <w:rPr>
           <w:rFonts w:ascii="Arial" w:hAnsi="Arial"/>
           <w:i w:val="0"/>
+          <w:color w:val="1A1A1A"/>
           <w:sz w:val="19"/>
         </w:rPr>
         <w:t>Выделите что-нибудь и нажмите D - пивот объекта переедет в центр выделения. В режиме редактирования считается центр выделенных вершин/рёбер/граней; в объектном режиме - центр выделенных объектов, причём каждый выделенный объект получает свой пивот по своему выделению. Геометрия при переносе пивота не искажается: вершины переводятся честно, с компенсацией смещения объекта.</w:t>
@@ -2384,7 +1433,6 @@
     </w:p>
     <w:tbl>
       <w:tblPr>
-        <w:tblStyle w:val="TableGrid"/>
         <w:tblW w:type="auto" w:w="0"/>
         <w:tblLayout w:type="fixed"/>
         <w:tblLook w:firstColumn="1" w:firstRow="1" w:lastColumn="0" w:lastRow="0" w:noHBand="0" w:noVBand="1" w:val="04A0"/>
@@ -2396,96 +1444,86 @@
         </w:tblCellMar>
       </w:tblPr>
       <w:tblGrid>
-        <w:gridCol w:w="3120"/>
-        <w:gridCol w:w="3120"/>
-        <w:gridCol w:w="3120"/>
+        <w:gridCol w:w="3137"/>
+        <w:gridCol w:w="3137"/>
+        <w:gridCol w:w="3137"/>
       </w:tblGrid>
       <w:tr>
         <w:trPr>
           <w:cantSplit/>
-          <w:tblHeader/>
         </w:trPr>
         <w:tc>
           <w:tcPr>
             <w:tcW w:type="dxa" w:w="2494"/>
+            <w:vAlign w:val="top"/>
             <w:tcBorders>
-              <w:top w:val="single" w:sz="4" w:space="0" w:color="CCCCCC"/>
-              <w:left w:val="single" w:sz="4" w:space="0" w:color="CCCCCC"/>
-              <w:bottom w:val="single" w:sz="4" w:space="0" w:color="CCCCCC"/>
-              <w:right w:val="single" w:sz="4" w:space="0" w:color="CCCCCC"/>
+              <w:bottom w:val="single" w:sz="12" w:space="4" w:color="C82823"/>
             </w:tcBorders>
-            <w:vAlign w:val="top"/>
-            <w:shd w:val="clear" w:color="auto" w:fill="2E75B5"/>
           </w:tcPr>
           <w:p>
             <w:pPr>
+              <w:keepNext/>
               <w:spacing w:before="40" w:after="40" w:line="264" w:lineRule="auto"/>
             </w:pPr>
             <w:r>
               <w:rPr>
-                <w:rFonts w:ascii="Arial" w:hAnsi="Arial"/>
+                <w:rFonts w:ascii="Century Gothic" w:hAnsi="Century Gothic"/>
                 <w:b/>
-                <w:i w:val="0"/>
-                <w:color w:val="FFFFFF"/>
-                <w:sz w:val="18"/>
+                <w:color w:val="000000"/>
+                <w:sz w:val="17"/>
+                <w:spacing w:val="20"/>
               </w:rPr>
-              <w:t>Нажатие</w:t>
+              <w:t>НАЖАТИЕ</w:t>
             </w:r>
           </w:p>
         </w:tc>
         <w:tc>
           <w:tcPr>
             <w:tcW w:type="dxa" w:w="1701"/>
+            <w:vAlign w:val="top"/>
             <w:tcBorders>
-              <w:top w:val="single" w:sz="4" w:space="0" w:color="CCCCCC"/>
-              <w:left w:val="single" w:sz="4" w:space="0" w:color="CCCCCC"/>
-              <w:bottom w:val="single" w:sz="4" w:space="0" w:color="CCCCCC"/>
-              <w:right w:val="single" w:sz="4" w:space="0" w:color="CCCCCC"/>
+              <w:bottom w:val="single" w:sz="12" w:space="4" w:color="C82823"/>
             </w:tcBorders>
-            <w:vAlign w:val="top"/>
-            <w:shd w:val="clear" w:color="auto" w:fill="2E75B5"/>
           </w:tcPr>
           <w:p>
             <w:pPr>
+              <w:keepNext/>
               <w:spacing w:before="40" w:after="40" w:line="264" w:lineRule="auto"/>
             </w:pPr>
             <w:r>
               <w:rPr>
-                <w:rFonts w:ascii="Arial" w:hAnsi="Arial"/>
+                <w:rFonts w:ascii="Century Gothic" w:hAnsi="Century Gothic"/>
                 <w:b/>
-                <w:i w:val="0"/>
-                <w:color w:val="FFFFFF"/>
-                <w:sz w:val="18"/>
+                <w:color w:val="000000"/>
+                <w:sz w:val="17"/>
+                <w:spacing w:val="20"/>
               </w:rPr>
-              <w:t>Якорь</w:t>
+              <w:t>ЯКОРЬ</w:t>
             </w:r>
           </w:p>
         </w:tc>
         <w:tc>
           <w:tcPr>
             <w:tcW w:type="dxa" w:w="5443"/>
+            <w:vAlign w:val="top"/>
             <w:tcBorders>
-              <w:top w:val="single" w:sz="4" w:space="0" w:color="CCCCCC"/>
-              <w:left w:val="single" w:sz="4" w:space="0" w:color="CCCCCC"/>
-              <w:bottom w:val="single" w:sz="4" w:space="0" w:color="CCCCCC"/>
-              <w:right w:val="single" w:sz="4" w:space="0" w:color="CCCCCC"/>
+              <w:bottom w:val="single" w:sz="12" w:space="4" w:color="C82823"/>
             </w:tcBorders>
-            <w:vAlign w:val="top"/>
-            <w:shd w:val="clear" w:color="auto" w:fill="2E75B5"/>
           </w:tcPr>
           <w:p>
             <w:pPr>
+              <w:keepNext/>
               <w:spacing w:before="40" w:after="40" w:line="264" w:lineRule="auto"/>
             </w:pPr>
             <w:r>
               <w:rPr>
-                <w:rFonts w:ascii="Arial" w:hAnsi="Arial"/>
+                <w:rFonts w:ascii="Century Gothic" w:hAnsi="Century Gothic"/>
                 <w:b/>
-                <w:i w:val="0"/>
-                <w:color w:val="FFFFFF"/>
-                <w:sz w:val="18"/>
+                <w:color w:val="000000"/>
+                <w:sz w:val="17"/>
+                <w:spacing w:val="20"/>
               </w:rPr>
-              <w:t>Куда ставится пивот</w:t>
+              <w:t>КУДА СТАВИТСЯ ПИВОТ</w:t>
             </w:r>
           </w:p>
         </w:tc>
@@ -2497,23 +1535,21 @@
         <w:tc>
           <w:tcPr>
             <w:tcW w:type="dxa" w:w="2494"/>
+            <w:vAlign w:val="top"/>
             <w:tcBorders>
-              <w:top w:val="single" w:sz="4" w:space="0" w:color="CCCCCC"/>
-              <w:left w:val="single" w:sz="4" w:space="0" w:color="CCCCCC"/>
-              <w:bottom w:val="single" w:sz="4" w:space="0" w:color="CCCCCC"/>
-              <w:right w:val="single" w:sz="4" w:space="0" w:color="CCCCCC"/>
+              <w:bottom w:val="single" w:sz="4" w:space="4" w:color="E0E0E0"/>
             </w:tcBorders>
-            <w:vAlign w:val="top"/>
           </w:tcPr>
           <w:p>
             <w:pPr>
+              <w:keepNext/>
               <w:spacing w:before="40" w:after="40" w:line="264" w:lineRule="auto"/>
             </w:pPr>
             <w:r>
               <w:rPr>
                 <w:rFonts w:ascii="Arial" w:hAnsi="Arial"/>
                 <w:b/>
-                <w:i w:val="0"/>
+                <w:color w:val="1A1A1A"/>
                 <w:sz w:val="18"/>
               </w:rPr>
               <w:t>D</w:t>
@@ -2523,23 +1559,21 @@
         <w:tc>
           <w:tcPr>
             <w:tcW w:type="dxa" w:w="1701"/>
+            <w:vAlign w:val="top"/>
             <w:tcBorders>
-              <w:top w:val="single" w:sz="4" w:space="0" w:color="CCCCCC"/>
-              <w:left w:val="single" w:sz="4" w:space="0" w:color="CCCCCC"/>
-              <w:bottom w:val="single" w:sz="4" w:space="0" w:color="CCCCCC"/>
-              <w:right w:val="single" w:sz="4" w:space="0" w:color="CCCCCC"/>
+              <w:bottom w:val="single" w:sz="4" w:space="4" w:color="E0E0E0"/>
             </w:tcBorders>
-            <w:vAlign w:val="top"/>
           </w:tcPr>
           <w:p>
             <w:pPr>
+              <w:keepNext/>
               <w:spacing w:before="40" w:after="40" w:line="264" w:lineRule="auto"/>
             </w:pPr>
             <w:r>
               <w:rPr>
                 <w:rFonts w:ascii="Arial" w:hAnsi="Arial"/>
                 <w:b w:val="0"/>
-                <w:i w:val="0"/>
+                <w:color w:val="1A1A1A"/>
                 <w:sz w:val="18"/>
               </w:rPr>
               <w:t>Median</w:t>
@@ -2549,23 +1583,21 @@
         <w:tc>
           <w:tcPr>
             <w:tcW w:type="dxa" w:w="5443"/>
+            <w:vAlign w:val="top"/>
             <w:tcBorders>
-              <w:top w:val="single" w:sz="4" w:space="0" w:color="CCCCCC"/>
-              <w:left w:val="single" w:sz="4" w:space="0" w:color="CCCCCC"/>
-              <w:bottom w:val="single" w:sz="4" w:space="0" w:color="CCCCCC"/>
-              <w:right w:val="single" w:sz="4" w:space="0" w:color="CCCCCC"/>
+              <w:bottom w:val="single" w:sz="4" w:space="4" w:color="E0E0E0"/>
             </w:tcBorders>
-            <w:vAlign w:val="top"/>
           </w:tcPr>
           <w:p>
             <w:pPr>
+              <w:keepNext/>
               <w:spacing w:before="40" w:after="40" w:line="264" w:lineRule="auto"/>
             </w:pPr>
             <w:r>
               <w:rPr>
                 <w:rFonts w:ascii="Arial" w:hAnsi="Arial"/>
                 <w:b w:val="0"/>
-                <w:i w:val="0"/>
+                <w:color w:val="1A1A1A"/>
                 <w:sz w:val="18"/>
               </w:rPr>
               <w:t>центр выделения</w:t>
@@ -2580,24 +1612,21 @@
         <w:tc>
           <w:tcPr>
             <w:tcW w:type="dxa" w:w="2494"/>
+            <w:vAlign w:val="top"/>
             <w:tcBorders>
-              <w:top w:val="single" w:sz="4" w:space="0" w:color="CCCCCC"/>
-              <w:left w:val="single" w:sz="4" w:space="0" w:color="CCCCCC"/>
-              <w:bottom w:val="single" w:sz="4" w:space="0" w:color="CCCCCC"/>
-              <w:right w:val="single" w:sz="4" w:space="0" w:color="CCCCCC"/>
+              <w:bottom w:val="single" w:sz="4" w:space="4" w:color="E0E0E0"/>
             </w:tcBorders>
-            <w:vAlign w:val="top"/>
-            <w:shd w:val="clear" w:color="auto" w:fill="F5F8FB"/>
           </w:tcPr>
           <w:p>
             <w:pPr>
+              <w:keepNext/>
               <w:spacing w:before="40" w:after="40" w:line="264" w:lineRule="auto"/>
             </w:pPr>
             <w:r>
               <w:rPr>
                 <w:rFonts w:ascii="Arial" w:hAnsi="Arial"/>
                 <w:b/>
-                <w:i w:val="0"/>
+                <w:color w:val="1A1A1A"/>
                 <w:sz w:val="18"/>
               </w:rPr>
               <w:t>DD (быстро, подряд)</w:t>
@@ -2607,24 +1636,21 @@
         <w:tc>
           <w:tcPr>
             <w:tcW w:type="dxa" w:w="1701"/>
+            <w:vAlign w:val="top"/>
             <w:tcBorders>
-              <w:top w:val="single" w:sz="4" w:space="0" w:color="CCCCCC"/>
-              <w:left w:val="single" w:sz="4" w:space="0" w:color="CCCCCC"/>
-              <w:bottom w:val="single" w:sz="4" w:space="0" w:color="CCCCCC"/>
-              <w:right w:val="single" w:sz="4" w:space="0" w:color="CCCCCC"/>
+              <w:bottom w:val="single" w:sz="4" w:space="4" w:color="E0E0E0"/>
             </w:tcBorders>
-            <w:vAlign w:val="top"/>
-            <w:shd w:val="clear" w:color="auto" w:fill="F5F8FB"/>
           </w:tcPr>
           <w:p>
             <w:pPr>
+              <w:keepNext/>
               <w:spacing w:before="40" w:after="40" w:line="264" w:lineRule="auto"/>
             </w:pPr>
             <w:r>
               <w:rPr>
                 <w:rFonts w:ascii="Arial" w:hAnsi="Arial"/>
                 <w:b w:val="0"/>
-                <w:i w:val="0"/>
+                <w:color w:val="1A1A1A"/>
                 <w:sz w:val="18"/>
               </w:rPr>
               <w:t>Bottom</w:t>
@@ -2634,24 +1660,21 @@
         <w:tc>
           <w:tcPr>
             <w:tcW w:type="dxa" w:w="5443"/>
+            <w:vAlign w:val="top"/>
             <w:tcBorders>
-              <w:top w:val="single" w:sz="4" w:space="0" w:color="CCCCCC"/>
-              <w:left w:val="single" w:sz="4" w:space="0" w:color="CCCCCC"/>
-              <w:bottom w:val="single" w:sz="4" w:space="0" w:color="CCCCCC"/>
-              <w:right w:val="single" w:sz="4" w:space="0" w:color="CCCCCC"/>
+              <w:bottom w:val="single" w:sz="4" w:space="4" w:color="E0E0E0"/>
             </w:tcBorders>
-            <w:vAlign w:val="top"/>
-            <w:shd w:val="clear" w:color="auto" w:fill="F5F8FB"/>
           </w:tcPr>
           <w:p>
             <w:pPr>
+              <w:keepNext/>
               <w:spacing w:before="40" w:after="40" w:line="264" w:lineRule="auto"/>
             </w:pPr>
             <w:r>
               <w:rPr>
                 <w:rFonts w:ascii="Arial" w:hAnsi="Arial"/>
                 <w:b w:val="0"/>
-                <w:i w:val="0"/>
+                <w:color w:val="1A1A1A"/>
                 <w:sz w:val="18"/>
               </w:rPr>
               <w:t>XY-медиана выделения, по высоте - нижняя точка</w:t>
@@ -2666,13 +1689,10 @@
         <w:tc>
           <w:tcPr>
             <w:tcW w:type="dxa" w:w="2494"/>
+            <w:vAlign w:val="top"/>
             <w:tcBorders>
-              <w:top w:val="single" w:sz="4" w:space="0" w:color="CCCCCC"/>
-              <w:left w:val="single" w:sz="4" w:space="0" w:color="CCCCCC"/>
-              <w:bottom w:val="single" w:sz="4" w:space="0" w:color="CCCCCC"/>
-              <w:right w:val="single" w:sz="4" w:space="0" w:color="CCCCCC"/>
+              <w:bottom w:val="single" w:sz="8" w:space="4" w:color="000000"/>
             </w:tcBorders>
-            <w:vAlign w:val="top"/>
           </w:tcPr>
           <w:p>
             <w:pPr>
@@ -2682,7 +1702,7 @@
               <w:rPr>
                 <w:rFonts w:ascii="Arial" w:hAnsi="Arial"/>
                 <w:b/>
-                <w:i w:val="0"/>
+                <w:color w:val="1A1A1A"/>
                 <w:sz w:val="18"/>
               </w:rPr>
               <w:t>DDD (быстро, подряд)</w:t>
@@ -2692,13 +1712,10 @@
         <w:tc>
           <w:tcPr>
             <w:tcW w:type="dxa" w:w="1701"/>
+            <w:vAlign w:val="top"/>
             <w:tcBorders>
-              <w:top w:val="single" w:sz="4" w:space="0" w:color="CCCCCC"/>
-              <w:left w:val="single" w:sz="4" w:space="0" w:color="CCCCCC"/>
-              <w:bottom w:val="single" w:sz="4" w:space="0" w:color="CCCCCC"/>
-              <w:right w:val="single" w:sz="4" w:space="0" w:color="CCCCCC"/>
+              <w:bottom w:val="single" w:sz="8" w:space="4" w:color="000000"/>
             </w:tcBorders>
-            <w:vAlign w:val="top"/>
           </w:tcPr>
           <w:p>
             <w:pPr>
@@ -2708,7 +1725,7 @@
               <w:rPr>
                 <w:rFonts w:ascii="Arial" w:hAnsi="Arial"/>
                 <w:b w:val="0"/>
-                <w:i w:val="0"/>
+                <w:color w:val="1A1A1A"/>
                 <w:sz w:val="18"/>
               </w:rPr>
               <w:t>Top</w:t>
@@ -2718,13 +1735,10 @@
         <w:tc>
           <w:tcPr>
             <w:tcW w:type="dxa" w:w="5443"/>
+            <w:vAlign w:val="top"/>
             <w:tcBorders>
-              <w:top w:val="single" w:sz="4" w:space="0" w:color="CCCCCC"/>
-              <w:left w:val="single" w:sz="4" w:space="0" w:color="CCCCCC"/>
-              <w:bottom w:val="single" w:sz="4" w:space="0" w:color="CCCCCC"/>
-              <w:right w:val="single" w:sz="4" w:space="0" w:color="CCCCCC"/>
+              <w:bottom w:val="single" w:sz="8" w:space="4" w:color="000000"/>
             </w:tcBorders>
-            <w:vAlign w:val="top"/>
           </w:tcPr>
           <w:p>
             <w:pPr>
@@ -2734,7 +1748,7 @@
               <w:rPr>
                 <w:rFonts w:ascii="Arial" w:hAnsi="Arial"/>
                 <w:b w:val="0"/>
-                <w:i w:val="0"/>
+                <w:color w:val="1A1A1A"/>
                 <w:sz w:val="18"/>
               </w:rPr>
               <w:t>XY-медиана выделения, по высоте - верхняя точка</w:t>
@@ -2745,7 +1759,7 @@
     </w:tbl>
     <w:p>
       <w:pPr>
-        <w:spacing w:after="80" w:before="0" w:line="240" w:lineRule="auto"/>
+        <w:spacing w:after="80" w:line="240" w:lineRule="auto"/>
       </w:pPr>
     </w:p>
     <w:p>
@@ -2753,6 +1767,7 @@
         <w:rPr>
           <w:rFonts w:ascii="Arial" w:hAnsi="Arial"/>
           <w:i w:val="0"/>
+          <w:color w:val="1A1A1A"/>
           <w:sz w:val="19"/>
         </w:rPr>
         <w:t>Четвёртое нажатие подряд (DDDD) возвращает Median, и цикл начинается заново - якорь ходит по кругу, сколько раз нужно.</w:t>
@@ -2773,6 +1788,7 @@
         <w:rPr>
           <w:rFonts w:ascii="Arial" w:hAnsi="Arial"/>
           <w:i w:val="0"/>
+          <w:color w:val="1A1A1A"/>
           <w:sz w:val="19"/>
         </w:rPr>
         <w:t>Нажатия должны идти подряд, в пределах 0,35 секунды одно за другим - это и есть «DD». Если сделать паузу дольше, очередное D - уже не следующий якорь, а повторное применение последнего выбранного. Так же в цикле участвует якорь, выбранный кнопками на панели: после него очередное DD шагнёт от него к следующему.</w:t>
@@ -2793,6 +1809,7 @@
         <w:rPr>
           <w:rFonts w:ascii="Arial" w:hAnsi="Arial"/>
           <w:i w:val="0"/>
+          <w:color w:val="1A1A1A"/>
           <w:sz w:val="19"/>
         </w:rPr>
         <w:t>Операция коммитится одним шагом истории: один Ctrl+Z возвращает и пивот, и вершины. После undo сцена сразу отображается корректно - без «улетевших» объектов и повторных откатов.</w:t>
@@ -2801,10 +1818,29 @@
     <w:p>
       <w:pPr>
         <w:pStyle w:val="Heading1"/>
+        <w:pBdr>
+          <w:left w:val="single" w:sz="24" w:space="8" w:color="C82823"/>
+        </w:pBdr>
       </w:pPr>
       <w:bookmarkStart w:id="100012" w:name="_Toc100012"/>
       <w:r>
-        <w:t>5. Drag Pivot (Ctrl+D)</w:t>
+        <w:rPr>
+          <w:rFonts w:ascii="Century Gothic" w:hAnsi="Century Gothic"/>
+          <w:b/>
+          <w:color w:val="000000"/>
+          <w:sz w:val="30"/>
+        </w:rPr>
+        <w:t xml:space="preserve">5. </w:t>
+      </w:r>
+      <w:r>
+        <w:rPr>
+          <w:rFonts w:ascii="Century Gothic" w:hAnsi="Century Gothic"/>
+          <w:b/>
+          <w:color w:val="000000"/>
+          <w:sz w:val="30"/>
+          <w:spacing w:val="20"/>
+        </w:rPr>
+        <w:t>DRAG PIVOT (CTRL+D)</w:t>
       </w:r>
       <w:bookmarkEnd w:id="100012"/>
     </w:p>
@@ -2823,6 +1859,7 @@
         <w:rPr>
           <w:rFonts w:ascii="Arial" w:hAnsi="Arial"/>
           <w:i w:val="0"/>
+          <w:color w:val="1A1A1A"/>
           <w:sz w:val="19"/>
         </w:rPr>
         <w:t>Ctrl+D запускает перетаскивание: пивот следует за курсором, скользя по любой видимой геометрии сцены (рейкаст). Навигация вьюпорта во время драга продолжает работать. Во время драга рисуется линия от стартовой позиции и круг-маркер на текущей точке.</w:t>
@@ -2843,6 +1880,7 @@
         <w:rPr>
           <w:rFonts w:ascii="Arial" w:hAnsi="Arial"/>
           <w:i w:val="0"/>
+          <w:color w:val="1A1A1A"/>
           <w:sz w:val="19"/>
         </w:rPr>
         <w:t>Зажатый Ctrl включает снап: пивот прилипает к ближайшей вершине в радиусе 24 пикселей от курсора на экране. Радиус в пикселях, а не в мировых единицах, поэтому работает одинаково и вблизи, и издалека. Пойманная вершина отмечается жёлтым кругом.</w:t>
@@ -2863,6 +1901,7 @@
         <w:rPr>
           <w:rFonts w:ascii="Arial" w:hAnsi="Arial"/>
           <w:i w:val="0"/>
+          <w:color w:val="1A1A1A"/>
           <w:sz w:val="19"/>
         </w:rPr>
         <w:t>Клавиши X / Y / Z во время драга ограничивают движение осью: первое нажатие - мировая ось, повторное той же клавишей - локальная ось объекта, третье - снять ограничение. Движение по оси идёт экранным скольжением, как у гизмо: ось смотрит почти в камеру - маркер просто не двигается. Круг-маркер в констеине окрашивается в цвет оси. Снап и констеин сочетаются: пойманная вершина проецируется на ось.</w:t>
@@ -2883,6 +1922,7 @@
         <w:rPr>
           <w:rFonts w:ascii="Arial" w:hAnsi="Arial"/>
           <w:i w:val="0"/>
+          <w:color w:val="1A1A1A"/>
           <w:sz w:val="19"/>
         </w:rPr>
         <w:t>ЛКМ или Enter - применить (один undo-шаг). ПКМ или Esc - отмена: до подтверждения сцена не меняется вовсе, откат возвращает пивот на место. Первый клик по кнопке панели, который запустил оператор, не засчитывается - защита от случайного мгновенного коммита.</w:t>
@@ -2891,10 +1931,29 @@
     <w:p>
       <w:pPr>
         <w:pStyle w:val="Heading1"/>
+        <w:pBdr>
+          <w:left w:val="single" w:sz="24" w:space="8" w:color="C82823"/>
+        </w:pBdr>
       </w:pPr>
       <w:bookmarkStart w:id="100017" w:name="_Toc100017"/>
       <w:r>
-        <w:t>6. Rotate Pivot (Ctrl+Alt+D)</w:t>
+        <w:rPr>
+          <w:rFonts w:ascii="Century Gothic" w:hAnsi="Century Gothic"/>
+          <w:b/>
+          <w:color w:val="000000"/>
+          <w:sz w:val="30"/>
+        </w:rPr>
+        <w:t xml:space="preserve">6. </w:t>
+      </w:r>
+      <w:r>
+        <w:rPr>
+          <w:rFonts w:ascii="Century Gothic" w:hAnsi="Century Gothic"/>
+          <w:b/>
+          <w:color w:val="000000"/>
+          <w:sz w:val="30"/>
+          <w:spacing w:val="20"/>
+        </w:rPr>
+        <w:t>ROTATE PIVOT (CTRL+ALT+D)</w:t>
       </w:r>
       <w:bookmarkEnd w:id="100017"/>
     </w:p>
@@ -2913,6 +1972,7 @@
         <w:rPr>
           <w:rFonts w:ascii="Arial" w:hAnsi="Arial"/>
           <w:i w:val="0"/>
+          <w:color w:val="1A1A1A"/>
           <w:sz w:val="19"/>
         </w:rPr>
         <w:t>Оператор объектного режима: вращает ориентацию пивота активного меша, не двигая геометрию. Зачем: для анимируемых частей - колёс, дверей, крышек - совместить локальную ось с реальной осью вращения детали, и дальше аниматор крутит её одним каналом. По умолчанию мышь вращает пивот вокруг оси вида.</w:t>
@@ -2930,7 +1990,6 @@
     </w:p>
     <w:tbl>
       <w:tblPr>
-        <w:tblStyle w:val="TableGrid"/>
         <w:tblW w:type="auto" w:w="0"/>
         <w:tblLayout w:type="fixed"/>
         <w:tblLook w:firstColumn="1" w:firstRow="1" w:lastColumn="0" w:lastRow="0" w:noHBand="0" w:noVBand="1" w:val="04A0"/>
@@ -2942,67 +2001,60 @@
         </w:tblCellMar>
       </w:tblPr>
       <w:tblGrid>
-        <w:gridCol w:w="4680"/>
-        <w:gridCol w:w="4680"/>
+        <w:gridCol w:w="4706"/>
+        <w:gridCol w:w="4706"/>
       </w:tblGrid>
       <w:tr>
         <w:trPr>
           <w:cantSplit/>
-          <w:tblHeader/>
         </w:trPr>
         <w:tc>
           <w:tcPr>
             <w:tcW w:type="dxa" w:w="2494"/>
+            <w:vAlign w:val="top"/>
             <w:tcBorders>
-              <w:top w:val="single" w:sz="4" w:space="0" w:color="CCCCCC"/>
-              <w:left w:val="single" w:sz="4" w:space="0" w:color="CCCCCC"/>
-              <w:bottom w:val="single" w:sz="4" w:space="0" w:color="CCCCCC"/>
-              <w:right w:val="single" w:sz="4" w:space="0" w:color="CCCCCC"/>
+              <w:bottom w:val="single" w:sz="12" w:space="4" w:color="C82823"/>
             </w:tcBorders>
-            <w:vAlign w:val="top"/>
-            <w:shd w:val="clear" w:color="auto" w:fill="2E75B5"/>
           </w:tcPr>
           <w:p>
             <w:pPr>
+              <w:keepNext/>
               <w:spacing w:before="40" w:after="40" w:line="264" w:lineRule="auto"/>
             </w:pPr>
             <w:r>
               <w:rPr>
-                <w:rFonts w:ascii="Arial" w:hAnsi="Arial"/>
+                <w:rFonts w:ascii="Century Gothic" w:hAnsi="Century Gothic"/>
                 <w:b/>
-                <w:i w:val="0"/>
-                <w:color w:val="FFFFFF"/>
-                <w:sz w:val="18"/>
+                <w:color w:val="000000"/>
+                <w:sz w:val="17"/>
+                <w:spacing w:val="20"/>
               </w:rPr>
-              <w:t>Клавиша</w:t>
+              <w:t>КЛАВИША</w:t>
             </w:r>
           </w:p>
         </w:tc>
         <w:tc>
           <w:tcPr>
             <w:tcW w:type="dxa" w:w="7143"/>
+            <w:vAlign w:val="top"/>
             <w:tcBorders>
-              <w:top w:val="single" w:sz="4" w:space="0" w:color="CCCCCC"/>
-              <w:left w:val="single" w:sz="4" w:space="0" w:color="CCCCCC"/>
-              <w:bottom w:val="single" w:sz="4" w:space="0" w:color="CCCCCC"/>
-              <w:right w:val="single" w:sz="4" w:space="0" w:color="CCCCCC"/>
+              <w:bottom w:val="single" w:sz="12" w:space="4" w:color="C82823"/>
             </w:tcBorders>
-            <w:vAlign w:val="top"/>
-            <w:shd w:val="clear" w:color="auto" w:fill="2E75B5"/>
           </w:tcPr>
           <w:p>
             <w:pPr>
+              <w:keepNext/>
               <w:spacing w:before="40" w:after="40" w:line="264" w:lineRule="auto"/>
             </w:pPr>
             <w:r>
               <w:rPr>
-                <w:rFonts w:ascii="Arial" w:hAnsi="Arial"/>
+                <w:rFonts w:ascii="Century Gothic" w:hAnsi="Century Gothic"/>
                 <w:b/>
-                <w:i w:val="0"/>
-                <w:color w:val="FFFFFF"/>
-                <w:sz w:val="18"/>
+                <w:color w:val="000000"/>
+                <w:sz w:val="17"/>
+                <w:spacing w:val="20"/>
               </w:rPr>
-              <w:t>Действие</w:t>
+              <w:t>ДЕЙСТВИЕ</w:t>
             </w:r>
           </w:p>
         </w:tc>
@@ -3014,23 +2066,21 @@
         <w:tc>
           <w:tcPr>
             <w:tcW w:type="dxa" w:w="2494"/>
+            <w:vAlign w:val="top"/>
             <w:tcBorders>
-              <w:top w:val="single" w:sz="4" w:space="0" w:color="CCCCCC"/>
-              <w:left w:val="single" w:sz="4" w:space="0" w:color="CCCCCC"/>
-              <w:bottom w:val="single" w:sz="4" w:space="0" w:color="CCCCCC"/>
-              <w:right w:val="single" w:sz="4" w:space="0" w:color="CCCCCC"/>
+              <w:bottom w:val="single" w:sz="4" w:space="4" w:color="E0E0E0"/>
             </w:tcBorders>
-            <w:vAlign w:val="top"/>
           </w:tcPr>
           <w:p>
             <w:pPr>
+              <w:keepNext/>
               <w:spacing w:before="40" w:after="40" w:line="264" w:lineRule="auto"/>
             </w:pPr>
             <w:r>
               <w:rPr>
                 <w:rFonts w:ascii="Arial" w:hAnsi="Arial"/>
                 <w:b/>
-                <w:i w:val="0"/>
+                <w:color w:val="1A1A1A"/>
                 <w:sz w:val="18"/>
               </w:rPr>
               <w:t>X / Y / Z</w:t>
@@ -3040,23 +2090,21 @@
         <w:tc>
           <w:tcPr>
             <w:tcW w:type="dxa" w:w="7143"/>
+            <w:vAlign w:val="top"/>
             <w:tcBorders>
-              <w:top w:val="single" w:sz="4" w:space="0" w:color="CCCCCC"/>
-              <w:left w:val="single" w:sz="4" w:space="0" w:color="CCCCCC"/>
-              <w:bottom w:val="single" w:sz="4" w:space="0" w:color="CCCCCC"/>
-              <w:right w:val="single" w:sz="4" w:space="0" w:color="CCCCCC"/>
+              <w:bottom w:val="single" w:sz="4" w:space="4" w:color="E0E0E0"/>
             </w:tcBorders>
-            <w:vAlign w:val="top"/>
           </w:tcPr>
           <w:p>
             <w:pPr>
+              <w:keepNext/>
               <w:spacing w:before="40" w:after="40" w:line="264" w:lineRule="auto"/>
             </w:pPr>
             <w:r>
               <w:rPr>
                 <w:rFonts w:ascii="Arial" w:hAnsi="Arial"/>
                 <w:b w:val="0"/>
-                <w:i w:val="0"/>
+                <w:color w:val="1A1A1A"/>
                 <w:sz w:val="18"/>
               </w:rPr>
               <w:t>мировая ось; повторное нажатие - локальная ось объекта; третье - снова ось вида</w:t>
@@ -3071,24 +2119,21 @@
         <w:tc>
           <w:tcPr>
             <w:tcW w:type="dxa" w:w="2494"/>
+            <w:vAlign w:val="top"/>
             <w:tcBorders>
-              <w:top w:val="single" w:sz="4" w:space="0" w:color="CCCCCC"/>
-              <w:left w:val="single" w:sz="4" w:space="0" w:color="CCCCCC"/>
-              <w:bottom w:val="single" w:sz="4" w:space="0" w:color="CCCCCC"/>
-              <w:right w:val="single" w:sz="4" w:space="0" w:color="CCCCCC"/>
+              <w:bottom w:val="single" w:sz="4" w:space="4" w:color="E0E0E0"/>
             </w:tcBorders>
-            <w:vAlign w:val="top"/>
-            <w:shd w:val="clear" w:color="auto" w:fill="F5F8FB"/>
           </w:tcPr>
           <w:p>
             <w:pPr>
+              <w:keepNext/>
               <w:spacing w:before="40" w:after="40" w:line="264" w:lineRule="auto"/>
             </w:pPr>
             <w:r>
               <w:rPr>
                 <w:rFonts w:ascii="Arial" w:hAnsi="Arial"/>
                 <w:b/>
-                <w:i w:val="0"/>
+                <w:color w:val="1A1A1A"/>
                 <w:sz w:val="18"/>
               </w:rPr>
               <w:t>Shift (зажат)</w:t>
@@ -3098,24 +2143,21 @@
         <w:tc>
           <w:tcPr>
             <w:tcW w:type="dxa" w:w="7143"/>
+            <w:vAlign w:val="top"/>
             <w:tcBorders>
-              <w:top w:val="single" w:sz="4" w:space="0" w:color="CCCCCC"/>
-              <w:left w:val="single" w:sz="4" w:space="0" w:color="CCCCCC"/>
-              <w:bottom w:val="single" w:sz="4" w:space="0" w:color="CCCCCC"/>
-              <w:right w:val="single" w:sz="4" w:space="0" w:color="CCCCCC"/>
+              <w:bottom w:val="single" w:sz="4" w:space="4" w:color="E0E0E0"/>
             </w:tcBorders>
-            <w:vAlign w:val="top"/>
-            <w:shd w:val="clear" w:color="auto" w:fill="F5F8FB"/>
           </w:tcPr>
           <w:p>
             <w:pPr>
+              <w:keepNext/>
               <w:spacing w:before="40" w:after="40" w:line="264" w:lineRule="auto"/>
             </w:pPr>
             <w:r>
               <w:rPr>
                 <w:rFonts w:ascii="Arial" w:hAnsi="Arial"/>
                 <w:b w:val="0"/>
-                <w:i w:val="0"/>
+                <w:color w:val="1A1A1A"/>
                 <w:sz w:val="18"/>
               </w:rPr>
               <w:t>тонкое вращение - десятая доля скорости</w:t>
@@ -3130,23 +2172,21 @@
         <w:tc>
           <w:tcPr>
             <w:tcW w:type="dxa" w:w="2494"/>
+            <w:vAlign w:val="top"/>
             <w:tcBorders>
-              <w:top w:val="single" w:sz="4" w:space="0" w:color="CCCCCC"/>
-              <w:left w:val="single" w:sz="4" w:space="0" w:color="CCCCCC"/>
-              <w:bottom w:val="single" w:sz="4" w:space="0" w:color="CCCCCC"/>
-              <w:right w:val="single" w:sz="4" w:space="0" w:color="CCCCCC"/>
+              <w:bottom w:val="single" w:sz="4" w:space="4" w:color="E0E0E0"/>
             </w:tcBorders>
-            <w:vAlign w:val="top"/>
           </w:tcPr>
           <w:p>
             <w:pPr>
+              <w:keepNext/>
               <w:spacing w:before="40" w:after="40" w:line="264" w:lineRule="auto"/>
             </w:pPr>
             <w:r>
               <w:rPr>
                 <w:rFonts w:ascii="Arial" w:hAnsi="Arial"/>
                 <w:b/>
-                <w:i w:val="0"/>
+                <w:color w:val="1A1A1A"/>
                 <w:sz w:val="18"/>
               </w:rPr>
               <w:t>Ctrl (зажат)</w:t>
@@ -3156,23 +2196,21 @@
         <w:tc>
           <w:tcPr>
             <w:tcW w:type="dxa" w:w="7143"/>
+            <w:vAlign w:val="top"/>
             <w:tcBorders>
-              <w:top w:val="single" w:sz="4" w:space="0" w:color="CCCCCC"/>
-              <w:left w:val="single" w:sz="4" w:space="0" w:color="CCCCCC"/>
-              <w:bottom w:val="single" w:sz="4" w:space="0" w:color="CCCCCC"/>
-              <w:right w:val="single" w:sz="4" w:space="0" w:color="CCCCCC"/>
+              <w:bottom w:val="single" w:sz="4" w:space="4" w:color="E0E0E0"/>
             </w:tcBorders>
-            <w:vAlign w:val="top"/>
           </w:tcPr>
           <w:p>
             <w:pPr>
+              <w:keepNext/>
               <w:spacing w:before="40" w:after="40" w:line="264" w:lineRule="auto"/>
             </w:pPr>
             <w:r>
               <w:rPr>
                 <w:rFonts w:ascii="Arial" w:hAnsi="Arial"/>
                 <w:b w:val="0"/>
-                <w:i w:val="0"/>
+                <w:color w:val="1A1A1A"/>
                 <w:sz w:val="18"/>
               </w:rPr>
               <w:t>шаги по 5 градусов</w:t>
@@ -3187,14 +2225,10 @@
         <w:tc>
           <w:tcPr>
             <w:tcW w:type="dxa" w:w="2494"/>
+            <w:vAlign w:val="top"/>
             <w:tcBorders>
-              <w:top w:val="single" w:sz="4" w:space="0" w:color="CCCCCC"/>
-              <w:left w:val="single" w:sz="4" w:space="0" w:color="CCCCCC"/>
-              <w:bottom w:val="single" w:sz="4" w:space="0" w:color="CCCCCC"/>
-              <w:right w:val="single" w:sz="4" w:space="0" w:color="CCCCCC"/>
+              <w:bottom w:val="single" w:sz="8" w:space="4" w:color="000000"/>
             </w:tcBorders>
-            <w:vAlign w:val="top"/>
-            <w:shd w:val="clear" w:color="auto" w:fill="F5F8FB"/>
           </w:tcPr>
           <w:p>
             <w:pPr>
@@ -3204,7 +2238,7 @@
               <w:rPr>
                 <w:rFonts w:ascii="Arial" w:hAnsi="Arial"/>
                 <w:b/>
-                <w:i w:val="0"/>
+                <w:color w:val="1A1A1A"/>
                 <w:sz w:val="18"/>
               </w:rPr>
               <w:t>Ctrl + Shift</w:t>
@@ -3214,14 +2248,10 @@
         <w:tc>
           <w:tcPr>
             <w:tcW w:type="dxa" w:w="7143"/>
+            <w:vAlign w:val="top"/>
             <w:tcBorders>
-              <w:top w:val="single" w:sz="4" w:space="0" w:color="CCCCCC"/>
-              <w:left w:val="single" w:sz="4" w:space="0" w:color="CCCCCC"/>
-              <w:bottom w:val="single" w:sz="4" w:space="0" w:color="CCCCCC"/>
-              <w:right w:val="single" w:sz="4" w:space="0" w:color="CCCCCC"/>
+              <w:bottom w:val="single" w:sz="8" w:space="4" w:color="000000"/>
             </w:tcBorders>
-            <w:vAlign w:val="top"/>
-            <w:shd w:val="clear" w:color="auto" w:fill="F5F8FB"/>
           </w:tcPr>
           <w:p>
             <w:pPr>
@@ -3231,7 +2261,7 @@
               <w:rPr>
                 <w:rFonts w:ascii="Arial" w:hAnsi="Arial"/>
                 <w:b w:val="0"/>
-                <w:i w:val="0"/>
+                <w:color w:val="1A1A1A"/>
                 <w:sz w:val="18"/>
               </w:rPr>
               <w:t>шаги по 1 градусу</w:t>
@@ -3242,7 +2272,7 @@
     </w:tbl>
     <w:p>
       <w:pPr>
-        <w:spacing w:after="80" w:before="0" w:line="240" w:lineRule="auto"/>
+        <w:spacing w:after="80" w:line="240" w:lineRule="auto"/>
       </w:pPr>
     </w:p>
     <w:p>
@@ -3260,6 +2290,7 @@
         <w:rPr>
           <w:rFonts w:ascii="Arial" w:hAnsi="Arial"/>
           <w:i w:val="0"/>
+          <w:color w:val="1A1A1A"/>
           <w:sz w:val="19"/>
         </w:rPr>
         <w:t>Во время вращения рисуется живая триада осей пивота и круг-маркер, у курсора выводится текущий угол с осью («23.4 deg [Z global]»), так же дублируется в статус-бар. Численный фидбек виден всегда, даже если графику вьюпорта что-то перекрывает. ЛКМ или Enter - применить, ПКМ или Esc - отмена: до коммита объект не тронут вовсе.</w:t>
@@ -3268,10 +2299,29 @@
     <w:p>
       <w:pPr>
         <w:pStyle w:val="Heading1"/>
+        <w:pBdr>
+          <w:left w:val="single" w:sz="24" w:space="8" w:color="C82823"/>
+        </w:pBdr>
       </w:pPr>
       <w:bookmarkStart w:id="100021" w:name="_Toc100021"/>
       <w:r>
-        <w:t>7. Align Pivot to Normal / to Edge</w:t>
+        <w:rPr>
+          <w:rFonts w:ascii="Century Gothic" w:hAnsi="Century Gothic"/>
+          <w:b/>
+          <w:color w:val="000000"/>
+          <w:sz w:val="30"/>
+        </w:rPr>
+        <w:t xml:space="preserve">7. </w:t>
+      </w:r>
+      <w:r>
+        <w:rPr>
+          <w:rFonts w:ascii="Century Gothic" w:hAnsi="Century Gothic"/>
+          <w:b/>
+          <w:color w:val="000000"/>
+          <w:sz w:val="30"/>
+          <w:spacing w:val="20"/>
+        </w:rPr>
+        <w:t>ALIGN PIVOT TO NORMAL / TO EDGE</w:t>
       </w:r>
       <w:bookmarkEnd w:id="100021"/>
     </w:p>
@@ -3290,6 +2340,7 @@
         <w:rPr>
           <w:rFonts w:ascii="Arial" w:hAnsi="Arial"/>
           <w:i w:val="0"/>
+          <w:color w:val="1A1A1A"/>
           <w:sz w:val="19"/>
         </w:rPr>
         <w:t>Запустите кнопкой панели и ведите курсором по мешу: ось Z пивота следует нормали грани под курсором, ось Y тянется к мировому верху. Классический случай - дверь: навели курсором на плоскость полотна - Z смотрит наружу, ЛКМ - применить. Синий круг означает, что нормаль поймана, жёлтый - грани под курсором нет.</w:t>
@@ -3310,6 +2361,7 @@
         <w:rPr>
           <w:rFonts w:ascii="Arial" w:hAnsi="Arial"/>
           <w:i w:val="0"/>
+          <w:color w:val="1A1A1A"/>
           <w:sz w:val="19"/>
         </w:rPr>
         <w:t>Тот же жест, но ось X пивота ложится вдоль самого длинного ребра грани под курсором - детерминированно, без перебора. Нужно другое направление - ведите курсор на соседнюю грань с нужным ребром. Красный круг - ребро поймано. Для колеса: грань обода даст ось вдоль обода - это и есть ось вращения.</w:t>
@@ -3330,6 +2382,7 @@
         <w:rPr>
           <w:rFonts w:ascii="Arial" w:hAnsi="Arial"/>
           <w:i w:val="0"/>
+          <w:color w:val="1A1A1A"/>
           <w:sz w:val="19"/>
         </w:rPr>
         <w:t>Цель в обоих режимах «липкая»: увели курсор с меша на панель или в пустоту - последняя пойманная ориентация сохраняется и ждёт подтверждения. ЛКМ коммитит пойманное даже если курсор в момент нажатия не над мешем.</w:t>
@@ -3338,10 +2391,29 @@
     <w:p>
       <w:pPr>
         <w:pStyle w:val="Heading1"/>
+        <w:pBdr>
+          <w:left w:val="single" w:sz="24" w:space="8" w:color="C82823"/>
+        </w:pBdr>
       </w:pPr>
       <w:bookmarkStart w:id="100025" w:name="_Toc100025"/>
       <w:r>
-        <w:t>8. Pivot Audit</w:t>
+        <w:rPr>
+          <w:rFonts w:ascii="Century Gothic" w:hAnsi="Century Gothic"/>
+          <w:b/>
+          <w:color w:val="000000"/>
+          <w:sz w:val="30"/>
+        </w:rPr>
+        <w:t xml:space="preserve">8. </w:t>
+      </w:r>
+      <w:r>
+        <w:rPr>
+          <w:rFonts w:ascii="Century Gothic" w:hAnsi="Century Gothic"/>
+          <w:b/>
+          <w:color w:val="000000"/>
+          <w:sz w:val="30"/>
+          <w:spacing w:val="20"/>
+        </w:rPr>
+        <w:t>PIVOT AUDIT</w:t>
       </w:r>
       <w:bookmarkEnd w:id="100025"/>
     </w:p>
@@ -3360,6 +2432,7 @@
         <w:rPr>
           <w:rFonts w:ascii="Arial" w:hAnsi="Arial"/>
           <w:i w:val="0"/>
+          <w:color w:val="1A1A1A"/>
           <w:sz w:val="19"/>
         </w:rPr>
         <w:t>Конвенции пивотов плывут: ассеты приходят из разных рук и пакетов, пивоты оказываются в центре bbox, под землёй или где угодно. Аудит проверяет пивоты выделенных мешей против выбранного якоря и показывает нарушителей - до того, как ассет поедет дальше по пайплайну.</w:t>
@@ -3377,7 +2450,6 @@
     </w:p>
     <w:tbl>
       <w:tblPr>
-        <w:tblStyle w:val="TableGrid"/>
         <w:tblW w:type="auto" w:w="0"/>
         <w:tblLayout w:type="fixed"/>
         <w:tblLook w:firstColumn="1" w:firstRow="1" w:lastColumn="0" w:lastRow="0" w:noHBand="0" w:noVBand="1" w:val="04A0"/>
@@ -3389,96 +2461,86 @@
         </w:tblCellMar>
       </w:tblPr>
       <w:tblGrid>
-        <w:gridCol w:w="3120"/>
-        <w:gridCol w:w="3120"/>
-        <w:gridCol w:w="3120"/>
+        <w:gridCol w:w="3137"/>
+        <w:gridCol w:w="3137"/>
+        <w:gridCol w:w="3137"/>
       </w:tblGrid>
       <w:tr>
         <w:trPr>
           <w:cantSplit/>
-          <w:tblHeader/>
         </w:trPr>
         <w:tc>
           <w:tcPr>
             <w:tcW w:type="dxa" w:w="2608"/>
+            <w:vAlign w:val="top"/>
             <w:tcBorders>
-              <w:top w:val="single" w:sz="4" w:space="0" w:color="CCCCCC"/>
-              <w:left w:val="single" w:sz="4" w:space="0" w:color="CCCCCC"/>
-              <w:bottom w:val="single" w:sz="4" w:space="0" w:color="CCCCCC"/>
-              <w:right w:val="single" w:sz="4" w:space="0" w:color="CCCCCC"/>
+              <w:bottom w:val="single" w:sz="12" w:space="4" w:color="C82823"/>
             </w:tcBorders>
-            <w:vAlign w:val="top"/>
-            <w:shd w:val="clear" w:color="auto" w:fill="2E75B5"/>
           </w:tcPr>
           <w:p>
             <w:pPr>
+              <w:keepNext/>
               <w:spacing w:before="40" w:after="40" w:line="264" w:lineRule="auto"/>
             </w:pPr>
             <w:r>
               <w:rPr>
-                <w:rFonts w:ascii="Arial" w:hAnsi="Arial"/>
+                <w:rFonts w:ascii="Century Gothic" w:hAnsi="Century Gothic"/>
                 <w:b/>
-                <w:i w:val="0"/>
-                <w:color w:val="FFFFFF"/>
-                <w:sz w:val="18"/>
+                <w:color w:val="000000"/>
+                <w:sz w:val="17"/>
+                <w:spacing w:val="20"/>
               </w:rPr>
-              <w:t>Правило</w:t>
+              <w:t>ПРАВИЛО</w:t>
             </w:r>
           </w:p>
         </w:tc>
         <w:tc>
           <w:tcPr>
             <w:tcW w:type="dxa" w:w="3628"/>
+            <w:vAlign w:val="top"/>
             <w:tcBorders>
-              <w:top w:val="single" w:sz="4" w:space="0" w:color="CCCCCC"/>
-              <w:left w:val="single" w:sz="4" w:space="0" w:color="CCCCCC"/>
-              <w:bottom w:val="single" w:sz="4" w:space="0" w:color="CCCCCC"/>
-              <w:right w:val="single" w:sz="4" w:space="0" w:color="CCCCCC"/>
+              <w:bottom w:val="single" w:sz="12" w:space="4" w:color="C82823"/>
             </w:tcBorders>
-            <w:vAlign w:val="top"/>
-            <w:shd w:val="clear" w:color="auto" w:fill="2E75B5"/>
           </w:tcPr>
           <w:p>
             <w:pPr>
+              <w:keepNext/>
               <w:spacing w:before="40" w:after="40" w:line="264" w:lineRule="auto"/>
             </w:pPr>
             <w:r>
               <w:rPr>
-                <w:rFonts w:ascii="Arial" w:hAnsi="Arial"/>
+                <w:rFonts w:ascii="Century Gothic" w:hAnsi="Century Gothic"/>
                 <w:b/>
-                <w:i w:val="0"/>
-                <w:color w:val="FFFFFF"/>
-                <w:sz w:val="18"/>
+                <w:color w:val="000000"/>
+                <w:sz w:val="17"/>
+                <w:spacing w:val="20"/>
               </w:rPr>
-              <w:t>Якорь</w:t>
+              <w:t>ЯКОРЬ</w:t>
             </w:r>
           </w:p>
         </w:tc>
         <w:tc>
           <w:tcPr>
             <w:tcW w:type="dxa" w:w="3402"/>
+            <w:vAlign w:val="top"/>
             <w:tcBorders>
-              <w:top w:val="single" w:sz="4" w:space="0" w:color="CCCCCC"/>
-              <w:left w:val="single" w:sz="4" w:space="0" w:color="CCCCCC"/>
-              <w:bottom w:val="single" w:sz="4" w:space="0" w:color="CCCCCC"/>
-              <w:right w:val="single" w:sz="4" w:space="0" w:color="CCCCCC"/>
+              <w:bottom w:val="single" w:sz="12" w:space="4" w:color="C82823"/>
             </w:tcBorders>
-            <w:vAlign w:val="top"/>
-            <w:shd w:val="clear" w:color="auto" w:fill="2E75B5"/>
           </w:tcPr>
           <w:p>
             <w:pPr>
+              <w:keepNext/>
               <w:spacing w:before="40" w:after="40" w:line="264" w:lineRule="auto"/>
             </w:pPr>
             <w:r>
               <w:rPr>
-                <w:rFonts w:ascii="Arial" w:hAnsi="Arial"/>
+                <w:rFonts w:ascii="Century Gothic" w:hAnsi="Century Gothic"/>
                 <w:b/>
-                <w:i w:val="0"/>
-                <w:color w:val="FFFFFF"/>
-                <w:sz w:val="18"/>
+                <w:color w:val="000000"/>
+                <w:sz w:val="17"/>
+                <w:spacing w:val="20"/>
               </w:rPr>
-              <w:t>Допуск</w:t>
+              <w:t>ДОПУСК</w:t>
             </w:r>
           </w:p>
         </w:tc>
@@ -3490,23 +2552,21 @@
         <w:tc>
           <w:tcPr>
             <w:tcW w:type="dxa" w:w="2608"/>
+            <w:vAlign w:val="top"/>
             <w:tcBorders>
-              <w:top w:val="single" w:sz="4" w:space="0" w:color="CCCCCC"/>
-              <w:left w:val="single" w:sz="4" w:space="0" w:color="CCCCCC"/>
-              <w:bottom w:val="single" w:sz="4" w:space="0" w:color="CCCCCC"/>
-              <w:right w:val="single" w:sz="4" w:space="0" w:color="CCCCCC"/>
+              <w:bottom w:val="single" w:sz="4" w:space="4" w:color="E0E0E0"/>
             </w:tcBorders>
-            <w:vAlign w:val="top"/>
           </w:tcPr>
           <w:p>
             <w:pPr>
+              <w:keepNext/>
               <w:spacing w:before="40" w:after="40" w:line="264" w:lineRule="auto"/>
             </w:pPr>
             <w:r>
               <w:rPr>
                 <w:rFonts w:ascii="Arial" w:hAnsi="Arial"/>
                 <w:b/>
-                <w:i w:val="0"/>
+                <w:color w:val="1A1A1A"/>
                 <w:sz w:val="18"/>
               </w:rPr>
               <w:t>Bottom Center</w:t>
@@ -3516,23 +2576,21 @@
         <w:tc>
           <w:tcPr>
             <w:tcW w:type="dxa" w:w="3628"/>
+            <w:vAlign w:val="top"/>
             <w:tcBorders>
-              <w:top w:val="single" w:sz="4" w:space="0" w:color="CCCCCC"/>
-              <w:left w:val="single" w:sz="4" w:space="0" w:color="CCCCCC"/>
-              <w:bottom w:val="single" w:sz="4" w:space="0" w:color="CCCCCC"/>
-              <w:right w:val="single" w:sz="4" w:space="0" w:color="CCCCCC"/>
+              <w:bottom w:val="single" w:sz="4" w:space="4" w:color="E0E0E0"/>
             </w:tcBorders>
-            <w:vAlign w:val="top"/>
           </w:tcPr>
           <w:p>
             <w:pPr>
+              <w:keepNext/>
               <w:spacing w:before="40" w:after="40" w:line="264" w:lineRule="auto"/>
             </w:pPr>
             <w:r>
               <w:rPr>
                 <w:rFonts w:ascii="Arial" w:hAnsi="Arial"/>
                 <w:b w:val="0"/>
-                <w:i w:val="0"/>
+                <w:color w:val="1A1A1A"/>
                 <w:sz w:val="18"/>
               </w:rPr>
               <w:t>низ bbox объекта, XY-центр</w:t>
@@ -3542,23 +2600,21 @@
         <w:tc>
           <w:tcPr>
             <w:tcW w:type="dxa" w:w="3402"/>
+            <w:vAlign w:val="top"/>
             <w:tcBorders>
-              <w:top w:val="single" w:sz="4" w:space="0" w:color="CCCCCC"/>
-              <w:left w:val="single" w:sz="4" w:space="0" w:color="CCCCCC"/>
-              <w:bottom w:val="single" w:sz="4" w:space="0" w:color="CCCCCC"/>
-              <w:right w:val="single" w:sz="4" w:space="0" w:color="CCCCCC"/>
+              <w:bottom w:val="single" w:sz="4" w:space="4" w:color="E0E0E0"/>
             </w:tcBorders>
-            <w:vAlign w:val="top"/>
           </w:tcPr>
           <w:p>
             <w:pPr>
+              <w:keepNext/>
               <w:spacing w:before="40" w:after="40" w:line="264" w:lineRule="auto"/>
             </w:pPr>
             <w:r>
               <w:rPr>
                 <w:rFonts w:ascii="Arial" w:hAnsi="Arial"/>
                 <w:b w:val="0"/>
-                <w:i w:val="0"/>
+                <w:color w:val="1A1A1A"/>
                 <w:sz w:val="18"/>
               </w:rPr>
               <w:t>процент от размера объекта</w:t>
@@ -3573,24 +2629,21 @@
         <w:tc>
           <w:tcPr>
             <w:tcW w:type="dxa" w:w="2608"/>
+            <w:vAlign w:val="top"/>
             <w:tcBorders>
-              <w:top w:val="single" w:sz="4" w:space="0" w:color="CCCCCC"/>
-              <w:left w:val="single" w:sz="4" w:space="0" w:color="CCCCCC"/>
-              <w:bottom w:val="single" w:sz="4" w:space="0" w:color="CCCCCC"/>
-              <w:right w:val="single" w:sz="4" w:space="0" w:color="CCCCCC"/>
+              <w:bottom w:val="single" w:sz="4" w:space="4" w:color="E0E0E0"/>
             </w:tcBorders>
-            <w:vAlign w:val="top"/>
-            <w:shd w:val="clear" w:color="auto" w:fill="F5F8FB"/>
           </w:tcPr>
           <w:p>
             <w:pPr>
+              <w:keepNext/>
               <w:spacing w:before="40" w:after="40" w:line="264" w:lineRule="auto"/>
             </w:pPr>
             <w:r>
               <w:rPr>
                 <w:rFonts w:ascii="Arial" w:hAnsi="Arial"/>
                 <w:b/>
-                <w:i w:val="0"/>
+                <w:color w:val="1A1A1A"/>
                 <w:sz w:val="18"/>
               </w:rPr>
               <w:t>Bounds Center</w:t>
@@ -3600,24 +2653,21 @@
         <w:tc>
           <w:tcPr>
             <w:tcW w:type="dxa" w:w="3628"/>
+            <w:vAlign w:val="top"/>
             <w:tcBorders>
-              <w:top w:val="single" w:sz="4" w:space="0" w:color="CCCCCC"/>
-              <w:left w:val="single" w:sz="4" w:space="0" w:color="CCCCCC"/>
-              <w:bottom w:val="single" w:sz="4" w:space="0" w:color="CCCCCC"/>
-              <w:right w:val="single" w:sz="4" w:space="0" w:color="CCCCCC"/>
+              <w:bottom w:val="single" w:sz="4" w:space="4" w:color="E0E0E0"/>
             </w:tcBorders>
-            <w:vAlign w:val="top"/>
-            <w:shd w:val="clear" w:color="auto" w:fill="F5F8FB"/>
           </w:tcPr>
           <w:p>
             <w:pPr>
+              <w:keepNext/>
               <w:spacing w:before="40" w:after="40" w:line="264" w:lineRule="auto"/>
             </w:pPr>
             <w:r>
               <w:rPr>
                 <w:rFonts w:ascii="Arial" w:hAnsi="Arial"/>
                 <w:b w:val="0"/>
-                <w:i w:val="0"/>
+                <w:color w:val="1A1A1A"/>
                 <w:sz w:val="18"/>
               </w:rPr>
               <w:t>центр bbox объекта</w:t>
@@ -3627,24 +2677,21 @@
         <w:tc>
           <w:tcPr>
             <w:tcW w:type="dxa" w:w="3402"/>
+            <w:vAlign w:val="top"/>
             <w:tcBorders>
-              <w:top w:val="single" w:sz="4" w:space="0" w:color="CCCCCC"/>
-              <w:left w:val="single" w:sz="4" w:space="0" w:color="CCCCCC"/>
-              <w:bottom w:val="single" w:sz="4" w:space="0" w:color="CCCCCC"/>
-              <w:right w:val="single" w:sz="4" w:space="0" w:color="CCCCCC"/>
+              <w:bottom w:val="single" w:sz="4" w:space="4" w:color="E0E0E0"/>
             </w:tcBorders>
-            <w:vAlign w:val="top"/>
-            <w:shd w:val="clear" w:color="auto" w:fill="F5F8FB"/>
           </w:tcPr>
           <w:p>
             <w:pPr>
+              <w:keepNext/>
               <w:spacing w:before="40" w:after="40" w:line="264" w:lineRule="auto"/>
             </w:pPr>
             <w:r>
               <w:rPr>
                 <w:rFonts w:ascii="Arial" w:hAnsi="Arial"/>
                 <w:b w:val="0"/>
-                <w:i w:val="0"/>
+                <w:color w:val="1A1A1A"/>
                 <w:sz w:val="18"/>
               </w:rPr>
               <w:t>процент от размера объекта</w:t>
@@ -3659,13 +2706,10 @@
         <w:tc>
           <w:tcPr>
             <w:tcW w:type="dxa" w:w="2608"/>
+            <w:vAlign w:val="top"/>
             <w:tcBorders>
-              <w:top w:val="single" w:sz="4" w:space="0" w:color="CCCCCC"/>
-              <w:left w:val="single" w:sz="4" w:space="0" w:color="CCCCCC"/>
-              <w:bottom w:val="single" w:sz="4" w:space="0" w:color="CCCCCC"/>
-              <w:right w:val="single" w:sz="4" w:space="0" w:color="CCCCCC"/>
+              <w:bottom w:val="single" w:sz="8" w:space="4" w:color="000000"/>
             </w:tcBorders>
-            <w:vAlign w:val="top"/>
           </w:tcPr>
           <w:p>
             <w:pPr>
@@ -3675,7 +2719,7 @@
               <w:rPr>
                 <w:rFonts w:ascii="Arial" w:hAnsi="Arial"/>
                 <w:b/>
-                <w:i w:val="0"/>
+                <w:color w:val="1A1A1A"/>
                 <w:sz w:val="18"/>
               </w:rPr>
               <w:t>World Origin</w:t>
@@ -3685,13 +2729,10 @@
         <w:tc>
           <w:tcPr>
             <w:tcW w:type="dxa" w:w="3628"/>
+            <w:vAlign w:val="top"/>
             <w:tcBorders>
-              <w:top w:val="single" w:sz="4" w:space="0" w:color="CCCCCC"/>
-              <w:left w:val="single" w:sz="4" w:space="0" w:color="CCCCCC"/>
-              <w:bottom w:val="single" w:sz="4" w:space="0" w:color="CCCCCC"/>
-              <w:right w:val="single" w:sz="4" w:space="0" w:color="CCCCCC"/>
+              <w:bottom w:val="single" w:sz="8" w:space="4" w:color="000000"/>
             </w:tcBorders>
-            <w:vAlign w:val="top"/>
           </w:tcPr>
           <w:p>
             <w:pPr>
@@ -3701,7 +2742,7 @@
               <w:rPr>
                 <w:rFonts w:ascii="Arial" w:hAnsi="Arial"/>
                 <w:b w:val="0"/>
-                <w:i w:val="0"/>
+                <w:color w:val="1A1A1A"/>
                 <w:sz w:val="18"/>
               </w:rPr>
               <w:t>мировой ноль (0, 0, 0)</w:t>
@@ -3711,13 +2752,10 @@
         <w:tc>
           <w:tcPr>
             <w:tcW w:type="dxa" w:w="3402"/>
+            <w:vAlign w:val="top"/>
             <w:tcBorders>
-              <w:top w:val="single" w:sz="4" w:space="0" w:color="CCCCCC"/>
-              <w:left w:val="single" w:sz="4" w:space="0" w:color="CCCCCC"/>
-              <w:bottom w:val="single" w:sz="4" w:space="0" w:color="CCCCCC"/>
-              <w:right w:val="single" w:sz="4" w:space="0" w:color="CCCCCC"/>
+              <w:bottom w:val="single" w:sz="8" w:space="4" w:color="000000"/>
             </w:tcBorders>
-            <w:vAlign w:val="top"/>
           </w:tcPr>
           <w:p>
             <w:pPr>
@@ -3727,7 +2765,7 @@
               <w:rPr>
                 <w:rFonts w:ascii="Arial" w:hAnsi="Arial"/>
                 <w:b w:val="0"/>
-                <w:i w:val="0"/>
+                <w:color w:val="1A1A1A"/>
                 <w:sz w:val="18"/>
               </w:rPr>
               <w:t>метры (по умолчанию 0,1)</w:t>
@@ -3738,7 +2776,7 @@
     </w:tbl>
     <w:p>
       <w:pPr>
-        <w:spacing w:after="80" w:before="0" w:line="240" w:lineRule="auto"/>
+        <w:spacing w:after="80" w:line="240" w:lineRule="auto"/>
       </w:pPr>
     </w:p>
     <w:p>
@@ -3746,6 +2784,7 @@
         <w:rPr>
           <w:rFonts w:ascii="Arial" w:hAnsi="Arial"/>
           <w:i w:val="0"/>
+          <w:color w:val="1A1A1A"/>
           <w:sz w:val="19"/>
         </w:rPr>
         <w:t>World Origin - для ассетов, живущих с пивотом в нуле мира (здания, ландшафтные блоки): геометрия с запасом под землёй здесь - норма, поэтому допуск считается в метрах, а не в процентах.</w:t>
@@ -3769,6 +2808,7 @@
         <w:rPr>
           <w:rFonts w:ascii="Arial" w:hAnsi="Arial"/>
           <w:i w:val="0"/>
+          <w:color w:val="1A1A1A"/>
           <w:sz w:val="19"/>
         </w:rPr>
         <w:t>Фильтр по суффиксу (по умолчанию _geo) отбирает проверяемые объекты - служебные не участвуют.</w:t>
@@ -3782,6 +2822,7 @@
         <w:rPr>
           <w:rFonts w:ascii="Arial" w:hAnsi="Arial"/>
           <w:i w:val="0"/>
+          <w:color w:val="1A1A1A"/>
           <w:sz w:val="19"/>
         </w:rPr>
         <w:t>Audit Selected запускает проверку выделения; нарушители появляются списком с кнопками-селекторами: клик по строке выделяет объект и приближает камеру.</w:t>
@@ -3795,6 +2836,7 @@
         <w:rPr>
           <w:rFonts w:ascii="Arial" w:hAnsi="Arial"/>
           <w:i w:val="0"/>
+          <w:color w:val="1A1A1A"/>
           <w:sz w:val="19"/>
         </w:rPr>
         <w:t>Fix All Flagged пакетно ставит пивот по выбранному якорю; мульти-юзер меши (общая геометрия на несколько объектов) пропускаются с предупреждением - их пивот правится вручную после развязки.</w:t>
@@ -3803,10 +2845,29 @@
     <w:p>
       <w:pPr>
         <w:pStyle w:val="Heading1"/>
+        <w:pBdr>
+          <w:left w:val="single" w:sz="24" w:space="8" w:color="C82823"/>
+        </w:pBdr>
       </w:pPr>
       <w:bookmarkStart w:id="100029" w:name="_Toc100029"/>
       <w:r>
-        <w:t>9. Панель и подсказки</w:t>
+        <w:rPr>
+          <w:rFonts w:ascii="Century Gothic" w:hAnsi="Century Gothic"/>
+          <w:b/>
+          <w:color w:val="000000"/>
+          <w:sz w:val="30"/>
+        </w:rPr>
+        <w:t xml:space="preserve">9. </w:t>
+      </w:r>
+      <w:r>
+        <w:rPr>
+          <w:rFonts w:ascii="Century Gothic" w:hAnsi="Century Gothic"/>
+          <w:b/>
+          <w:color w:val="000000"/>
+          <w:sz w:val="30"/>
+          <w:spacing w:val="20"/>
+        </w:rPr>
+        <w:t>ПАНЕЛЬ И ПОДСКАЗКИ</w:t>
       </w:r>
       <w:bookmarkEnd w:id="100029"/>
     </w:p>
@@ -3815,6 +2876,7 @@
         <w:rPr>
           <w:rFonts w:ascii="Arial" w:hAnsi="Arial"/>
           <w:i w:val="0"/>
+          <w:color w:val="1A1A1A"/>
           <w:sz w:val="19"/>
         </w:rPr>
         <w:t>Все инструменты живут во вкладке TOCHKA N-панели: кнопки Origin (Median / Bottom / Top), Drag Pivot, Rotate Pivot, Align to Normal, Align to Edge, кнопка pie-меню со всеми операторами разом и секция Pivot Audit. Версия расширения выведена в заголовок панели. Под панелью - свёрнутая суб-панель Info со шпаргалкой клавиш: режим драга (ЛКМ/Enter - применить, ПКМ/Esc - отмена, Ctrl - снап, X/Y/Z - констеин с циклом глобал-локал-офф), режим ротации (Shift - тонко, Ctrl - 5 градусов, Ctrl+Shift - 1 градус).</w:t>
@@ -3823,10 +2885,29 @@
     <w:p>
       <w:pPr>
         <w:pStyle w:val="Heading1"/>
+        <w:pBdr>
+          <w:left w:val="single" w:sz="24" w:space="8" w:color="C82823"/>
+        </w:pBdr>
       </w:pPr>
       <w:bookmarkStart w:id="100030" w:name="_Toc100030"/>
       <w:r>
-        <w:t>10. Как пользоваться</w:t>
+        <w:rPr>
+          <w:rFonts w:ascii="Century Gothic" w:hAnsi="Century Gothic"/>
+          <w:b/>
+          <w:color w:val="000000"/>
+          <w:sz w:val="30"/>
+        </w:rPr>
+        <w:t xml:space="preserve">10. </w:t>
+      </w:r>
+      <w:r>
+        <w:rPr>
+          <w:rFonts w:ascii="Century Gothic" w:hAnsi="Century Gothic"/>
+          <w:b/>
+          <w:color w:val="000000"/>
+          <w:sz w:val="30"/>
+          <w:spacing w:val="20"/>
+        </w:rPr>
+        <w:t>КАК ПОЛЬЗОВАТЬСЯ</w:t>
       </w:r>
       <w:bookmarkEnd w:id="100030"/>
     </w:p>
@@ -3845,6 +2926,7 @@
         <w:rPr>
           <w:rFonts w:ascii="Arial" w:hAnsi="Arial"/>
           <w:i w:val="0"/>
+          <w:color w:val="1A1A1A"/>
           <w:sz w:val="19"/>
         </w:rPr>
         <w:t>Align Pivot to Edge по грани обода - ось X легла вдоль обода. Если нужен доводочный поворот - Ctrl+Alt+D с Ctrl-шагами. Итог: локальная ось колеса совпадает с физической осью вращения, анимация крутится одним каналом X без компенсационных пустышек.</w:t>
@@ -3865,6 +2947,7 @@
         <w:rPr>
           <w:rFonts w:ascii="Arial" w:hAnsi="Arial"/>
           <w:i w:val="0"/>
+          <w:color w:val="1A1A1A"/>
           <w:sz w:val="19"/>
         </w:rPr>
         <w:t>Align Pivot to Normal на плоскость полотна - Z смотрит наружу. Затем Drag Pivot с констеином по оси - пивот съезжает на кромку петель, Ctrl прилипает к угловой вершине. Дверь открывается поворотом вокруг своей кромки.</w:t>
@@ -3885,6 +2968,7 @@
         <w:rPr>
           <w:rFonts w:ascii="Arial" w:hAnsi="Arial"/>
           <w:i w:val="0"/>
+          <w:color w:val="1A1A1A"/>
           <w:sz w:val="19"/>
         </w:rPr>
         <w:t>Ассет приехал с пивотом в случайном месте: D с якорем Bottom ставит пивот на землю под центром объекта. Для парка однотипных объектов быстрее прогнать Audit Selected по правилу проекта и исправить всё разом.</w:t>
@@ -3905,6 +2989,7 @@
         <w:rPr>
           <w:rFonts w:ascii="Arial" w:hAnsi="Arial"/>
           <w:i w:val="0"/>
+          <w:color w:val="1A1A1A"/>
           <w:sz w:val="19"/>
         </w:rPr>
         <w:t>Audit Selected с фильтром по суффиксу - последний шаг перед выкладкой ассета: список нарушителей пуст - пивоты в конвенции; не пуст - Fix All Flagged и перепроверка. Мульти-юзер меши, если флагнулись, развязать и поправить вручную.</w:t>
@@ -3913,16 +2998,34 @@
     <w:p>
       <w:pPr>
         <w:pStyle w:val="Heading1"/>
+        <w:pBdr>
+          <w:left w:val="single" w:sz="24" w:space="8" w:color="C82823"/>
+        </w:pBdr>
       </w:pPr>
       <w:bookmarkStart w:id="100035" w:name="_Toc100035"/>
       <w:r>
-        <w:t>11. Решение проблем</w:t>
+        <w:rPr>
+          <w:rFonts w:ascii="Century Gothic" w:hAnsi="Century Gothic"/>
+          <w:b/>
+          <w:color w:val="000000"/>
+          <w:sz w:val="30"/>
+        </w:rPr>
+        <w:t xml:space="preserve">11. </w:t>
+      </w:r>
+      <w:r>
+        <w:rPr>
+          <w:rFonts w:ascii="Century Gothic" w:hAnsi="Century Gothic"/>
+          <w:b/>
+          <w:color w:val="000000"/>
+          <w:sz w:val="30"/>
+          <w:spacing w:val="20"/>
+        </w:rPr>
+        <w:t>РЕШЕНИЕ ПРОБЛЕМ</w:t>
       </w:r>
       <w:bookmarkEnd w:id="100035"/>
     </w:p>
     <w:tbl>
       <w:tblPr>
-        <w:tblStyle w:val="TableGrid"/>
         <w:tblW w:type="auto" w:w="0"/>
         <w:tblLayout w:type="fixed"/>
         <w:tblLook w:firstColumn="1" w:firstRow="1" w:lastColumn="0" w:lastRow="0" w:noHBand="0" w:noVBand="1" w:val="04A0"/>
@@ -3934,96 +3037,86 @@
         </w:tblCellMar>
       </w:tblPr>
       <w:tblGrid>
-        <w:gridCol w:w="3120"/>
-        <w:gridCol w:w="3120"/>
-        <w:gridCol w:w="3120"/>
+        <w:gridCol w:w="3137"/>
+        <w:gridCol w:w="3137"/>
+        <w:gridCol w:w="3137"/>
       </w:tblGrid>
       <w:tr>
         <w:trPr>
           <w:cantSplit/>
-          <w:tblHeader/>
         </w:trPr>
         <w:tc>
           <w:tcPr>
             <w:tcW w:type="dxa" w:w="2608"/>
+            <w:vAlign w:val="top"/>
             <w:tcBorders>
-              <w:top w:val="single" w:sz="4" w:space="0" w:color="CCCCCC"/>
-              <w:left w:val="single" w:sz="4" w:space="0" w:color="CCCCCC"/>
-              <w:bottom w:val="single" w:sz="4" w:space="0" w:color="CCCCCC"/>
-              <w:right w:val="single" w:sz="4" w:space="0" w:color="CCCCCC"/>
+              <w:bottom w:val="single" w:sz="12" w:space="4" w:color="C82823"/>
             </w:tcBorders>
-            <w:vAlign w:val="top"/>
-            <w:shd w:val="clear" w:color="auto" w:fill="2E75B5"/>
           </w:tcPr>
           <w:p>
             <w:pPr>
+              <w:keepNext/>
               <w:spacing w:before="40" w:after="40" w:line="264" w:lineRule="auto"/>
             </w:pPr>
             <w:r>
               <w:rPr>
-                <w:rFonts w:ascii="Arial" w:hAnsi="Arial"/>
+                <w:rFonts w:ascii="Century Gothic" w:hAnsi="Century Gothic"/>
                 <w:b/>
-                <w:i w:val="0"/>
-                <w:color w:val="FFFFFF"/>
-                <w:sz w:val="18"/>
+                <w:color w:val="000000"/>
+                <w:sz w:val="17"/>
+                <w:spacing w:val="20"/>
               </w:rPr>
-              <w:t>Симптом</w:t>
+              <w:t>СИМПТОМ</w:t>
             </w:r>
           </w:p>
         </w:tc>
         <w:tc>
           <w:tcPr>
             <w:tcW w:type="dxa" w:w="3061"/>
+            <w:vAlign w:val="top"/>
             <w:tcBorders>
-              <w:top w:val="single" w:sz="4" w:space="0" w:color="CCCCCC"/>
-              <w:left w:val="single" w:sz="4" w:space="0" w:color="CCCCCC"/>
-              <w:bottom w:val="single" w:sz="4" w:space="0" w:color="CCCCCC"/>
-              <w:right w:val="single" w:sz="4" w:space="0" w:color="CCCCCC"/>
+              <w:bottom w:val="single" w:sz="12" w:space="4" w:color="C82823"/>
             </w:tcBorders>
-            <w:vAlign w:val="top"/>
-            <w:shd w:val="clear" w:color="auto" w:fill="2E75B5"/>
           </w:tcPr>
           <w:p>
             <w:pPr>
+              <w:keepNext/>
               <w:spacing w:before="40" w:after="40" w:line="264" w:lineRule="auto"/>
             </w:pPr>
             <w:r>
               <w:rPr>
-                <w:rFonts w:ascii="Arial" w:hAnsi="Arial"/>
+                <w:rFonts w:ascii="Century Gothic" w:hAnsi="Century Gothic"/>
                 <w:b/>
-                <w:i w:val="0"/>
-                <w:color w:val="FFFFFF"/>
-                <w:sz w:val="18"/>
+                <w:color w:val="000000"/>
+                <w:sz w:val="17"/>
+                <w:spacing w:val="20"/>
               </w:rPr>
-              <w:t>Причина</w:t>
+              <w:t>ПРИЧИНА</w:t>
             </w:r>
           </w:p>
         </w:tc>
         <w:tc>
           <w:tcPr>
             <w:tcW w:type="dxa" w:w="3969"/>
+            <w:vAlign w:val="top"/>
             <w:tcBorders>
-              <w:top w:val="single" w:sz="4" w:space="0" w:color="CCCCCC"/>
-              <w:left w:val="single" w:sz="4" w:space="0" w:color="CCCCCC"/>
-              <w:bottom w:val="single" w:sz="4" w:space="0" w:color="CCCCCC"/>
-              <w:right w:val="single" w:sz="4" w:space="0" w:color="CCCCCC"/>
+              <w:bottom w:val="single" w:sz="12" w:space="4" w:color="C82823"/>
             </w:tcBorders>
-            <w:vAlign w:val="top"/>
-            <w:shd w:val="clear" w:color="auto" w:fill="2E75B5"/>
           </w:tcPr>
           <w:p>
             <w:pPr>
+              <w:keepNext/>
               <w:spacing w:before="40" w:after="40" w:line="264" w:lineRule="auto"/>
             </w:pPr>
             <w:r>
               <w:rPr>
-                <w:rFonts w:ascii="Arial" w:hAnsi="Arial"/>
+                <w:rFonts w:ascii="Century Gothic" w:hAnsi="Century Gothic"/>
                 <w:b/>
-                <w:i w:val="0"/>
-                <w:color w:val="FFFFFF"/>
-                <w:sz w:val="18"/>
+                <w:color w:val="000000"/>
+                <w:sz w:val="17"/>
+                <w:spacing w:val="20"/>
               </w:rPr>
-              <w:t>Что делать</w:t>
+              <w:t>ЧТО ДЕЛАТЬ</w:t>
             </w:r>
           </w:p>
         </w:tc>
@@ -4035,23 +3128,21 @@
         <w:tc>
           <w:tcPr>
             <w:tcW w:type="dxa" w:w="2608"/>
+            <w:vAlign w:val="top"/>
             <w:tcBorders>
-              <w:top w:val="single" w:sz="4" w:space="0" w:color="CCCCCC"/>
-              <w:left w:val="single" w:sz="4" w:space="0" w:color="CCCCCC"/>
-              <w:bottom w:val="single" w:sz="4" w:space="0" w:color="CCCCCC"/>
-              <w:right w:val="single" w:sz="4" w:space="0" w:color="CCCCCC"/>
+              <w:bottom w:val="single" w:sz="4" w:space="4" w:color="E0E0E0"/>
             </w:tcBorders>
-            <w:vAlign w:val="top"/>
           </w:tcPr>
           <w:p>
             <w:pPr>
+              <w:keepNext/>
               <w:spacing w:before="40" w:after="40" w:line="264" w:lineRule="auto"/>
             </w:pPr>
             <w:r>
               <w:rPr>
                 <w:rFonts w:ascii="Arial" w:hAnsi="Arial"/>
                 <w:b/>
-                <w:i w:val="0"/>
+                <w:color w:val="1A1A1A"/>
                 <w:sz w:val="18"/>
               </w:rPr>
               <w:t>Клавиша D не запускает оператор</w:t>
@@ -4061,23 +3152,21 @@
         <w:tc>
           <w:tcPr>
             <w:tcW w:type="dxa" w:w="3061"/>
+            <w:vAlign w:val="top"/>
             <w:tcBorders>
-              <w:top w:val="single" w:sz="4" w:space="0" w:color="CCCCCC"/>
-              <w:left w:val="single" w:sz="4" w:space="0" w:color="CCCCCC"/>
-              <w:bottom w:val="single" w:sz="4" w:space="0" w:color="CCCCCC"/>
-              <w:right w:val="single" w:sz="4" w:space="0" w:color="CCCCCC"/>
+              <w:bottom w:val="single" w:sz="4" w:space="4" w:color="E0E0E0"/>
             </w:tcBorders>
-            <w:vAlign w:val="top"/>
           </w:tcPr>
           <w:p>
             <w:pPr>
+              <w:keepNext/>
               <w:spacing w:before="40" w:after="40" w:line="264" w:lineRule="auto"/>
             </w:pPr>
             <w:r>
               <w:rPr>
                 <w:rFonts w:ascii="Arial" w:hAnsi="Arial"/>
                 <w:b w:val="0"/>
-                <w:i w:val="0"/>
+                <w:color w:val="1A1A1A"/>
                 <w:sz w:val="18"/>
               </w:rPr>
               <w:t>бинды раскладки повреждены (старая версия TOCHKA, откат настроек, другой аддон)</w:t>
@@ -4087,23 +3176,21 @@
         <w:tc>
           <w:tcPr>
             <w:tcW w:type="dxa" w:w="3969"/>
+            <w:vAlign w:val="top"/>
             <w:tcBorders>
-              <w:top w:val="single" w:sz="4" w:space="0" w:color="CCCCCC"/>
-              <w:left w:val="single" w:sz="4" w:space="0" w:color="CCCCCC"/>
-              <w:bottom w:val="single" w:sz="4" w:space="0" w:color="CCCCCC"/>
-              <w:right w:val="single" w:sz="4" w:space="0" w:color="CCCCCC"/>
+              <w:bottom w:val="single" w:sz="4" w:space="4" w:color="E0E0E0"/>
             </w:tcBorders>
-            <w:vAlign w:val="top"/>
           </w:tcPr>
           <w:p>
             <w:pPr>
+              <w:keepNext/>
               <w:spacing w:before="40" w:after="40" w:line="264" w:lineRule="auto"/>
             </w:pPr>
             <w:r>
               <w:rPr>
                 <w:rFonts w:ascii="Arial" w:hAnsi="Arial"/>
                 <w:b w:val="0"/>
-                <w:i w:val="0"/>
+                <w:color w:val="1A1A1A"/>
                 <w:sz w:val="18"/>
               </w:rPr>
               <w:t>выключите и включите расширение TOCHKA - сторож восстановит keymap; затем Save Preferences</w:t>
@@ -4118,24 +3205,21 @@
         <w:tc>
           <w:tcPr>
             <w:tcW w:type="dxa" w:w="2608"/>
+            <w:vAlign w:val="top"/>
             <w:tcBorders>
-              <w:top w:val="single" w:sz="4" w:space="0" w:color="CCCCCC"/>
-              <w:left w:val="single" w:sz="4" w:space="0" w:color="CCCCCC"/>
-              <w:bottom w:val="single" w:sz="4" w:space="0" w:color="CCCCCC"/>
-              <w:right w:val="single" w:sz="4" w:space="0" w:color="CCCCCC"/>
+              <w:bottom w:val="single" w:sz="4" w:space="4" w:color="E0E0E0"/>
             </w:tcBorders>
-            <w:vAlign w:val="top"/>
-            <w:shd w:val="clear" w:color="auto" w:fill="F5F8FB"/>
           </w:tcPr>
           <w:p>
             <w:pPr>
+              <w:keepNext/>
               <w:spacing w:before="40" w:after="40" w:line="264" w:lineRule="auto"/>
             </w:pPr>
             <w:r>
               <w:rPr>
                 <w:rFonts w:ascii="Arial" w:hAnsi="Arial"/>
                 <w:b/>
-                <w:i w:val="0"/>
+                <w:color w:val="1A1A1A"/>
                 <w:sz w:val="18"/>
               </w:rPr>
               <w:t>G/R/S перестали работать во вьюпорте</w:t>
@@ -4145,24 +3229,21 @@
         <w:tc>
           <w:tcPr>
             <w:tcW w:type="dxa" w:w="3061"/>
+            <w:vAlign w:val="top"/>
             <w:tcBorders>
-              <w:top w:val="single" w:sz="4" w:space="0" w:color="CCCCCC"/>
-              <w:left w:val="single" w:sz="4" w:space="0" w:color="CCCCCC"/>
-              <w:bottom w:val="single" w:sz="4" w:space="0" w:color="CCCCCC"/>
-              <w:right w:val="single" w:sz="4" w:space="0" w:color="CCCCCC"/>
+              <w:bottom w:val="single" w:sz="4" w:space="4" w:color="E0E0E0"/>
             </w:tcBorders>
-            <w:vAlign w:val="top"/>
-            <w:shd w:val="clear" w:color="auto" w:fill="F5F8FB"/>
           </w:tcPr>
           <w:p>
             <w:pPr>
+              <w:keepNext/>
               <w:spacing w:before="40" w:after="40" w:line="264" w:lineRule="auto"/>
             </w:pPr>
             <w:r>
               <w:rPr>
                 <w:rFonts w:ascii="Arial" w:hAnsi="Arial"/>
                 <w:b w:val="0"/>
-                <w:i w:val="0"/>
+                <w:color w:val="1A1A1A"/>
                 <w:sz w:val="18"/>
               </w:rPr>
               <w:t>повреждены системные keymap Object Mode и Mesh</w:t>
@@ -4172,24 +3253,21 @@
         <w:tc>
           <w:tcPr>
             <w:tcW w:type="dxa" w:w="3969"/>
+            <w:vAlign w:val="top"/>
             <w:tcBorders>
-              <w:top w:val="single" w:sz="4" w:space="0" w:color="CCCCCC"/>
-              <w:left w:val="single" w:sz="4" w:space="0" w:color="CCCCCC"/>
-              <w:bottom w:val="single" w:sz="4" w:space="0" w:color="CCCCCC"/>
-              <w:right w:val="single" w:sz="4" w:space="0" w:color="CCCCCC"/>
+              <w:bottom w:val="single" w:sz="4" w:space="4" w:color="E0E0E0"/>
             </w:tcBorders>
-            <w:vAlign w:val="top"/>
-            <w:shd w:val="clear" w:color="auto" w:fill="F5F8FB"/>
           </w:tcPr>
           <w:p>
             <w:pPr>
+              <w:keepNext/>
               <w:spacing w:before="40" w:after="40" w:line="264" w:lineRule="auto"/>
             </w:pPr>
             <w:r>
               <w:rPr>
                 <w:rFonts w:ascii="Arial" w:hAnsi="Arial"/>
                 <w:b w:val="0"/>
-                <w:i w:val="0"/>
+                <w:color w:val="1A1A1A"/>
                 <w:sz w:val="18"/>
               </w:rPr>
               <w:t>Preferences → Keymap → Restore для Object Mode и Mesh → Save Preferences; TOCHKA 1.0.4+ чинит это сама при включении</w:t>
@@ -4204,23 +3282,21 @@
         <w:tc>
           <w:tcPr>
             <w:tcW w:type="dxa" w:w="2608"/>
+            <w:vAlign w:val="top"/>
             <w:tcBorders>
-              <w:top w:val="single" w:sz="4" w:space="0" w:color="CCCCCC"/>
-              <w:left w:val="single" w:sz="4" w:space="0" w:color="CCCCCC"/>
-              <w:bottom w:val="single" w:sz="4" w:space="0" w:color="CCCCCC"/>
-              <w:right w:val="single" w:sz="4" w:space="0" w:color="CCCCCC"/>
+              <w:bottom w:val="single" w:sz="4" w:space="4" w:color="E0E0E0"/>
             </w:tcBorders>
-            <w:vAlign w:val="top"/>
           </w:tcPr>
           <w:p>
             <w:pPr>
+              <w:keepNext/>
               <w:spacing w:before="40" w:after="40" w:line="264" w:lineRule="auto"/>
             </w:pPr>
             <w:r>
               <w:rPr>
                 <w:rFonts w:ascii="Arial" w:hAnsi="Arial"/>
                 <w:b/>
-                <w:i w:val="0"/>
+                <w:color w:val="1A1A1A"/>
                 <w:sz w:val="18"/>
               </w:rPr>
               <w:t>Снап не цепляет вершину</w:t>
@@ -4230,23 +3306,21 @@
         <w:tc>
           <w:tcPr>
             <w:tcW w:type="dxa" w:w="3061"/>
+            <w:vAlign w:val="top"/>
             <w:tcBorders>
-              <w:top w:val="single" w:sz="4" w:space="0" w:color="CCCCCC"/>
-              <w:left w:val="single" w:sz="4" w:space="0" w:color="CCCCCC"/>
-              <w:bottom w:val="single" w:sz="4" w:space="0" w:color="CCCCCC"/>
-              <w:right w:val="single" w:sz="4" w:space="0" w:color="CCCCCC"/>
+              <w:bottom w:val="single" w:sz="4" w:space="4" w:color="E0E0E0"/>
             </w:tcBorders>
-            <w:vAlign w:val="top"/>
           </w:tcPr>
           <w:p>
             <w:pPr>
+              <w:keepNext/>
               <w:spacing w:before="40" w:after="40" w:line="264" w:lineRule="auto"/>
             </w:pPr>
             <w:r>
               <w:rPr>
                 <w:rFonts w:ascii="Arial" w:hAnsi="Arial"/>
                 <w:b w:val="0"/>
-                <w:i w:val="0"/>
+                <w:color w:val="1A1A1A"/>
                 <w:sz w:val="18"/>
               </w:rPr>
               <w:t>вершина дальше 24 px от курсора на экране</w:t>
@@ -4256,23 +3330,21 @@
         <w:tc>
           <w:tcPr>
             <w:tcW w:type="dxa" w:w="3969"/>
+            <w:vAlign w:val="top"/>
             <w:tcBorders>
-              <w:top w:val="single" w:sz="4" w:space="0" w:color="CCCCCC"/>
-              <w:left w:val="single" w:sz="4" w:space="0" w:color="CCCCCC"/>
-              <w:bottom w:val="single" w:sz="4" w:space="0" w:color="CCCCCC"/>
-              <w:right w:val="single" w:sz="4" w:space="0" w:color="CCCCCC"/>
+              <w:bottom w:val="single" w:sz="4" w:space="4" w:color="E0E0E0"/>
             </w:tcBorders>
-            <w:vAlign w:val="top"/>
           </w:tcPr>
           <w:p>
             <w:pPr>
+              <w:keepNext/>
               <w:spacing w:before="40" w:after="40" w:line="264" w:lineRule="auto"/>
             </w:pPr>
             <w:r>
               <w:rPr>
                 <w:rFonts w:ascii="Arial" w:hAnsi="Arial"/>
                 <w:b w:val="0"/>
-                <w:i w:val="0"/>
+                <w:color w:val="1A1A1A"/>
                 <w:sz w:val="18"/>
               </w:rPr>
               <w:t>приблизьте камеру или ведите курсор точнее - радиус захвата экранный</w:t>
@@ -4287,24 +3359,21 @@
         <w:tc>
           <w:tcPr>
             <w:tcW w:type="dxa" w:w="2608"/>
+            <w:vAlign w:val="top"/>
             <w:tcBorders>
-              <w:top w:val="single" w:sz="4" w:space="0" w:color="CCCCCC"/>
-              <w:left w:val="single" w:sz="4" w:space="0" w:color="CCCCCC"/>
-              <w:bottom w:val="single" w:sz="4" w:space="0" w:color="CCCCCC"/>
-              <w:right w:val="single" w:sz="4" w:space="0" w:color="CCCCCC"/>
+              <w:bottom w:val="single" w:sz="4" w:space="4" w:color="E0E0E0"/>
             </w:tcBorders>
-            <w:vAlign w:val="top"/>
-            <w:shd w:val="clear" w:color="auto" w:fill="F5F8FB"/>
           </w:tcPr>
           <w:p>
             <w:pPr>
+              <w:keepNext/>
               <w:spacing w:before="40" w:after="40" w:line="264" w:lineRule="auto"/>
             </w:pPr>
             <w:r>
               <w:rPr>
                 <w:rFonts w:ascii="Arial" w:hAnsi="Arial"/>
                 <w:b/>
-                <w:i w:val="0"/>
+                <w:color w:val="1A1A1A"/>
                 <w:sz w:val="18"/>
               </w:rPr>
               <w:t>Пивот «улетает» после Ctrl+Z</w:t>
@@ -4314,24 +3383,21 @@
         <w:tc>
           <w:tcPr>
             <w:tcW w:type="dxa" w:w="3061"/>
+            <w:vAlign w:val="top"/>
             <w:tcBorders>
-              <w:top w:val="single" w:sz="4" w:space="0" w:color="CCCCCC"/>
-              <w:left w:val="single" w:sz="4" w:space="0" w:color="CCCCCC"/>
-              <w:bottom w:val="single" w:sz="4" w:space="0" w:color="CCCCCC"/>
-              <w:right w:val="single" w:sz="4" w:space="0" w:color="CCCCCC"/>
+              <w:bottom w:val="single" w:sz="4" w:space="4" w:color="E0E0E0"/>
             </w:tcBorders>
-            <w:vAlign w:val="top"/>
-            <w:shd w:val="clear" w:color="auto" w:fill="F5F8FB"/>
           </w:tcPr>
           <w:p>
             <w:pPr>
+              <w:keepNext/>
               <w:spacing w:before="40" w:after="40" w:line="264" w:lineRule="auto"/>
             </w:pPr>
             <w:r>
               <w:rPr>
                 <w:rFonts w:ascii="Arial" w:hAnsi="Arial"/>
                 <w:b w:val="0"/>
-                <w:i w:val="0"/>
+                <w:color w:val="1A1A1A"/>
                 <w:sz w:val="18"/>
               </w:rPr>
               <w:t>баг версий до 1.0.3 включительно</w:t>
@@ -4341,24 +3407,21 @@
         <w:tc>
           <w:tcPr>
             <w:tcW w:type="dxa" w:w="3969"/>
+            <w:vAlign w:val="top"/>
             <w:tcBorders>
-              <w:top w:val="single" w:sz="4" w:space="0" w:color="CCCCCC"/>
-              <w:left w:val="single" w:sz="4" w:space="0" w:color="CCCCCC"/>
-              <w:bottom w:val="single" w:sz="4" w:space="0" w:color="CCCCCC"/>
-              <w:right w:val="single" w:sz="4" w:space="0" w:color="CCCCCC"/>
+              <w:bottom w:val="single" w:sz="4" w:space="4" w:color="E0E0E0"/>
             </w:tcBorders>
-            <w:vAlign w:val="top"/>
-            <w:shd w:val="clear" w:color="auto" w:fill="F5F8FB"/>
           </w:tcPr>
           <w:p>
             <w:pPr>
+              <w:keepNext/>
               <w:spacing w:before="40" w:after="40" w:line="264" w:lineRule="auto"/>
             </w:pPr>
             <w:r>
               <w:rPr>
                 <w:rFonts w:ascii="Arial" w:hAnsi="Arial"/>
                 <w:b w:val="0"/>
-                <w:i w:val="0"/>
+                <w:color w:val="1A1A1A"/>
                 <w:sz w:val="18"/>
               </w:rPr>
               <w:t>обновите TOCHKA до 1.0.4 или новее</w:t>
@@ -4373,13 +3436,10 @@
         <w:tc>
           <w:tcPr>
             <w:tcW w:type="dxa" w:w="2608"/>
+            <w:vAlign w:val="top"/>
             <w:tcBorders>
-              <w:top w:val="single" w:sz="4" w:space="0" w:color="CCCCCC"/>
-              <w:left w:val="single" w:sz="4" w:space="0" w:color="CCCCCC"/>
-              <w:bottom w:val="single" w:sz="4" w:space="0" w:color="CCCCCC"/>
-              <w:right w:val="single" w:sz="4" w:space="0" w:color="CCCCCC"/>
+              <w:bottom w:val="single" w:sz="8" w:space="4" w:color="000000"/>
             </w:tcBorders>
-            <w:vAlign w:val="top"/>
           </w:tcPr>
           <w:p>
             <w:pPr>
@@ -4389,7 +3449,7 @@
               <w:rPr>
                 <w:rFonts w:ascii="Arial" w:hAnsi="Arial"/>
                 <w:b/>
-                <w:i w:val="0"/>
+                <w:color w:val="1A1A1A"/>
                 <w:sz w:val="18"/>
               </w:rPr>
               <w:t>Оператор закрылся сразу после запуска кнопкой</w:t>
@@ -4399,13 +3459,10 @@
         <w:tc>
           <w:tcPr>
             <w:tcW w:type="dxa" w:w="3061"/>
+            <w:vAlign w:val="top"/>
             <w:tcBorders>
-              <w:top w:val="single" w:sz="4" w:space="0" w:color="CCCCCC"/>
-              <w:left w:val="single" w:sz="4" w:space="0" w:color="CCCCCC"/>
-              <w:bottom w:val="single" w:sz="4" w:space="0" w:color="CCCCCC"/>
-              <w:right w:val="single" w:sz="4" w:space="0" w:color="CCCCCC"/>
+              <w:bottom w:val="single" w:sz="8" w:space="4" w:color="000000"/>
             </w:tcBorders>
-            <w:vAlign w:val="top"/>
           </w:tcPr>
           <w:p>
             <w:pPr>
@@ -4415,7 +3472,7 @@
               <w:rPr>
                 <w:rFonts w:ascii="Arial" w:hAnsi="Arial"/>
                 <w:b w:val="0"/>
-                <w:i w:val="0"/>
+                <w:color w:val="1A1A1A"/>
                 <w:sz w:val="18"/>
               </w:rPr>
               <w:t>случился мгновенный коммит от клика по кнопке</w:t>
@@ -4425,13 +3482,10 @@
         <w:tc>
           <w:tcPr>
             <w:tcW w:type="dxa" w:w="3969"/>
+            <w:vAlign w:val="top"/>
             <w:tcBorders>
-              <w:top w:val="single" w:sz="4" w:space="0" w:color="CCCCCC"/>
-              <w:left w:val="single" w:sz="4" w:space="0" w:color="CCCCCC"/>
-              <w:bottom w:val="single" w:sz="4" w:space="0" w:color="CCCCCC"/>
-              <w:right w:val="single" w:sz="4" w:space="0" w:color="CCCCCC"/>
+              <w:bottom w:val="single" w:sz="8" w:space="4" w:color="000000"/>
             </w:tcBorders>
-            <w:vAlign w:val="top"/>
           </w:tcPr>
           <w:p>
             <w:pPr>
@@ -4441,7 +3495,7 @@
               <w:rPr>
                 <w:rFonts w:ascii="Arial" w:hAnsi="Arial"/>
                 <w:b w:val="0"/>
-                <w:i w:val="0"/>
+                <w:color w:val="1A1A1A"/>
                 <w:sz w:val="18"/>
               </w:rPr>
               <w:t>защита армирования уже вшита: начните движение мыши и подтверждайте ЛКМ</w:t>
@@ -4450,15 +3504,10 @@
         </w:tc>
       </w:tr>
     </w:tbl>
-    <w:p>
-      <w:pPr>
-        <w:spacing w:after="80" w:before="0" w:line="240" w:lineRule="auto"/>
-      </w:pPr>
-    </w:p>
     <w:sectPr>
-      <w:footerReference w:type="default" r:id="rId9"/>
-      <w:pgSz w:w="12240" w:h="15840"/>
-      <w:pgMar w:top="1296" w:right="1440" w:bottom="1296" w:left="1440" w:header="720" w:footer="720" w:gutter="0"/>
+      <w:footerReference w:type="default" r:id="rId10"/>
+      <w:pgSz w:w="11906" w:h="16838"/>
+      <w:pgMar w:top="1134" w:right="1247" w:bottom="1134" w:left="1247" w:header="0" w:footer="0" w:gutter="0"/>
       <w:cols w:space="720"/>
       <w:docGrid w:linePitch="360"/>
     </w:sectPr>
@@ -4471,15 +3520,51 @@
   <w:p>
     <w:pPr>
       <w:pStyle w:val="Footer"/>
+    </w:pPr>
+  </w:p>
+</w:ftr>
+</file>
+
+<file path=word/footer2.xml><?xml version="1.0" encoding="utf-8"?>
+<w:ftr xmlns:m="http://schemas.openxmlformats.org/officeDocument/2006/math" xmlns:mc="http://schemas.openxmlformats.org/markup-compatibility/2006" xmlns:mo="http://schemas.microsoft.com/office/mac/office/2008/main" xmlns:mv="urn:schemas-microsoft-com:mac:vml" xmlns:o="urn:schemas-microsoft-com:office:office" xmlns:r="http://schemas.openxmlformats.org/officeDocument/2006/relationships" xmlns:v="urn:schemas-microsoft-com:vml" xmlns:w10="urn:schemas-microsoft-com:office:word" xmlns:w14="http://schemas.microsoft.com/office/word/2010/wordml" xmlns:w="http://schemas.openxmlformats.org/wordprocessingml/2006/main" xmlns:wne="http://schemas.microsoft.com/office/word/2006/wordml" xmlns:wp14="http://schemas.microsoft.com/office/word/2010/wordprocessingDrawing" xmlns:wp="http://schemas.openxmlformats.org/drawingml/2006/wordprocessingDrawing" xmlns:wpc="http://schemas.microsoft.com/office/word/2010/wordprocessingCanvas" xmlns:wpg="http://schemas.microsoft.com/office/word/2010/wordprocessingGroup" xmlns:wpi="http://schemas.microsoft.com/office/word/2010/wordprocessingInk" xmlns:wps="http://schemas.microsoft.com/office/word/2010/wordprocessingShape" mc:Ignorable="w14 wp14">
+  <w:p>
+    <w:pPr>
+      <w:pStyle w:val="Footer"/>
       <w:jc w:val="center"/>
     </w:pPr>
     <w:r>
       <w:rPr>
-        <w:rFonts w:ascii="Arial" w:hAnsi="Arial"/>
-        <w:color w:val="555555"/>
-        <w:sz w:val="18"/>
+        <w:rFonts w:ascii="Century Gothic" w:hAnsi="Century Gothic" w:cs="Century Gothic"/>
+        <w:b w:val="0"/>
+        <w:color w:val="6E6E6E"/>
+        <w:sz w:val="15"/>
+        <w:spacing w:val="40"/>
+      </w:rPr>
+      <w:t>TOCHKA</w:t>
+    </w:r>
+    <w:r>
+      <w:rPr>
+        <w:rFonts w:ascii="Century Gothic" w:hAnsi="Century Gothic"/>
+        <w:b/>
+        <w:color w:val="C82823"/>
+        <w:sz w:val="15"/>
+      </w:rPr>
+      <w:t>.</w:t>
+    </w:r>
+    <w:r>
+      <w:rPr>
+        <w:sz w:val="15"/>
+      </w:rPr>
+      <w:t xml:space="preserve">      </w:t>
+    </w:r>
+    <w:r>
+      <w:rPr>
+        <w:rFonts w:ascii="Century Gothic" w:hAnsi="Century Gothic"/>
+        <w:color w:val="6E6E6E"/>
+        <w:sz w:val="15"/>
       </w:rPr>
       <w:fldChar w:fldCharType="begin"/>
+      <w:instrText xml:space="preserve">PAGE \* arabic \* MERGEFORMAT</w:instrText>
       <w:fldChar w:fldCharType="end"/>
     </w:r>
   </w:p>
@@ -4850,10 +3935,11 @@
     <w:qFormat/>
     <w:rsid w:val="00FC693F"/>
     <w:pPr>
-      <w:spacing w:line="312" w:lineRule="auto" w:after="80" w:before="0"/>
+      <w:spacing w:line="312" w:lineRule="auto" w:after="80"/>
     </w:pPr>
     <w:rPr>
-      <w:rFonts w:ascii="Arial" w:hAnsi="Arial" w:cs="Arial"/>
+      <w:rFonts w:ascii="Arial" w:hAnsi="Arial"/>
+      <w:color w:val="1A1A1A"/>
       <w:sz w:val="20"/>
     </w:rPr>
   </w:style>
@@ -4912,14 +3998,14 @@
     <w:pPr>
       <w:keepNext/>
       <w:keepLines/>
-      <w:spacing w:before="280" w:after="100" w:line="276" w:lineRule="auto"/>
+      <w:spacing w:before="320" w:after="120"/>
       <w:outlineLvl w:val="0"/>
     </w:pPr>
     <w:rPr>
-      <w:rFonts w:asciiTheme="majorHAnsi" w:eastAsiaTheme="majorEastAsia" w:hAnsiTheme="majorHAnsi" w:cstheme="majorBidi" w:ascii="Arial" w:hAnsi="Arial"/>
+      <w:rFonts w:asciiTheme="majorHAnsi" w:eastAsiaTheme="majorEastAsia" w:hAnsiTheme="majorHAnsi" w:cstheme="majorBidi" w:ascii="Century Gothic" w:hAnsi="Century Gothic"/>
       <w:b/>
       <w:bCs/>
-      <w:color w:val="1F497D"/>
+      <w:color w:val="000000"/>
       <w:sz w:val="30"/>
       <w:szCs w:val="28"/>
     </w:rPr>
@@ -4936,15 +4022,15 @@
     <w:pPr>
       <w:keepNext/>
       <w:keepLines/>
-      <w:spacing w:before="200" w:after="100" w:line="276" w:lineRule="auto"/>
+      <w:spacing w:before="200" w:after="120"/>
       <w:outlineLvl w:val="1"/>
     </w:pPr>
     <w:rPr>
-      <w:rFonts w:asciiTheme="majorHAnsi" w:eastAsiaTheme="majorEastAsia" w:hAnsiTheme="majorHAnsi" w:cstheme="majorBidi" w:ascii="Arial" w:hAnsi="Arial"/>
+      <w:rFonts w:asciiTheme="majorHAnsi" w:eastAsiaTheme="majorEastAsia" w:hAnsiTheme="majorHAnsi" w:cstheme="majorBidi" w:ascii="Century Gothic" w:hAnsi="Century Gothic"/>
       <w:b/>
       <w:bCs/>
-      <w:color w:val="2E74B5"/>
-      <w:sz w:val="25"/>
+      <w:color w:val="000000"/>
+      <w:sz w:val="23"/>
       <w:szCs w:val="26"/>
     </w:rPr>
   </w:style>
@@ -4960,15 +4046,14 @@
     <w:pPr>
       <w:keepNext/>
       <w:keepLines/>
-      <w:spacing w:before="200" w:after="100" w:line="276" w:lineRule="auto"/>
+      <w:spacing w:before="200" w:after="0"/>
       <w:outlineLvl w:val="2"/>
     </w:pPr>
     <w:rPr>
-      <w:rFonts w:asciiTheme="majorHAnsi" w:eastAsiaTheme="majorEastAsia" w:hAnsiTheme="majorHAnsi" w:cstheme="majorBidi" w:ascii="Arial" w:hAnsi="Arial"/>
+      <w:rFonts w:asciiTheme="majorHAnsi" w:eastAsiaTheme="majorEastAsia" w:hAnsiTheme="majorHAnsi" w:cstheme="majorBidi"/>
       <w:b/>
       <w:bCs/>
-      <w:color w:val="2E74B5"/>
-      <w:sz w:val="22"/>
+      <w:color w:val="4F81BD" w:themeColor="accent1"/>
     </w:rPr>
   </w:style>
   <w:style w:type="paragraph" w:styleId="Heading4">

</xml_diff>